<commit_message>
refactoring <Lab5> : Выполнены TODO
</commit_message>
<xml_diff>
--- a/ЛБ5 Подопригора Л.И..docx
+++ b/ЛБ5 Подопригора Л.И..docx
@@ -1,6 +1,6 @@
 
 <file path=word/document.xml><?xml version="1.0" encoding="utf-8"?>
-<w:document xmlns:wpc="http://schemas.microsoft.com/office/word/2010/wordprocessingCanvas" xmlns:cx="http://schemas.microsoft.com/office/drawing/2014/chartex" xmlns:cx1="http://schemas.microsoft.com/office/drawing/2015/9/8/chartex" xmlns:cx2="http://schemas.microsoft.com/office/drawing/2015/10/21/chartex" xmlns:cx3="http://schemas.microsoft.com/office/drawing/2016/5/9/chartex" xmlns:cx4="http://schemas.microsoft.com/office/drawing/2016/5/10/chartex" xmlns:cx5="http://schemas.microsoft.com/office/drawing/2016/5/11/chartex" xmlns:cx6="http://schemas.microsoft.com/office/drawing/2016/5/12/chartex" xmlns:cx7="http://schemas.microsoft.com/office/drawing/2016/5/13/chartex" xmlns:cx8="http://schemas.microsoft.com/office/drawing/2016/5/14/chartex" xmlns:mc="http://schemas.openxmlformats.org/markup-compatibility/2006" xmlns:aink="http://schemas.microsoft.com/office/drawing/2016/ink" xmlns:am3d="http://schemas.microsoft.com/office/drawing/2017/model3d" xmlns:o="urn:schemas-microsoft-com:office:office" xmlns:r="http://schemas.openxmlformats.org/officeDocument/2006/relationships" xmlns:m="http://schemas.openxmlformats.org/officeDocument/2006/math" xmlns:v="urn:schemas-microsoft-com:vml" xmlns:wp14="http://schemas.microsoft.com/office/word/2010/wordprocessingDrawing" xmlns:wp="http://schemas.openxmlformats.org/drawingml/2006/wordprocessingDrawing" xmlns:w10="urn:schemas-microsoft-com:office:word" xmlns:w="http://schemas.openxmlformats.org/wordprocessingml/2006/main" xmlns:w14="http://schemas.microsoft.com/office/word/2010/wordml" xmlns:w15="http://schemas.microsoft.com/office/word/2012/wordml" xmlns:w16cex="http://schemas.microsoft.com/office/word/2018/wordml/cex" xmlns:w16cid="http://schemas.microsoft.com/office/word/2016/wordml/cid" xmlns:w16="http://schemas.microsoft.com/office/word/2018/wordml" xmlns:w16sdtdh="http://schemas.microsoft.com/office/word/2020/wordml/sdtdatahash" xmlns:w16se="http://schemas.microsoft.com/office/word/2015/wordml/symex" xmlns:wpg="http://schemas.microsoft.com/office/word/2010/wordprocessingGroup" xmlns:wpi="http://schemas.microsoft.com/office/word/2010/wordprocessingInk" xmlns:wne="http://schemas.microsoft.com/office/word/2006/wordml" xmlns:wps="http://schemas.microsoft.com/office/word/2010/wordprocessingShape" mc:Ignorable="w14 w15 w16se w16cid w16 w16cex w16sdtdh wp14">
+<w:document xmlns:wpc="http://schemas.microsoft.com/office/word/2010/wordprocessingCanvas" xmlns:cx="http://schemas.microsoft.com/office/drawing/2014/chartex" xmlns:cx1="http://schemas.microsoft.com/office/drawing/2015/9/8/chartex" xmlns:mc="http://schemas.openxmlformats.org/markup-compatibility/2006" xmlns:o="urn:schemas-microsoft-com:office:office" xmlns:r="http://schemas.openxmlformats.org/officeDocument/2006/relationships" xmlns:m="http://schemas.openxmlformats.org/officeDocument/2006/math" xmlns:v="urn:schemas-microsoft-com:vml" xmlns:wp14="http://schemas.microsoft.com/office/word/2010/wordprocessingDrawing" xmlns:wp="http://schemas.openxmlformats.org/drawingml/2006/wordprocessingDrawing" xmlns:w10="urn:schemas-microsoft-com:office:word" xmlns:w="http://schemas.openxmlformats.org/wordprocessingml/2006/main" xmlns:w14="http://schemas.microsoft.com/office/word/2010/wordml" xmlns:w15="http://schemas.microsoft.com/office/word/2012/wordml" xmlns:w16se="http://schemas.microsoft.com/office/word/2015/wordml/symex" xmlns:wpg="http://schemas.microsoft.com/office/word/2010/wordprocessingGroup" xmlns:wpi="http://schemas.microsoft.com/office/word/2010/wordprocessingInk" xmlns:wne="http://schemas.microsoft.com/office/word/2006/wordml" xmlns:wps="http://schemas.microsoft.com/office/word/2010/wordprocessingShape" mc:Ignorable="w14 w15 w16se wp14">
   <w:body>
     <w:p>
       <w:pPr>
@@ -2107,7 +2107,23 @@
           <w:i w:val="0"/>
           <w:iCs/>
         </w:rPr>
-        <w:t xml:space="preserve"> Git;</w:t>
+        <w:t xml:space="preserve"> </w:t>
+      </w:r>
+      <w:proofErr w:type="spellStart"/>
+      <w:r>
+        <w:rPr>
+          <w:i w:val="0"/>
+          <w:iCs/>
+        </w:rPr>
+        <w:t>Git</w:t>
+      </w:r>
+      <w:proofErr w:type="spellEnd"/>
+      <w:r>
+        <w:rPr>
+          <w:i w:val="0"/>
+          <w:iCs/>
+        </w:rPr>
+        <w:t>;</w:t>
       </w:r>
     </w:p>
     <w:p>
@@ -2480,10 +2496,10 @@
         </w:rPr>
         <w:lastRenderedPageBreak/>
         <w:drawing>
-          <wp:inline distT="0" distB="0" distL="0" distR="0" wp14:anchorId="1D119B85" wp14:editId="4787F67D">
+          <wp:inline distT="0" distB="0" distL="0" distR="0" wp14:anchorId="69CB0A21" wp14:editId="15B0903F">
             <wp:extent cx="9251950" cy="4866005"/>
             <wp:effectExtent l="0" t="0" r="6350" b="0"/>
-            <wp:docPr id="4" name="Рисунок 4"/>
+            <wp:docPr id="2" name="Рисунок 2"/>
             <wp:cNvGraphicFramePr>
               <a:graphicFrameLocks xmlns:a="http://schemas.openxmlformats.org/drawingml/2006/main" noChangeAspect="1"/>
             </wp:cNvGraphicFramePr>
@@ -10057,6 +10073,7 @@
       <w:r>
         <w:rPr>
           <w:noProof/>
+          <w:lang w:eastAsia="ru-RU"/>
         </w:rPr>
         <w:drawing>
           <wp:inline distT="0" distB="0" distL="0" distR="0" wp14:anchorId="4607E397" wp14:editId="37B2EAF4">
@@ -10897,6 +10914,7 @@
           <w:iCs/>
           <w:noProof/>
           <w:szCs w:val="28"/>
+          <w:lang w:eastAsia="ru-RU"/>
         </w:rPr>
         <w:drawing>
           <wp:inline distT="0" distB="0" distL="0" distR="0" wp14:anchorId="6F985DC2" wp14:editId="4351D682">
@@ -11032,6 +11050,7 @@
       <w:r>
         <w:rPr>
           <w:noProof/>
+          <w:lang w:eastAsia="ru-RU"/>
         </w:rPr>
         <w:drawing>
           <wp:inline distT="0" distB="0" distL="0" distR="0" wp14:anchorId="4BCBABCA" wp14:editId="5F8A3DB2">
@@ -11503,6 +11522,7 @@
           <w:iCs/>
           <w:noProof/>
           <w:szCs w:val="28"/>
+          <w:lang w:eastAsia="ru-RU"/>
         </w:rPr>
         <w:drawing>
           <wp:inline distT="0" distB="0" distL="0" distR="0" wp14:anchorId="0CD974D3" wp14:editId="0D638D0F">
@@ -15169,14 +15189,57 @@
         <w:rPr>
           <w:szCs w:val="28"/>
         </w:rPr>
-        <w:t xml:space="preserve">Каждый объект должен содержать </w:t>
+        <w:t>Каждый объект должен с</w:t>
+      </w:r>
+      <w:r>
+        <w:rPr>
+          <w:szCs w:val="28"/>
+        </w:rPr>
+        <w:t xml:space="preserve">одержать </w:t>
       </w:r>
       <w:commentRangeStart w:id="15"/>
-      <w:r>
-        <w:rPr>
-          <w:szCs w:val="28"/>
-        </w:rPr>
-        <w:t>все обязательные поля (</w:t>
+      <w:commentRangeStart w:id="16"/>
+      <w:r>
+        <w:rPr>
+          <w:szCs w:val="28"/>
+        </w:rPr>
+        <w:t>обязательные поля</w:t>
+      </w:r>
+      <w:r>
+        <w:rPr>
+          <w:szCs w:val="28"/>
+        </w:rPr>
+        <w:t xml:space="preserve"> в зависимости от типа движения. Для</w:t>
+      </w:r>
+      <w:r>
+        <w:rPr>
+          <w:szCs w:val="28"/>
+        </w:rPr>
+        <w:t xml:space="preserve"> </w:t>
+      </w:r>
+      <w:r>
+        <w:rPr>
+          <w:szCs w:val="28"/>
+        </w:rPr>
+        <w:t>равномерного</w:t>
+      </w:r>
+      <w:r>
+        <w:rPr>
+          <w:szCs w:val="28"/>
+        </w:rPr>
+        <w:t xml:space="preserve"> </w:t>
+      </w:r>
+      <w:r>
+        <w:rPr>
+          <w:szCs w:val="28"/>
+        </w:rPr>
+        <w:t>движения</w:t>
+      </w:r>
+      <w:r>
+        <w:rPr>
+          <w:szCs w:val="28"/>
+        </w:rPr>
+        <w:t xml:space="preserve">: </w:t>
       </w:r>
       <w:proofErr w:type="spellStart"/>
       <w:r>
@@ -15223,6 +15286,51 @@
           <w:iCs/>
           <w:szCs w:val="28"/>
         </w:rPr>
+        <w:t xml:space="preserve">;  </w:t>
+      </w:r>
+      <w:r>
+        <w:rPr>
+          <w:iCs/>
+          <w:szCs w:val="28"/>
+        </w:rPr>
+        <w:t>для</w:t>
+      </w:r>
+      <w:r>
+        <w:rPr>
+          <w:iCs/>
+          <w:szCs w:val="28"/>
+        </w:rPr>
+        <w:t xml:space="preserve"> </w:t>
+      </w:r>
+      <w:r>
+        <w:rPr>
+          <w:iCs/>
+          <w:szCs w:val="28"/>
+        </w:rPr>
+        <w:t>равноускоренного</w:t>
+      </w:r>
+      <w:r>
+        <w:rPr>
+          <w:iCs/>
+          <w:szCs w:val="28"/>
+        </w:rPr>
+        <w:t xml:space="preserve">: </w:t>
+      </w:r>
+      <w:proofErr w:type="spellStart"/>
+      <w:r>
+        <w:rPr>
+          <w:iCs/>
+          <w:szCs w:val="28"/>
+          <w:lang w:val="en-GB"/>
+        </w:rPr>
+        <w:t>InitinalPosition</w:t>
+      </w:r>
+      <w:proofErr w:type="spellEnd"/>
+      <w:r>
+        <w:rPr>
+          <w:iCs/>
+          <w:szCs w:val="28"/>
+        </w:rPr>
         <w:t xml:space="preserve">, </w:t>
       </w:r>
       <w:r>
@@ -15231,6 +15339,36 @@
           <w:szCs w:val="28"/>
           <w:lang w:val="en-GB"/>
         </w:rPr>
+        <w:t>Speed</w:t>
+      </w:r>
+      <w:r>
+        <w:rPr>
+          <w:iCs/>
+          <w:szCs w:val="28"/>
+        </w:rPr>
+        <w:t xml:space="preserve">, </w:t>
+      </w:r>
+      <w:r>
+        <w:rPr>
+          <w:iCs/>
+          <w:szCs w:val="28"/>
+          <w:lang w:val="en-GB"/>
+        </w:rPr>
+        <w:t>Time</w:t>
+      </w:r>
+      <w:r>
+        <w:rPr>
+          <w:iCs/>
+          <w:szCs w:val="28"/>
+        </w:rPr>
+        <w:t xml:space="preserve">, </w:t>
+      </w:r>
+      <w:r>
+        <w:rPr>
+          <w:iCs/>
+          <w:szCs w:val="28"/>
+          <w:lang w:val="en-GB"/>
+        </w:rPr>
         <w:t>Acceleration</w:t>
       </w:r>
       <w:r>
@@ -15238,23 +15376,84 @@
           <w:iCs/>
           <w:szCs w:val="28"/>
         </w:rPr>
+        <w:t xml:space="preserve">; </w:t>
+      </w:r>
+      <w:r>
+        <w:rPr>
+          <w:iCs/>
+          <w:szCs w:val="28"/>
+        </w:rPr>
+        <w:t>для</w:t>
+      </w:r>
+      <w:r>
+        <w:rPr>
+          <w:iCs/>
+          <w:szCs w:val="28"/>
+        </w:rPr>
+        <w:t xml:space="preserve"> </w:t>
+      </w:r>
+      <w:r>
+        <w:rPr>
+          <w:iCs/>
+          <w:szCs w:val="28"/>
+        </w:rPr>
+        <w:t xml:space="preserve">колебательного: </w:t>
+      </w:r>
+      <w:proofErr w:type="spellStart"/>
+      <w:r>
+        <w:rPr>
+          <w:iCs/>
+          <w:szCs w:val="28"/>
+          <w:lang w:val="en-GB"/>
+        </w:rPr>
+        <w:t>InitinalPosition</w:t>
+      </w:r>
+      <w:proofErr w:type="spellEnd"/>
+      <w:r>
+        <w:rPr>
+          <w:iCs/>
+          <w:szCs w:val="28"/>
+        </w:rPr>
         <w:t xml:space="preserve">, </w:t>
       </w:r>
-      <w:proofErr w:type="spellStart"/>
-      <w:r>
-        <w:rPr>
-          <w:iCs/>
-          <w:szCs w:val="28"/>
+      <w:r>
+        <w:rPr>
+          <w:iCs/>
+          <w:szCs w:val="28"/>
+          <w:lang w:val="en-GB"/>
+        </w:rPr>
+        <w:t>Speed</w:t>
+      </w:r>
+      <w:r>
+        <w:rPr>
+          <w:iCs/>
+          <w:szCs w:val="28"/>
+        </w:rPr>
+        <w:t xml:space="preserve">, </w:t>
+      </w:r>
+      <w:r>
+        <w:rPr>
+          <w:iCs/>
+          <w:szCs w:val="28"/>
+          <w:lang w:val="en-GB"/>
+        </w:rPr>
+        <w:t>Time</w:t>
+      </w:r>
+      <w:r>
+        <w:rPr>
+          <w:iCs/>
+          <w:szCs w:val="28"/>
+        </w:rPr>
+        <w:t xml:space="preserve"> , </w:t>
+      </w:r>
+      <w:r>
+        <w:rPr>
+          <w:iCs/>
+          <w:szCs w:val="28"/>
+          <w:lang w:val="en-US"/>
         </w:rPr>
         <w:t>Frequency</w:t>
       </w:r>
-      <w:proofErr w:type="spellEnd"/>
-      <w:r>
-        <w:rPr>
-          <w:szCs w:val="28"/>
-        </w:rPr>
-        <w:t>)</w:t>
-      </w:r>
       <w:r>
         <w:rPr>
           <w:szCs w:val="28"/>
@@ -15267,6 +15466,13 @@
           <w:rStyle w:val="af"/>
         </w:rPr>
         <w:commentReference w:id="15"/>
+      </w:r>
+      <w:commentRangeEnd w:id="16"/>
+      <w:r>
+        <w:rPr>
+          <w:rStyle w:val="af"/>
+        </w:rPr>
+        <w:commentReference w:id="16"/>
       </w:r>
     </w:p>
     <w:p>
@@ -15515,6 +15721,7 @@
           <w:szCs w:val="28"/>
           <w:lang w:val="en-US"/>
         </w:rPr>
+        <w:lastRenderedPageBreak/>
         <w:t>D</w:t>
       </w:r>
       <w:r>
@@ -15620,7 +15827,6 @@
           <w:szCs w:val="28"/>
           <w:lang w:val="en-US"/>
         </w:rPr>
-        <w:lastRenderedPageBreak/>
         <w:t>D</w:t>
       </w:r>
       <w:r>
@@ -16520,6 +16726,7 @@
     </w:p>
     <w:p>
       <w:r>
+        <w:lastRenderedPageBreak/>
         <w:t xml:space="preserve">где </w:t>
       </w:r>
       <m:oMath>
@@ -16644,7 +16851,6 @@
             <w:rFonts w:ascii="Cambria Math" w:hAnsi="Cambria Math"/>
             <w:lang w:val="en-US"/>
           </w:rPr>
-          <w:lastRenderedPageBreak/>
           <m:t>t</m:t>
         </m:r>
         <m:r>
@@ -17272,18 +17478,9 @@
           <w:szCs w:val="28"/>
         </w:rPr>
       </w:pPr>
-    </w:p>
-    <w:p>
-      <w:pPr>
-        <w:jc w:val="center"/>
-      </w:pPr>
-    </w:p>
-    <w:p>
-      <w:pPr>
-        <w:jc w:val="center"/>
-      </w:pPr>
-    </w:p>
-    <w:p/>
+      <w:bookmarkStart w:id="17" w:name="_GoBack"/>
+      <w:bookmarkEnd w:id="17"/>
+    </w:p>
     <w:sectPr>
       <w:pgSz w:w="11906" w:h="16838"/>
       <w:pgMar w:top="1134" w:right="850" w:bottom="1134" w:left="1701" w:header="708" w:footer="708" w:gutter="0"/>
@@ -17296,7 +17493,7 @@
 </file>
 
 <file path=word/comments.xml><?xml version="1.0" encoding="utf-8"?>
-<w:comments xmlns:wpc="http://schemas.microsoft.com/office/word/2010/wordprocessingCanvas" xmlns:cx="http://schemas.microsoft.com/office/drawing/2014/chartex" xmlns:cx1="http://schemas.microsoft.com/office/drawing/2015/9/8/chartex" xmlns:cx2="http://schemas.microsoft.com/office/drawing/2015/10/21/chartex" xmlns:cx3="http://schemas.microsoft.com/office/drawing/2016/5/9/chartex" xmlns:cx4="http://schemas.microsoft.com/office/drawing/2016/5/10/chartex" xmlns:cx5="http://schemas.microsoft.com/office/drawing/2016/5/11/chartex" xmlns:cx6="http://schemas.microsoft.com/office/drawing/2016/5/12/chartex" xmlns:cx7="http://schemas.microsoft.com/office/drawing/2016/5/13/chartex" xmlns:cx8="http://schemas.microsoft.com/office/drawing/2016/5/14/chartex" xmlns:mc="http://schemas.openxmlformats.org/markup-compatibility/2006" xmlns:aink="http://schemas.microsoft.com/office/drawing/2016/ink" xmlns:am3d="http://schemas.microsoft.com/office/drawing/2017/model3d" xmlns:o="urn:schemas-microsoft-com:office:office" xmlns:r="http://schemas.openxmlformats.org/officeDocument/2006/relationships" xmlns:m="http://schemas.openxmlformats.org/officeDocument/2006/math" xmlns:v="urn:schemas-microsoft-com:vml" xmlns:wp14="http://schemas.microsoft.com/office/word/2010/wordprocessingDrawing" xmlns:wp="http://schemas.openxmlformats.org/drawingml/2006/wordprocessingDrawing" xmlns:w10="urn:schemas-microsoft-com:office:word" xmlns:w="http://schemas.openxmlformats.org/wordprocessingml/2006/main" xmlns:w14="http://schemas.microsoft.com/office/word/2010/wordml" xmlns:w15="http://schemas.microsoft.com/office/word/2012/wordml" xmlns:w16cex="http://schemas.microsoft.com/office/word/2018/wordml/cex" xmlns:w16cid="http://schemas.microsoft.com/office/word/2016/wordml/cid" xmlns:w16="http://schemas.microsoft.com/office/word/2018/wordml" xmlns:w16sdtdh="http://schemas.microsoft.com/office/word/2020/wordml/sdtdatahash" xmlns:w16se="http://schemas.microsoft.com/office/word/2015/wordml/symex" xmlns:wpg="http://schemas.microsoft.com/office/word/2010/wordprocessingGroup" xmlns:wpi="http://schemas.microsoft.com/office/word/2010/wordprocessingInk" xmlns:wne="http://schemas.microsoft.com/office/word/2006/wordml" xmlns:wps="http://schemas.microsoft.com/office/word/2010/wordprocessingShape" mc:Ignorable="w14 w15 w16se w16cid w16 w16cex w16sdtdh wp14">
+<w:comments xmlns:wpc="http://schemas.microsoft.com/office/word/2010/wordprocessingCanvas" xmlns:cx="http://schemas.microsoft.com/office/drawing/2014/chartex" xmlns:cx1="http://schemas.microsoft.com/office/drawing/2015/9/8/chartex" xmlns:mc="http://schemas.openxmlformats.org/markup-compatibility/2006" xmlns:o="urn:schemas-microsoft-com:office:office" xmlns:r="http://schemas.openxmlformats.org/officeDocument/2006/relationships" xmlns:m="http://schemas.openxmlformats.org/officeDocument/2006/math" xmlns:v="urn:schemas-microsoft-com:vml" xmlns:wp14="http://schemas.microsoft.com/office/word/2010/wordprocessingDrawing" xmlns:wp="http://schemas.openxmlformats.org/drawingml/2006/wordprocessingDrawing" xmlns:w10="urn:schemas-microsoft-com:office:word" xmlns:w="http://schemas.openxmlformats.org/wordprocessingml/2006/main" xmlns:w14="http://schemas.microsoft.com/office/word/2010/wordml" xmlns:w15="http://schemas.microsoft.com/office/word/2012/wordml" xmlns:w16se="http://schemas.microsoft.com/office/word/2015/wordml/symex" xmlns:wpg="http://schemas.microsoft.com/office/word/2010/wordprocessingGroup" xmlns:wpi="http://schemas.microsoft.com/office/word/2010/wordprocessingInk" xmlns:wne="http://schemas.microsoft.com/office/word/2006/wordml" xmlns:wps="http://schemas.microsoft.com/office/word/2010/wordprocessingShape" mc:Ignorable="w14 w15 w16se wp14">
   <w:comment w:id="15" w:author="Aleksey A. Kalentev" w:date="2026-04-30T11:21:00Z" w:initials="AAK">
     <w:p>
       <w:pPr>
@@ -17307,6 +17504,22 @@
           <w:rStyle w:val="af"/>
         </w:rPr>
         <w:annotationRef/>
+      </w:r>
+    </w:p>
+  </w:comment>
+  <w:comment w:id="16" w:author="podop" w:date="2026-04-30T11:29:00Z" w:initials="p">
+    <w:p>
+      <w:pPr>
+        <w:pStyle w:val="af0"/>
+      </w:pPr>
+      <w:r>
+        <w:rPr>
+          <w:rStyle w:val="af"/>
+        </w:rPr>
+        <w:annotationRef/>
+      </w:r>
+      <w:r>
+        <w:t>+</w:t>
       </w:r>
     </w:p>
   </w:comment>
@@ -17314,8 +17527,9 @@
 </file>
 
 <file path=word/commentsExtended.xml><?xml version="1.0" encoding="utf-8"?>
-<w15:commentsEx xmlns:wpc="http://schemas.microsoft.com/office/word/2010/wordprocessingCanvas" xmlns:cx="http://schemas.microsoft.com/office/drawing/2014/chartex" xmlns:cx1="http://schemas.microsoft.com/office/drawing/2015/9/8/chartex" xmlns:cx2="http://schemas.microsoft.com/office/drawing/2015/10/21/chartex" xmlns:cx3="http://schemas.microsoft.com/office/drawing/2016/5/9/chartex" xmlns:cx4="http://schemas.microsoft.com/office/drawing/2016/5/10/chartex" xmlns:cx5="http://schemas.microsoft.com/office/drawing/2016/5/11/chartex" xmlns:cx6="http://schemas.microsoft.com/office/drawing/2016/5/12/chartex" xmlns:cx7="http://schemas.microsoft.com/office/drawing/2016/5/13/chartex" xmlns:cx8="http://schemas.microsoft.com/office/drawing/2016/5/14/chartex" xmlns:mc="http://schemas.openxmlformats.org/markup-compatibility/2006" xmlns:aink="http://schemas.microsoft.com/office/drawing/2016/ink" xmlns:am3d="http://schemas.microsoft.com/office/drawing/2017/model3d" xmlns:o="urn:schemas-microsoft-com:office:office" xmlns:r="http://schemas.openxmlformats.org/officeDocument/2006/relationships" xmlns:m="http://schemas.openxmlformats.org/officeDocument/2006/math" xmlns:v="urn:schemas-microsoft-com:vml" xmlns:wp14="http://schemas.microsoft.com/office/word/2010/wordprocessingDrawing" xmlns:wp="http://schemas.openxmlformats.org/drawingml/2006/wordprocessingDrawing" xmlns:w10="urn:schemas-microsoft-com:office:word" xmlns:w="http://schemas.openxmlformats.org/wordprocessingml/2006/main" xmlns:w14="http://schemas.microsoft.com/office/word/2010/wordml" xmlns:w15="http://schemas.microsoft.com/office/word/2012/wordml" xmlns:w16cex="http://schemas.microsoft.com/office/word/2018/wordml/cex" xmlns:w16cid="http://schemas.microsoft.com/office/word/2016/wordml/cid" xmlns:w16="http://schemas.microsoft.com/office/word/2018/wordml" xmlns:w16sdtdh="http://schemas.microsoft.com/office/word/2020/wordml/sdtdatahash" xmlns:w16se="http://schemas.microsoft.com/office/word/2015/wordml/symex" xmlns:wpg="http://schemas.microsoft.com/office/word/2010/wordprocessingGroup" xmlns:wpi="http://schemas.microsoft.com/office/word/2010/wordprocessingInk" xmlns:wne="http://schemas.microsoft.com/office/word/2006/wordml" xmlns:wps="http://schemas.microsoft.com/office/word/2010/wordprocessingShape" mc:Ignorable="w14 w15 w16se w16cid w16 w16cex w16sdtdh wp14">
+<w15:commentsEx xmlns:wpc="http://schemas.microsoft.com/office/word/2010/wordprocessingCanvas" xmlns:cx="http://schemas.microsoft.com/office/drawing/2014/chartex" xmlns:cx1="http://schemas.microsoft.com/office/drawing/2015/9/8/chartex" xmlns:mc="http://schemas.openxmlformats.org/markup-compatibility/2006" xmlns:o="urn:schemas-microsoft-com:office:office" xmlns:r="http://schemas.openxmlformats.org/officeDocument/2006/relationships" xmlns:m="http://schemas.openxmlformats.org/officeDocument/2006/math" xmlns:v="urn:schemas-microsoft-com:vml" xmlns:wp14="http://schemas.microsoft.com/office/word/2010/wordprocessingDrawing" xmlns:wp="http://schemas.openxmlformats.org/drawingml/2006/wordprocessingDrawing" xmlns:w10="urn:schemas-microsoft-com:office:word" xmlns:w="http://schemas.openxmlformats.org/wordprocessingml/2006/main" xmlns:w14="http://schemas.microsoft.com/office/word/2010/wordml" xmlns:w15="http://schemas.microsoft.com/office/word/2012/wordml" xmlns:w16se="http://schemas.microsoft.com/office/word/2015/wordml/symex" xmlns:wpg="http://schemas.microsoft.com/office/word/2010/wordprocessingGroup" xmlns:wpi="http://schemas.microsoft.com/office/word/2010/wordprocessingInk" xmlns:wne="http://schemas.microsoft.com/office/word/2006/wordml" xmlns:wps="http://schemas.microsoft.com/office/word/2010/wordprocessingShape" mc:Ignorable="w14 w15 w16se wp14">
   <w15:commentEx w15:paraId="4EDF079C" w15:done="0"/>
+  <w15:commentEx w15:paraId="381208FF" w15:paraIdParent="4EDF079C" w15:done="0"/>
 </w15:commentsEx>
 </file>
 
@@ -17332,7 +17546,7 @@
 </file>
 
 <file path=word/endnotes.xml><?xml version="1.0" encoding="utf-8"?>
-<w:endnotes xmlns:wpc="http://schemas.microsoft.com/office/word/2010/wordprocessingCanvas" xmlns:cx="http://schemas.microsoft.com/office/drawing/2014/chartex" xmlns:cx1="http://schemas.microsoft.com/office/drawing/2015/9/8/chartex" xmlns:cx2="http://schemas.microsoft.com/office/drawing/2015/10/21/chartex" xmlns:cx3="http://schemas.microsoft.com/office/drawing/2016/5/9/chartex" xmlns:cx4="http://schemas.microsoft.com/office/drawing/2016/5/10/chartex" xmlns:cx5="http://schemas.microsoft.com/office/drawing/2016/5/11/chartex" xmlns:cx6="http://schemas.microsoft.com/office/drawing/2016/5/12/chartex" xmlns:cx7="http://schemas.microsoft.com/office/drawing/2016/5/13/chartex" xmlns:cx8="http://schemas.microsoft.com/office/drawing/2016/5/14/chartex" xmlns:mc="http://schemas.openxmlformats.org/markup-compatibility/2006" xmlns:aink="http://schemas.microsoft.com/office/drawing/2016/ink" xmlns:am3d="http://schemas.microsoft.com/office/drawing/2017/model3d" xmlns:o="urn:schemas-microsoft-com:office:office" xmlns:r="http://schemas.openxmlformats.org/officeDocument/2006/relationships" xmlns:m="http://schemas.openxmlformats.org/officeDocument/2006/math" xmlns:v="urn:schemas-microsoft-com:vml" xmlns:wp14="http://schemas.microsoft.com/office/word/2010/wordprocessingDrawing" xmlns:wp="http://schemas.openxmlformats.org/drawingml/2006/wordprocessingDrawing" xmlns:w10="urn:schemas-microsoft-com:office:word" xmlns:w="http://schemas.openxmlformats.org/wordprocessingml/2006/main" xmlns:w14="http://schemas.microsoft.com/office/word/2010/wordml" xmlns:w15="http://schemas.microsoft.com/office/word/2012/wordml" xmlns:w16cex="http://schemas.microsoft.com/office/word/2018/wordml/cex" xmlns:w16cid="http://schemas.microsoft.com/office/word/2016/wordml/cid" xmlns:w16="http://schemas.microsoft.com/office/word/2018/wordml" xmlns:w16sdtdh="http://schemas.microsoft.com/office/word/2020/wordml/sdtdatahash" xmlns:w16se="http://schemas.microsoft.com/office/word/2015/wordml/symex" xmlns:wpg="http://schemas.microsoft.com/office/word/2010/wordprocessingGroup" xmlns:wpi="http://schemas.microsoft.com/office/word/2010/wordprocessingInk" xmlns:wne="http://schemas.microsoft.com/office/word/2006/wordml" xmlns:wps="http://schemas.microsoft.com/office/word/2010/wordprocessingShape" mc:Ignorable="w14 w15 w16se w16cid w16 w16cex w16sdtdh wp14">
+<w:endnotes xmlns:wpc="http://schemas.microsoft.com/office/word/2010/wordprocessingCanvas" xmlns:cx="http://schemas.microsoft.com/office/drawing/2014/chartex" xmlns:cx1="http://schemas.microsoft.com/office/drawing/2015/9/8/chartex" xmlns:mc="http://schemas.openxmlformats.org/markup-compatibility/2006" xmlns:o="urn:schemas-microsoft-com:office:office" xmlns:r="http://schemas.openxmlformats.org/officeDocument/2006/relationships" xmlns:m="http://schemas.openxmlformats.org/officeDocument/2006/math" xmlns:v="urn:schemas-microsoft-com:vml" xmlns:wp14="http://schemas.microsoft.com/office/word/2010/wordprocessingDrawing" xmlns:wp="http://schemas.openxmlformats.org/drawingml/2006/wordprocessingDrawing" xmlns:w10="urn:schemas-microsoft-com:office:word" xmlns:w="http://schemas.openxmlformats.org/wordprocessingml/2006/main" xmlns:w14="http://schemas.microsoft.com/office/word/2010/wordml" xmlns:w15="http://schemas.microsoft.com/office/word/2012/wordml" xmlns:w16se="http://schemas.microsoft.com/office/word/2015/wordml/symex" xmlns:wpg="http://schemas.microsoft.com/office/word/2010/wordprocessingGroup" xmlns:wpi="http://schemas.microsoft.com/office/word/2010/wordprocessingInk" xmlns:wne="http://schemas.microsoft.com/office/word/2006/wordml" xmlns:wps="http://schemas.microsoft.com/office/word/2010/wordprocessingShape" mc:Ignorable="w14 w15 w16se wp14">
   <w:endnote w:type="separator" w:id="-1">
     <w:p>
       <w:pPr>
@@ -17357,7 +17571,7 @@
 </file>
 
 <file path=word/footer1.xml><?xml version="1.0" encoding="utf-8"?>
-<w:ftr xmlns:wpc="http://schemas.microsoft.com/office/word/2010/wordprocessingCanvas" xmlns:cx="http://schemas.microsoft.com/office/drawing/2014/chartex" xmlns:cx1="http://schemas.microsoft.com/office/drawing/2015/9/8/chartex" xmlns:cx2="http://schemas.microsoft.com/office/drawing/2015/10/21/chartex" xmlns:cx3="http://schemas.microsoft.com/office/drawing/2016/5/9/chartex" xmlns:cx4="http://schemas.microsoft.com/office/drawing/2016/5/10/chartex" xmlns:cx5="http://schemas.microsoft.com/office/drawing/2016/5/11/chartex" xmlns:cx6="http://schemas.microsoft.com/office/drawing/2016/5/12/chartex" xmlns:cx7="http://schemas.microsoft.com/office/drawing/2016/5/13/chartex" xmlns:cx8="http://schemas.microsoft.com/office/drawing/2016/5/14/chartex" xmlns:mc="http://schemas.openxmlformats.org/markup-compatibility/2006" xmlns:aink="http://schemas.microsoft.com/office/drawing/2016/ink" xmlns:am3d="http://schemas.microsoft.com/office/drawing/2017/model3d" xmlns:o="urn:schemas-microsoft-com:office:office" xmlns:r="http://schemas.openxmlformats.org/officeDocument/2006/relationships" xmlns:m="http://schemas.openxmlformats.org/officeDocument/2006/math" xmlns:v="urn:schemas-microsoft-com:vml" xmlns:wp14="http://schemas.microsoft.com/office/word/2010/wordprocessingDrawing" xmlns:wp="http://schemas.openxmlformats.org/drawingml/2006/wordprocessingDrawing" xmlns:w10="urn:schemas-microsoft-com:office:word" xmlns:w="http://schemas.openxmlformats.org/wordprocessingml/2006/main" xmlns:w14="http://schemas.microsoft.com/office/word/2010/wordml" xmlns:w15="http://schemas.microsoft.com/office/word/2012/wordml" xmlns:w16cex="http://schemas.microsoft.com/office/word/2018/wordml/cex" xmlns:w16cid="http://schemas.microsoft.com/office/word/2016/wordml/cid" xmlns:w16="http://schemas.microsoft.com/office/word/2018/wordml" xmlns:w16sdtdh="http://schemas.microsoft.com/office/word/2020/wordml/sdtdatahash" xmlns:w16se="http://schemas.microsoft.com/office/word/2015/wordml/symex" xmlns:wpg="http://schemas.microsoft.com/office/word/2010/wordprocessingGroup" xmlns:wpi="http://schemas.microsoft.com/office/word/2010/wordprocessingInk" xmlns:wne="http://schemas.microsoft.com/office/word/2006/wordml" xmlns:wps="http://schemas.microsoft.com/office/word/2010/wordprocessingShape" mc:Ignorable="w14 w15 w16se w16cid w16 w16cex w16sdtdh wp14">
+<w:ftr xmlns:wpc="http://schemas.microsoft.com/office/word/2010/wordprocessingCanvas" xmlns:cx="http://schemas.microsoft.com/office/drawing/2014/chartex" xmlns:cx1="http://schemas.microsoft.com/office/drawing/2015/9/8/chartex" xmlns:mc="http://schemas.openxmlformats.org/markup-compatibility/2006" xmlns:o="urn:schemas-microsoft-com:office:office" xmlns:r="http://schemas.openxmlformats.org/officeDocument/2006/relationships" xmlns:m="http://schemas.openxmlformats.org/officeDocument/2006/math" xmlns:v="urn:schemas-microsoft-com:vml" xmlns:wp14="http://schemas.microsoft.com/office/word/2010/wordprocessingDrawing" xmlns:wp="http://schemas.openxmlformats.org/drawingml/2006/wordprocessingDrawing" xmlns:w10="urn:schemas-microsoft-com:office:word" xmlns:w="http://schemas.openxmlformats.org/wordprocessingml/2006/main" xmlns:w14="http://schemas.microsoft.com/office/word/2010/wordml" xmlns:w15="http://schemas.microsoft.com/office/word/2012/wordml" xmlns:w16se="http://schemas.microsoft.com/office/word/2015/wordml/symex" xmlns:wpg="http://schemas.microsoft.com/office/word/2010/wordprocessingGroup" xmlns:wpi="http://schemas.microsoft.com/office/word/2010/wordprocessingInk" xmlns:wne="http://schemas.microsoft.com/office/word/2006/wordml" xmlns:wps="http://schemas.microsoft.com/office/word/2010/wordprocessingShape" mc:Ignorable="w14 w15 w16se wp14">
   <w:sdt>
     <w:sdtPr>
       <w:id w:val="-1807238845"/>
@@ -17403,7 +17617,7 @@
 </file>
 
 <file path=word/footnotes.xml><?xml version="1.0" encoding="utf-8"?>
-<w:footnotes xmlns:wpc="http://schemas.microsoft.com/office/word/2010/wordprocessingCanvas" xmlns:cx="http://schemas.microsoft.com/office/drawing/2014/chartex" xmlns:cx1="http://schemas.microsoft.com/office/drawing/2015/9/8/chartex" xmlns:cx2="http://schemas.microsoft.com/office/drawing/2015/10/21/chartex" xmlns:cx3="http://schemas.microsoft.com/office/drawing/2016/5/9/chartex" xmlns:cx4="http://schemas.microsoft.com/office/drawing/2016/5/10/chartex" xmlns:cx5="http://schemas.microsoft.com/office/drawing/2016/5/11/chartex" xmlns:cx6="http://schemas.microsoft.com/office/drawing/2016/5/12/chartex" xmlns:cx7="http://schemas.microsoft.com/office/drawing/2016/5/13/chartex" xmlns:cx8="http://schemas.microsoft.com/office/drawing/2016/5/14/chartex" xmlns:mc="http://schemas.openxmlformats.org/markup-compatibility/2006" xmlns:aink="http://schemas.microsoft.com/office/drawing/2016/ink" xmlns:am3d="http://schemas.microsoft.com/office/drawing/2017/model3d" xmlns:o="urn:schemas-microsoft-com:office:office" xmlns:r="http://schemas.openxmlformats.org/officeDocument/2006/relationships" xmlns:m="http://schemas.openxmlformats.org/officeDocument/2006/math" xmlns:v="urn:schemas-microsoft-com:vml" xmlns:wp14="http://schemas.microsoft.com/office/word/2010/wordprocessingDrawing" xmlns:wp="http://schemas.openxmlformats.org/drawingml/2006/wordprocessingDrawing" xmlns:w10="urn:schemas-microsoft-com:office:word" xmlns:w="http://schemas.openxmlformats.org/wordprocessingml/2006/main" xmlns:w14="http://schemas.microsoft.com/office/word/2010/wordml" xmlns:w15="http://schemas.microsoft.com/office/word/2012/wordml" xmlns:w16cex="http://schemas.microsoft.com/office/word/2018/wordml/cex" xmlns:w16cid="http://schemas.microsoft.com/office/word/2016/wordml/cid" xmlns:w16="http://schemas.microsoft.com/office/word/2018/wordml" xmlns:w16sdtdh="http://schemas.microsoft.com/office/word/2020/wordml/sdtdatahash" xmlns:w16se="http://schemas.microsoft.com/office/word/2015/wordml/symex" xmlns:wpg="http://schemas.microsoft.com/office/word/2010/wordprocessingGroup" xmlns:wpi="http://schemas.microsoft.com/office/word/2010/wordprocessingInk" xmlns:wne="http://schemas.microsoft.com/office/word/2006/wordml" xmlns:wps="http://schemas.microsoft.com/office/word/2010/wordprocessingShape" mc:Ignorable="w14 w15 w16se w16cid w16 w16cex w16sdtdh wp14">
+<w:footnotes xmlns:wpc="http://schemas.microsoft.com/office/word/2010/wordprocessingCanvas" xmlns:cx="http://schemas.microsoft.com/office/drawing/2014/chartex" xmlns:cx1="http://schemas.microsoft.com/office/drawing/2015/9/8/chartex" xmlns:mc="http://schemas.openxmlformats.org/markup-compatibility/2006" xmlns:o="urn:schemas-microsoft-com:office:office" xmlns:r="http://schemas.openxmlformats.org/officeDocument/2006/relationships" xmlns:m="http://schemas.openxmlformats.org/officeDocument/2006/math" xmlns:v="urn:schemas-microsoft-com:vml" xmlns:wp14="http://schemas.microsoft.com/office/word/2010/wordprocessingDrawing" xmlns:wp="http://schemas.openxmlformats.org/drawingml/2006/wordprocessingDrawing" xmlns:w10="urn:schemas-microsoft-com:office:word" xmlns:w="http://schemas.openxmlformats.org/wordprocessingml/2006/main" xmlns:w14="http://schemas.microsoft.com/office/word/2010/wordml" xmlns:w15="http://schemas.microsoft.com/office/word/2012/wordml" xmlns:w16se="http://schemas.microsoft.com/office/word/2015/wordml/symex" xmlns:wpg="http://schemas.microsoft.com/office/word/2010/wordprocessingGroup" xmlns:wpi="http://schemas.microsoft.com/office/word/2010/wordprocessingInk" xmlns:wne="http://schemas.microsoft.com/office/word/2006/wordml" xmlns:wps="http://schemas.microsoft.com/office/word/2010/wordprocessingShape" mc:Ignorable="w14 w15 w16se wp14">
   <w:footnote w:type="separator" w:id="-1">
     <w:p>
       <w:pPr>
@@ -17428,7 +17642,7 @@
 </file>
 
 <file path=word/numbering.xml><?xml version="1.0" encoding="utf-8"?>
-<w:numbering xmlns:wpc="http://schemas.microsoft.com/office/word/2010/wordprocessingCanvas" xmlns:cx="http://schemas.microsoft.com/office/drawing/2014/chartex" xmlns:cx1="http://schemas.microsoft.com/office/drawing/2015/9/8/chartex" xmlns:cx2="http://schemas.microsoft.com/office/drawing/2015/10/21/chartex" xmlns:cx3="http://schemas.microsoft.com/office/drawing/2016/5/9/chartex" xmlns:cx4="http://schemas.microsoft.com/office/drawing/2016/5/10/chartex" xmlns:cx5="http://schemas.microsoft.com/office/drawing/2016/5/11/chartex" xmlns:cx6="http://schemas.microsoft.com/office/drawing/2016/5/12/chartex" xmlns:cx7="http://schemas.microsoft.com/office/drawing/2016/5/13/chartex" xmlns:cx8="http://schemas.microsoft.com/office/drawing/2016/5/14/chartex" xmlns:mc="http://schemas.openxmlformats.org/markup-compatibility/2006" xmlns:aink="http://schemas.microsoft.com/office/drawing/2016/ink" xmlns:am3d="http://schemas.microsoft.com/office/drawing/2017/model3d" xmlns:o="urn:schemas-microsoft-com:office:office" xmlns:r="http://schemas.openxmlformats.org/officeDocument/2006/relationships" xmlns:m="http://schemas.openxmlformats.org/officeDocument/2006/math" xmlns:v="urn:schemas-microsoft-com:vml" xmlns:wp14="http://schemas.microsoft.com/office/word/2010/wordprocessingDrawing" xmlns:wp="http://schemas.openxmlformats.org/drawingml/2006/wordprocessingDrawing" xmlns:w10="urn:schemas-microsoft-com:office:word" xmlns:w="http://schemas.openxmlformats.org/wordprocessingml/2006/main" xmlns:w14="http://schemas.microsoft.com/office/word/2010/wordml" xmlns:w15="http://schemas.microsoft.com/office/word/2012/wordml" xmlns:w16cex="http://schemas.microsoft.com/office/word/2018/wordml/cex" xmlns:w16cid="http://schemas.microsoft.com/office/word/2016/wordml/cid" xmlns:w16="http://schemas.microsoft.com/office/word/2018/wordml" xmlns:w16sdtdh="http://schemas.microsoft.com/office/word/2020/wordml/sdtdatahash" xmlns:w16se="http://schemas.microsoft.com/office/word/2015/wordml/symex" xmlns:wpg="http://schemas.microsoft.com/office/word/2010/wordprocessingGroup" xmlns:wpi="http://schemas.microsoft.com/office/word/2010/wordprocessingInk" xmlns:wne="http://schemas.microsoft.com/office/word/2006/wordml" xmlns:wps="http://schemas.microsoft.com/office/word/2010/wordprocessingShape" mc:Ignorable="w14 w15 w16se w16cid w16 w16cex w16sdtdh wp14">
+<w:numbering xmlns:wpc="http://schemas.microsoft.com/office/word/2010/wordprocessingCanvas" xmlns:cx="http://schemas.microsoft.com/office/drawing/2014/chartex" xmlns:cx1="http://schemas.microsoft.com/office/drawing/2015/9/8/chartex" xmlns:mc="http://schemas.openxmlformats.org/markup-compatibility/2006" xmlns:o="urn:schemas-microsoft-com:office:office" xmlns:r="http://schemas.openxmlformats.org/officeDocument/2006/relationships" xmlns:m="http://schemas.openxmlformats.org/officeDocument/2006/math" xmlns:v="urn:schemas-microsoft-com:vml" xmlns:wp14="http://schemas.microsoft.com/office/word/2010/wordprocessingDrawing" xmlns:wp="http://schemas.openxmlformats.org/drawingml/2006/wordprocessingDrawing" xmlns:w10="urn:schemas-microsoft-com:office:word" xmlns:w="http://schemas.openxmlformats.org/wordprocessingml/2006/main" xmlns:w14="http://schemas.microsoft.com/office/word/2010/wordml" xmlns:w15="http://schemas.microsoft.com/office/word/2012/wordml" xmlns:w16se="http://schemas.microsoft.com/office/word/2015/wordml/symex" xmlns:wpg="http://schemas.microsoft.com/office/word/2010/wordprocessingGroup" xmlns:wpi="http://schemas.microsoft.com/office/word/2010/wordprocessingInk" xmlns:wne="http://schemas.microsoft.com/office/word/2006/wordml" xmlns:wps="http://schemas.microsoft.com/office/word/2010/wordprocessingShape" mc:Ignorable="w14 w15 w16se wp14">
   <w:abstractNum w:abstractNumId="0" w15:restartNumberingAfterBreak="0">
     <w:nsid w:val="0D6D4176"/>
     <w:multiLevelType w:val="multilevel"/>
@@ -18374,15 +18588,18 @@
 </file>
 
 <file path=word/people.xml><?xml version="1.0" encoding="utf-8"?>
-<w15:people xmlns:wpc="http://schemas.microsoft.com/office/word/2010/wordprocessingCanvas" xmlns:cx="http://schemas.microsoft.com/office/drawing/2014/chartex" xmlns:cx1="http://schemas.microsoft.com/office/drawing/2015/9/8/chartex" xmlns:cx2="http://schemas.microsoft.com/office/drawing/2015/10/21/chartex" xmlns:cx3="http://schemas.microsoft.com/office/drawing/2016/5/9/chartex" xmlns:cx4="http://schemas.microsoft.com/office/drawing/2016/5/10/chartex" xmlns:cx5="http://schemas.microsoft.com/office/drawing/2016/5/11/chartex" xmlns:cx6="http://schemas.microsoft.com/office/drawing/2016/5/12/chartex" xmlns:cx7="http://schemas.microsoft.com/office/drawing/2016/5/13/chartex" xmlns:cx8="http://schemas.microsoft.com/office/drawing/2016/5/14/chartex" xmlns:mc="http://schemas.openxmlformats.org/markup-compatibility/2006" xmlns:aink="http://schemas.microsoft.com/office/drawing/2016/ink" xmlns:am3d="http://schemas.microsoft.com/office/drawing/2017/model3d" xmlns:o="urn:schemas-microsoft-com:office:office" xmlns:r="http://schemas.openxmlformats.org/officeDocument/2006/relationships" xmlns:m="http://schemas.openxmlformats.org/officeDocument/2006/math" xmlns:v="urn:schemas-microsoft-com:vml" xmlns:wp14="http://schemas.microsoft.com/office/word/2010/wordprocessingDrawing" xmlns:wp="http://schemas.openxmlformats.org/drawingml/2006/wordprocessingDrawing" xmlns:w10="urn:schemas-microsoft-com:office:word" xmlns:w="http://schemas.openxmlformats.org/wordprocessingml/2006/main" xmlns:w14="http://schemas.microsoft.com/office/word/2010/wordml" xmlns:w15="http://schemas.microsoft.com/office/word/2012/wordml" xmlns:w16cex="http://schemas.microsoft.com/office/word/2018/wordml/cex" xmlns:w16cid="http://schemas.microsoft.com/office/word/2016/wordml/cid" xmlns:w16="http://schemas.microsoft.com/office/word/2018/wordml" xmlns:w16sdtdh="http://schemas.microsoft.com/office/word/2020/wordml/sdtdatahash" xmlns:w16se="http://schemas.microsoft.com/office/word/2015/wordml/symex" xmlns:wpg="http://schemas.microsoft.com/office/word/2010/wordprocessingGroup" xmlns:wpi="http://schemas.microsoft.com/office/word/2010/wordprocessingInk" xmlns:wne="http://schemas.microsoft.com/office/word/2006/wordml" xmlns:wps="http://schemas.microsoft.com/office/word/2010/wordprocessingShape" mc:Ignorable="w14 w15 w16se w16cid w16 w16cex w16sdtdh wp14">
+<w15:people xmlns:wpc="http://schemas.microsoft.com/office/word/2010/wordprocessingCanvas" xmlns:cx="http://schemas.microsoft.com/office/drawing/2014/chartex" xmlns:cx1="http://schemas.microsoft.com/office/drawing/2015/9/8/chartex" xmlns:mc="http://schemas.openxmlformats.org/markup-compatibility/2006" xmlns:o="urn:schemas-microsoft-com:office:office" xmlns:r="http://schemas.openxmlformats.org/officeDocument/2006/relationships" xmlns:m="http://schemas.openxmlformats.org/officeDocument/2006/math" xmlns:v="urn:schemas-microsoft-com:vml" xmlns:wp14="http://schemas.microsoft.com/office/word/2010/wordprocessingDrawing" xmlns:wp="http://schemas.openxmlformats.org/drawingml/2006/wordprocessingDrawing" xmlns:w10="urn:schemas-microsoft-com:office:word" xmlns:w="http://schemas.openxmlformats.org/wordprocessingml/2006/main" xmlns:w14="http://schemas.microsoft.com/office/word/2010/wordml" xmlns:w15="http://schemas.microsoft.com/office/word/2012/wordml" xmlns:w16se="http://schemas.microsoft.com/office/word/2015/wordml/symex" xmlns:wpg="http://schemas.microsoft.com/office/word/2010/wordprocessingGroup" xmlns:wpi="http://schemas.microsoft.com/office/word/2010/wordprocessingInk" xmlns:wne="http://schemas.microsoft.com/office/word/2006/wordml" xmlns:wps="http://schemas.microsoft.com/office/word/2010/wordprocessingShape" mc:Ignorable="w14 w15 w16se wp14">
   <w15:person w15:author="Aleksey A. Kalentev">
     <w15:presenceInfo w15:providerId="AD" w15:userId="S-1-5-21-507921405-1993962763-1957994488-151096"/>
+  </w15:person>
+  <w15:person w15:author="podop">
+    <w15:presenceInfo w15:providerId="Windows Live" w15:userId="8f781ad80b5a8d61"/>
   </w15:person>
 </w15:people>
 </file>
 
 <file path=word/styles.xml><?xml version="1.0" encoding="utf-8"?>
-<w:styles xmlns:mc="http://schemas.openxmlformats.org/markup-compatibility/2006" xmlns:r="http://schemas.openxmlformats.org/officeDocument/2006/relationships" xmlns:w="http://schemas.openxmlformats.org/wordprocessingml/2006/main" xmlns:w14="http://schemas.microsoft.com/office/word/2010/wordml" xmlns:w15="http://schemas.microsoft.com/office/word/2012/wordml" xmlns:w16cex="http://schemas.microsoft.com/office/word/2018/wordml/cex" xmlns:w16cid="http://schemas.microsoft.com/office/word/2016/wordml/cid" xmlns:w16="http://schemas.microsoft.com/office/word/2018/wordml" xmlns:w16sdtdh="http://schemas.microsoft.com/office/word/2020/wordml/sdtdatahash" xmlns:w16se="http://schemas.microsoft.com/office/word/2015/wordml/symex" mc:Ignorable="w14 w15 w16se w16cid w16 w16cex w16sdtdh">
+<w:styles xmlns:mc="http://schemas.openxmlformats.org/markup-compatibility/2006" xmlns:r="http://schemas.openxmlformats.org/officeDocument/2006/relationships" xmlns:w="http://schemas.openxmlformats.org/wordprocessingml/2006/main" xmlns:w14="http://schemas.microsoft.com/office/word/2010/wordml" xmlns:w15="http://schemas.microsoft.com/office/word/2012/wordml" xmlns:w16se="http://schemas.microsoft.com/office/word/2015/wordml/symex" mc:Ignorable="w14 w15 w16se">
   <w:docDefaults>
     <w:rPrDefault>
       <w:rPr>
@@ -18398,7 +18615,7 @@
       </w:pPr>
     </w:pPrDefault>
   </w:docDefaults>
-  <w:latentStyles w:defLockedState="0" w:defUIPriority="99" w:defSemiHidden="0" w:defUnhideWhenUsed="0" w:defQFormat="0" w:count="376">
+  <w:latentStyles w:defLockedState="0" w:defUIPriority="99" w:defSemiHidden="0" w:defUnhideWhenUsed="0" w:defQFormat="0" w:count="371">
     <w:lsdException w:name="Normal" w:uiPriority="0" w:qFormat="1"/>
     <w:lsdException w:name="heading 1" w:uiPriority="9" w:qFormat="1"/>
     <w:lsdException w:name="heading 2" w:semiHidden="1" w:uiPriority="9" w:unhideWhenUsed="1" w:qFormat="1"/>
@@ -18504,6 +18721,7 @@
     <w:lsdException w:name="HTML Sample" w:semiHidden="1" w:unhideWhenUsed="1"/>
     <w:lsdException w:name="HTML Typewriter" w:semiHidden="1" w:unhideWhenUsed="1"/>
     <w:lsdException w:name="HTML Variable" w:semiHidden="1" w:unhideWhenUsed="1"/>
+    <w:lsdException w:name="Normal Table" w:semiHidden="1" w:unhideWhenUsed="1"/>
     <w:lsdException w:name="annotation subject" w:semiHidden="1" w:unhideWhenUsed="1"/>
     <w:lsdException w:name="No List" w:semiHidden="1" w:unhideWhenUsed="1"/>
     <w:lsdException w:name="Outline List 1" w:semiHidden="1" w:unhideWhenUsed="1"/>
@@ -18546,8 +18764,11 @@
     <w:lsdException w:name="Table Contemporary" w:semiHidden="1" w:unhideWhenUsed="1"/>
     <w:lsdException w:name="Table Elegant" w:semiHidden="1" w:unhideWhenUsed="1"/>
     <w:lsdException w:name="Table Professional" w:semiHidden="1" w:unhideWhenUsed="1"/>
+    <w:lsdException w:name="Table Subtle 1" w:semiHidden="1" w:unhideWhenUsed="1"/>
     <w:lsdException w:name="Table Subtle 2" w:semiHidden="1" w:unhideWhenUsed="1"/>
     <w:lsdException w:name="Table Web 1" w:semiHidden="1" w:unhideWhenUsed="1"/>
+    <w:lsdException w:name="Table Web 2" w:semiHidden="1" w:unhideWhenUsed="1"/>
+    <w:lsdException w:name="Table Web 3" w:semiHidden="1" w:unhideWhenUsed="1"/>
     <w:lsdException w:name="Balloon Text" w:semiHidden="1" w:unhideWhenUsed="1"/>
     <w:lsdException w:name="Table Grid" w:uiPriority="39"/>
     <w:lsdException w:name="Table Theme" w:semiHidden="1" w:unhideWhenUsed="1"/>
@@ -18766,11 +18987,6 @@
     <w:lsdException w:name="List Table 5 Dark Accent 6" w:uiPriority="50"/>
     <w:lsdException w:name="List Table 6 Colorful Accent 6" w:uiPriority="51"/>
     <w:lsdException w:name="List Table 7 Colorful Accent 6" w:uiPriority="52"/>
-    <w:lsdException w:name="Mention" w:semiHidden="1" w:unhideWhenUsed="1"/>
-    <w:lsdException w:name="Smart Hyperlink" w:semiHidden="1" w:unhideWhenUsed="1"/>
-    <w:lsdException w:name="Hashtag" w:semiHidden="1" w:unhideWhenUsed="1"/>
-    <w:lsdException w:name="Unresolved Mention" w:semiHidden="1" w:unhideWhenUsed="1"/>
-    <w:lsdException w:name="Smart Link" w:semiHidden="1" w:unhideWhenUsed="1"/>
   </w:latentStyles>
   <w:style w:type="paragraph" w:default="1" w:styleId="a">
     <w:name w:val="Normal"/>
@@ -19146,6 +19362,36 @@
       <w:szCs w:val="20"/>
     </w:rPr>
   </w:style>
+  <w:style w:type="paragraph" w:styleId="af4">
+    <w:name w:val="Balloon Text"/>
+    <w:basedOn w:val="a"/>
+    <w:link w:val="af5"/>
+    <w:uiPriority w:val="99"/>
+    <w:semiHidden/>
+    <w:unhideWhenUsed/>
+    <w:rsid w:val="00DA5512"/>
+    <w:pPr>
+      <w:spacing w:line="240" w:lineRule="auto"/>
+    </w:pPr>
+    <w:rPr>
+      <w:rFonts w:ascii="Segoe UI" w:hAnsi="Segoe UI" w:cs="Segoe UI"/>
+      <w:sz w:val="18"/>
+      <w:szCs w:val="18"/>
+    </w:rPr>
+  </w:style>
+  <w:style w:type="character" w:customStyle="1" w:styleId="af5">
+    <w:name w:val="Текст выноски Знак"/>
+    <w:basedOn w:val="a0"/>
+    <w:link w:val="af4"/>
+    <w:uiPriority w:val="99"/>
+    <w:semiHidden/>
+    <w:rsid w:val="00DA5512"/>
+    <w:rPr>
+      <w:rFonts w:ascii="Segoe UI" w:hAnsi="Segoe UI" w:cs="Segoe UI"/>
+      <w:sz w:val="18"/>
+      <w:szCs w:val="18"/>
+    </w:rPr>
+  </w:style>
 </w:styles>
 </file>
 
@@ -19449,7 +19695,7 @@
 </file>
 
 <file path=customXml/itemProps1.xml><?xml version="1.0" encoding="utf-8"?>
-<ds:datastoreItem xmlns:ds="http://schemas.openxmlformats.org/officeDocument/2006/customXml" ds:itemID="{804BAE48-61FA-40B1-A1DF-BE38F22F3DA1}">
+<ds:datastoreItem xmlns:ds="http://schemas.openxmlformats.org/officeDocument/2006/customXml" ds:itemID="{39FA16B3-C481-4413-918D-ABF340923D24}">
   <ds:schemaRefs>
     <ds:schemaRef ds:uri="http://schemas.openxmlformats.org/officeDocument/2006/bibliography"/>
   </ds:schemaRefs>

</xml_diff>

<commit_message>
refactor <Lab6> : Выполнена Lab6
</commit_message>
<xml_diff>
--- a/ЛБ5 Подопригора Л.И..docx
+++ b/ЛБ5 Подопригора Л.И..docx
@@ -568,19 +568,11 @@
         </w:rPr>
         <w:tab/>
       </w:r>
-      <w:proofErr w:type="spellStart"/>
       <w:r>
         <w:rPr>
           <w:sz w:val="24"/>
         </w:rPr>
-        <w:t>Калентьев</w:t>
-      </w:r>
-      <w:proofErr w:type="spellEnd"/>
-      <w:r>
-        <w:rPr>
-          <w:sz w:val="24"/>
-        </w:rPr>
-        <w:t xml:space="preserve"> А.А.</w:t>
+        <w:t>Калентьев А.А.</w:t>
       </w:r>
     </w:p>
     <w:p>
@@ -645,10 +637,6 @@
         <w:p>
           <w:pPr>
             <w:pStyle w:val="11"/>
-            <w:tabs>
-              <w:tab w:val="right" w:leader="dot" w:pos="9345"/>
-            </w:tabs>
-            <w:ind w:firstLine="0"/>
             <w:rPr>
               <w:rFonts w:asciiTheme="minorHAnsi" w:eastAsiaTheme="minorEastAsia" w:hAnsiTheme="minorHAnsi" w:cstheme="minorBidi"/>
               <w:noProof/>
@@ -666,7 +654,7 @@
           <w:r>
             <w:fldChar w:fldCharType="separate"/>
           </w:r>
-          <w:hyperlink w:anchor="_Toc228293274" w:history="1">
+          <w:hyperlink w:anchor="_Toc229514656" w:history="1">
             <w:r>
               <w:rPr>
                 <w:rStyle w:val="ae"/>
@@ -693,7 +681,7 @@
                 <w:noProof/>
                 <w:webHidden/>
               </w:rPr>
-              <w:instrText xml:space="preserve"> PAGEREF _Toc228293274 \h </w:instrText>
+              <w:instrText xml:space="preserve"> PAGEREF _Toc229514656 \h </w:instrText>
             </w:r>
             <w:r>
               <w:rPr>
@@ -727,11 +715,6 @@
         <w:p>
           <w:pPr>
             <w:pStyle w:val="11"/>
-            <w:tabs>
-              <w:tab w:val="left" w:pos="1320"/>
-              <w:tab w:val="right" w:leader="dot" w:pos="9345"/>
-            </w:tabs>
-            <w:ind w:firstLine="0"/>
             <w:rPr>
               <w:rFonts w:asciiTheme="minorHAnsi" w:eastAsiaTheme="minorEastAsia" w:hAnsiTheme="minorHAnsi" w:cstheme="minorBidi"/>
               <w:noProof/>
@@ -740,27 +723,13 @@
               <w:lang w:eastAsia="ru-RU"/>
             </w:rPr>
           </w:pPr>
-          <w:hyperlink w:anchor="_Toc228293275" w:history="1">
+          <w:hyperlink w:anchor="_Toc229514657" w:history="1">
             <w:r>
               <w:rPr>
                 <w:rStyle w:val="ae"/>
                 <w:noProof/>
               </w:rPr>
-              <w:t>1.</w:t>
-            </w:r>
-            <w:r>
-              <w:rPr>
-                <w:rStyle w:val="ae"/>
-                <w:noProof/>
-              </w:rPr>
-              <w:t xml:space="preserve"> </w:t>
-            </w:r>
-            <w:r>
-              <w:rPr>
-                <w:rStyle w:val="ae"/>
-                <w:noProof/>
-              </w:rPr>
-              <w:t>Основная часть</w:t>
+              <w:t>1.Основная часть</w:t>
             </w:r>
             <w:r>
               <w:rPr>
@@ -781,7 +750,7 @@
                 <w:noProof/>
                 <w:webHidden/>
               </w:rPr>
-              <w:instrText xml:space="preserve"> PAGEREF _Toc228293275 \h </w:instrText>
+              <w:instrText xml:space="preserve"> PAGEREF _Toc229514657 \h </w:instrText>
             </w:r>
             <w:r>
               <w:rPr>
@@ -815,10 +784,6 @@
         <w:p>
           <w:pPr>
             <w:pStyle w:val="11"/>
-            <w:tabs>
-              <w:tab w:val="right" w:leader="dot" w:pos="9345"/>
-            </w:tabs>
-            <w:ind w:firstLine="0"/>
             <w:rPr>
               <w:rFonts w:asciiTheme="minorHAnsi" w:eastAsiaTheme="minorEastAsia" w:hAnsiTheme="minorHAnsi" w:cstheme="minorBidi"/>
               <w:noProof/>
@@ -827,7 +792,7 @@
               <w:lang w:eastAsia="ru-RU"/>
             </w:rPr>
           </w:pPr>
-          <w:hyperlink w:anchor="_Toc228293276" w:history="1">
+          <w:hyperlink w:anchor="_Toc229514658" w:history="1">
             <w:r>
               <w:rPr>
                 <w:rStyle w:val="ae"/>
@@ -869,7 +834,7 @@
                 <w:noProof/>
                 <w:webHidden/>
               </w:rPr>
-              <w:instrText xml:space="preserve"> PAGEREF _Toc228293276 \h </w:instrText>
+              <w:instrText xml:space="preserve"> PAGEREF _Toc229514658 \h </w:instrText>
             </w:r>
             <w:r>
               <w:rPr>
@@ -903,10 +868,6 @@
         <w:p>
           <w:pPr>
             <w:pStyle w:val="11"/>
-            <w:tabs>
-              <w:tab w:val="right" w:leader="dot" w:pos="9345"/>
-            </w:tabs>
-            <w:ind w:firstLine="0"/>
             <w:rPr>
               <w:rFonts w:asciiTheme="minorHAnsi" w:eastAsiaTheme="minorEastAsia" w:hAnsiTheme="minorHAnsi" w:cstheme="minorBidi"/>
               <w:noProof/>
@@ -915,13 +876,13 @@
               <w:lang w:eastAsia="ru-RU"/>
             </w:rPr>
           </w:pPr>
-          <w:hyperlink w:anchor="_Toc228293277" w:history="1">
+          <w:hyperlink w:anchor="_Toc229514659" w:history="1">
             <w:r>
               <w:rPr>
                 <w:rStyle w:val="ae"/>
                 <w:noProof/>
               </w:rPr>
-              <w:t>1.2</w:t>
+              <w:t xml:space="preserve">1.2.   </w:t>
             </w:r>
             <w:r>
               <w:rPr>
@@ -929,28 +890,13 @@
                 <w:noProof/>
                 <w:lang w:val="en-GB"/>
               </w:rPr>
-              <w:t>.</w:t>
+              <w:t>UML</w:t>
             </w:r>
             <w:r>
               <w:rPr>
                 <w:rStyle w:val="ae"/>
                 <w:noProof/>
               </w:rPr>
-              <w:t xml:space="preserve">   </w:t>
-            </w:r>
-            <w:r>
-              <w:rPr>
-                <w:rStyle w:val="ae"/>
-                <w:noProof/>
-                <w:lang w:val="en-GB"/>
-              </w:rPr>
-              <w:t>UML</w:t>
-            </w:r>
-            <w:r>
-              <w:rPr>
-                <w:rStyle w:val="ae"/>
-                <w:noProof/>
-              </w:rPr>
               <w:t xml:space="preserve"> диаграмма классов</w:t>
             </w:r>
             <w:r>
@@ -972,7 +918,7 @@
                 <w:noProof/>
                 <w:webHidden/>
               </w:rPr>
-              <w:instrText xml:space="preserve"> PAGEREF _Toc228293277 \h </w:instrText>
+              <w:instrText xml:space="preserve"> PAGEREF _Toc229514659 \h </w:instrText>
             </w:r>
             <w:r>
               <w:rPr>
@@ -1006,10 +952,6 @@
         <w:p>
           <w:pPr>
             <w:pStyle w:val="11"/>
-            <w:tabs>
-              <w:tab w:val="right" w:leader="dot" w:pos="9345"/>
-            </w:tabs>
-            <w:ind w:firstLine="0"/>
             <w:rPr>
               <w:rFonts w:asciiTheme="minorHAnsi" w:eastAsiaTheme="minorEastAsia" w:hAnsiTheme="minorHAnsi" w:cstheme="minorBidi"/>
               <w:noProof/>
@@ -1018,7 +960,7 @@
               <w:lang w:eastAsia="ru-RU"/>
             </w:rPr>
           </w:pPr>
-          <w:hyperlink w:anchor="_Toc228293278" w:history="1">
+          <w:hyperlink w:anchor="_Toc229514660" w:history="1">
             <w:r>
               <w:rPr>
                 <w:rStyle w:val="ae"/>
@@ -1045,7 +987,7 @@
                 <w:noProof/>
                 <w:webHidden/>
               </w:rPr>
-              <w:instrText xml:space="preserve"> PAGEREF _Toc228293278 \h </w:instrText>
+              <w:instrText xml:space="preserve"> PAGEREF _Toc229514660 \h </w:instrText>
             </w:r>
             <w:r>
               <w:rPr>
@@ -1079,10 +1021,6 @@
         <w:p>
           <w:pPr>
             <w:pStyle w:val="11"/>
-            <w:tabs>
-              <w:tab w:val="right" w:leader="dot" w:pos="9345"/>
-            </w:tabs>
-            <w:ind w:firstLine="0"/>
             <w:rPr>
               <w:rFonts w:asciiTheme="minorHAnsi" w:eastAsiaTheme="minorEastAsia" w:hAnsiTheme="minorHAnsi" w:cstheme="minorBidi"/>
               <w:noProof/>
@@ -1091,7 +1029,7 @@
               <w:lang w:eastAsia="ru-RU"/>
             </w:rPr>
           </w:pPr>
-          <w:hyperlink w:anchor="_Toc228293279" w:history="1">
+          <w:hyperlink w:anchor="_Toc229514661" w:history="1">
             <w:r>
               <w:rPr>
                 <w:rStyle w:val="ae"/>
@@ -1126,7 +1064,7 @@
                 <w:noProof/>
                 <w:webHidden/>
               </w:rPr>
-              <w:instrText xml:space="preserve"> PAGEREF _Toc228293279 \h </w:instrText>
+              <w:instrText xml:space="preserve"> PAGEREF _Toc229514661 \h </w:instrText>
             </w:r>
             <w:r>
               <w:rPr>
@@ -1160,10 +1098,6 @@
         <w:p>
           <w:pPr>
             <w:pStyle w:val="11"/>
-            <w:tabs>
-              <w:tab w:val="right" w:leader="dot" w:pos="9345"/>
-            </w:tabs>
-            <w:ind w:firstLine="0"/>
             <w:rPr>
               <w:rFonts w:asciiTheme="minorHAnsi" w:eastAsiaTheme="minorEastAsia" w:hAnsiTheme="minorHAnsi" w:cstheme="minorBidi"/>
               <w:noProof/>
@@ -1172,7 +1106,7 @@
               <w:lang w:eastAsia="ru-RU"/>
             </w:rPr>
           </w:pPr>
-          <w:hyperlink w:anchor="_Toc228293280" w:history="1">
+          <w:hyperlink w:anchor="_Toc229514662" w:history="1">
             <w:r>
               <w:rPr>
                 <w:rStyle w:val="ae"/>
@@ -1199,7 +1133,7 @@
                 <w:noProof/>
                 <w:webHidden/>
               </w:rPr>
-              <w:instrText xml:space="preserve"> PAGEREF _Toc228293280 \h </w:instrText>
+              <w:instrText xml:space="preserve"> PAGEREF _Toc229514662 \h </w:instrText>
             </w:r>
             <w:r>
               <w:rPr>
@@ -1233,10 +1167,7 @@
         <w:p>
           <w:pPr>
             <w:pStyle w:val="11"/>
-            <w:tabs>
-              <w:tab w:val="right" w:leader="dot" w:pos="9345"/>
-            </w:tabs>
-            <w:ind w:firstLine="284"/>
+            <w:ind w:firstLine="426"/>
             <w:rPr>
               <w:rFonts w:asciiTheme="minorHAnsi" w:eastAsiaTheme="minorEastAsia" w:hAnsiTheme="minorHAnsi" w:cstheme="minorBidi"/>
               <w:noProof/>
@@ -1245,7 +1176,7 @@
               <w:lang w:eastAsia="ru-RU"/>
             </w:rPr>
           </w:pPr>
-          <w:hyperlink w:anchor="_Toc228293281" w:history="1">
+          <w:hyperlink w:anchor="_Toc229514663" w:history="1">
             <w:r>
               <w:rPr>
                 <w:rStyle w:val="ae"/>
@@ -1272,7 +1203,7 @@
                 <w:noProof/>
                 <w:webHidden/>
               </w:rPr>
-              <w:instrText xml:space="preserve"> PAGEREF _Toc228293281 \h </w:instrText>
+              <w:instrText xml:space="preserve"> PAGEREF _Toc229514663 \h </w:instrText>
             </w:r>
             <w:r>
               <w:rPr>
@@ -1306,10 +1237,7 @@
         <w:p>
           <w:pPr>
             <w:pStyle w:val="11"/>
-            <w:tabs>
-              <w:tab w:val="right" w:leader="dot" w:pos="9345"/>
-            </w:tabs>
-            <w:ind w:firstLine="284"/>
+            <w:ind w:firstLine="426"/>
             <w:rPr>
               <w:rFonts w:asciiTheme="minorHAnsi" w:eastAsiaTheme="minorEastAsia" w:hAnsiTheme="minorHAnsi" w:cstheme="minorBidi"/>
               <w:noProof/>
@@ -1318,7 +1246,7 @@
               <w:lang w:eastAsia="ru-RU"/>
             </w:rPr>
           </w:pPr>
-          <w:hyperlink w:anchor="_Toc228293282" w:history="1">
+          <w:hyperlink w:anchor="_Toc229514664" w:history="1">
             <w:r>
               <w:rPr>
                 <w:rStyle w:val="ae"/>
@@ -1345,7 +1273,7 @@
                 <w:noProof/>
                 <w:webHidden/>
               </w:rPr>
-              <w:instrText xml:space="preserve"> PAGEREF _Toc228293282 \h </w:instrText>
+              <w:instrText xml:space="preserve"> PAGEREF _Toc229514664 \h </w:instrText>
             </w:r>
             <w:r>
               <w:rPr>
@@ -1379,10 +1307,7 @@
         <w:p>
           <w:pPr>
             <w:pStyle w:val="11"/>
-            <w:tabs>
-              <w:tab w:val="right" w:leader="dot" w:pos="9345"/>
-            </w:tabs>
-            <w:ind w:firstLine="284"/>
+            <w:ind w:firstLine="426"/>
             <w:rPr>
               <w:rFonts w:asciiTheme="minorHAnsi" w:eastAsiaTheme="minorEastAsia" w:hAnsiTheme="minorHAnsi" w:cstheme="minorBidi"/>
               <w:noProof/>
@@ -1391,7 +1316,7 @@
               <w:lang w:eastAsia="ru-RU"/>
             </w:rPr>
           </w:pPr>
-          <w:hyperlink w:anchor="_Toc228293283" w:history="1">
+          <w:hyperlink w:anchor="_Toc229514665" w:history="1">
             <w:r>
               <w:rPr>
                 <w:rStyle w:val="ae"/>
@@ -1418,7 +1343,7 @@
                 <w:noProof/>
                 <w:webHidden/>
               </w:rPr>
-              <w:instrText xml:space="preserve"> PAGEREF _Toc228293283 \h </w:instrText>
+              <w:instrText xml:space="preserve"> PAGEREF _Toc229514665 \h </w:instrText>
             </w:r>
             <w:r>
               <w:rPr>
@@ -1452,10 +1377,7 @@
         <w:p>
           <w:pPr>
             <w:pStyle w:val="11"/>
-            <w:tabs>
-              <w:tab w:val="right" w:leader="dot" w:pos="9345"/>
-            </w:tabs>
-            <w:ind w:firstLine="284"/>
+            <w:ind w:firstLine="426"/>
             <w:rPr>
               <w:rFonts w:asciiTheme="minorHAnsi" w:eastAsiaTheme="minorEastAsia" w:hAnsiTheme="minorHAnsi" w:cstheme="minorBidi"/>
               <w:noProof/>
@@ -1464,7 +1386,7 @@
               <w:lang w:eastAsia="ru-RU"/>
             </w:rPr>
           </w:pPr>
-          <w:hyperlink w:anchor="_Toc228293284" w:history="1">
+          <w:hyperlink w:anchor="_Toc229514666" w:history="1">
             <w:r>
               <w:rPr>
                 <w:rStyle w:val="ae"/>
@@ -1491,7 +1413,7 @@
                 <w:noProof/>
                 <w:webHidden/>
               </w:rPr>
-              <w:instrText xml:space="preserve"> PAGEREF _Toc228293284 \h </w:instrText>
+              <w:instrText xml:space="preserve"> PAGEREF _Toc229514666 \h </w:instrText>
             </w:r>
             <w:r>
               <w:rPr>
@@ -1525,10 +1447,7 @@
         <w:p>
           <w:pPr>
             <w:pStyle w:val="11"/>
-            <w:tabs>
-              <w:tab w:val="right" w:leader="dot" w:pos="9345"/>
-            </w:tabs>
-            <w:ind w:firstLine="284"/>
+            <w:ind w:firstLine="426"/>
             <w:rPr>
               <w:rFonts w:asciiTheme="minorHAnsi" w:eastAsiaTheme="minorEastAsia" w:hAnsiTheme="minorHAnsi" w:cstheme="minorBidi"/>
               <w:noProof/>
@@ -1537,7 +1456,7 @@
               <w:lang w:eastAsia="ru-RU"/>
             </w:rPr>
           </w:pPr>
-          <w:hyperlink w:anchor="_Toc228293285" w:history="1">
+          <w:hyperlink w:anchor="_Toc229514667" w:history="1">
             <w:r>
               <w:rPr>
                 <w:rStyle w:val="ae"/>
@@ -1564,7 +1483,7 @@
                 <w:noProof/>
                 <w:webHidden/>
               </w:rPr>
-              <w:instrText xml:space="preserve"> PAGEREF _Toc228293285 \h </w:instrText>
+              <w:instrText xml:space="preserve"> PAGEREF _Toc229514667 \h </w:instrText>
             </w:r>
             <w:r>
               <w:rPr>
@@ -1598,10 +1517,6 @@
         <w:p>
           <w:pPr>
             <w:pStyle w:val="11"/>
-            <w:tabs>
-              <w:tab w:val="right" w:leader="dot" w:pos="9345"/>
-            </w:tabs>
-            <w:ind w:firstLine="0"/>
             <w:rPr>
               <w:rFonts w:asciiTheme="minorHAnsi" w:eastAsiaTheme="minorEastAsia" w:hAnsiTheme="minorHAnsi" w:cstheme="minorBidi"/>
               <w:noProof/>
@@ -1610,13 +1525,13 @@
               <w:lang w:eastAsia="ru-RU"/>
             </w:rPr>
           </w:pPr>
-          <w:hyperlink w:anchor="_Toc228293286" w:history="1">
+          <w:hyperlink w:anchor="_Toc229514668" w:history="1">
             <w:r>
               <w:rPr>
                 <w:rStyle w:val="ae"/>
                 <w:noProof/>
               </w:rPr>
-              <w:t>Список использованных источников</w:t>
+              <w:t>1.6. Модульное тестирование</w:t>
             </w:r>
             <w:r>
               <w:rPr>
@@ -1637,7 +1552,7 @@
                 <w:noProof/>
                 <w:webHidden/>
               </w:rPr>
-              <w:instrText xml:space="preserve"> PAGEREF _Toc228293286 \h </w:instrText>
+              <w:instrText xml:space="preserve"> PAGEREF _Toc229514668 \h </w:instrText>
             </w:r>
             <w:r>
               <w:rPr>
@@ -1657,7 +1572,7 @@
                 <w:noProof/>
                 <w:webHidden/>
               </w:rPr>
-              <w:t>20</w:t>
+              <w:t>19</w:t>
             </w:r>
             <w:r>
               <w:rPr>
@@ -1671,10 +1586,6 @@
         <w:p>
           <w:pPr>
             <w:pStyle w:val="11"/>
-            <w:tabs>
-              <w:tab w:val="right" w:leader="dot" w:pos="9345"/>
-            </w:tabs>
-            <w:ind w:firstLine="0"/>
             <w:rPr>
               <w:rFonts w:asciiTheme="minorHAnsi" w:eastAsiaTheme="minorEastAsia" w:hAnsiTheme="minorHAnsi" w:cstheme="minorBidi"/>
               <w:noProof/>
@@ -1683,7 +1594,76 @@
               <w:lang w:eastAsia="ru-RU"/>
             </w:rPr>
           </w:pPr>
-          <w:hyperlink w:anchor="_Toc228293287" w:history="1">
+          <w:hyperlink w:anchor="_Toc229514669" w:history="1">
+            <w:r>
+              <w:rPr>
+                <w:rStyle w:val="ae"/>
+                <w:noProof/>
+              </w:rPr>
+              <w:t>Список использованных источников</w:t>
+            </w:r>
+            <w:r>
+              <w:rPr>
+                <w:noProof/>
+                <w:webHidden/>
+              </w:rPr>
+              <w:tab/>
+            </w:r>
+            <w:r>
+              <w:rPr>
+                <w:noProof/>
+                <w:webHidden/>
+              </w:rPr>
+              <w:fldChar w:fldCharType="begin"/>
+            </w:r>
+            <w:r>
+              <w:rPr>
+                <w:noProof/>
+                <w:webHidden/>
+              </w:rPr>
+              <w:instrText xml:space="preserve"> PAGEREF _Toc229514669 \h </w:instrText>
+            </w:r>
+            <w:r>
+              <w:rPr>
+                <w:noProof/>
+                <w:webHidden/>
+              </w:rPr>
+            </w:r>
+            <w:r>
+              <w:rPr>
+                <w:noProof/>
+                <w:webHidden/>
+              </w:rPr>
+              <w:fldChar w:fldCharType="separate"/>
+            </w:r>
+            <w:r>
+              <w:rPr>
+                <w:noProof/>
+                <w:webHidden/>
+              </w:rPr>
+              <w:t>20</w:t>
+            </w:r>
+            <w:r>
+              <w:rPr>
+                <w:noProof/>
+                <w:webHidden/>
+              </w:rPr>
+              <w:fldChar w:fldCharType="end"/>
+            </w:r>
+          </w:hyperlink>
+        </w:p>
+        <w:p>
+          <w:pPr>
+            <w:pStyle w:val="11"/>
+            <w:rPr>
+              <w:rFonts w:asciiTheme="minorHAnsi" w:eastAsiaTheme="minorEastAsia" w:hAnsiTheme="minorHAnsi" w:cstheme="minorBidi"/>
+              <w:noProof/>
+              <w:sz w:val="22"/>
+              <w:szCs w:val="22"/>
+              <w:lang w:eastAsia="ru-RU"/>
+            </w:rPr>
+          </w:pPr>
+          <w:hyperlink w:anchor="_Toc229514670" w:history="1">
             <w:r>
               <w:rPr>
                 <w:rStyle w:val="ae"/>
@@ -1713,7 +1693,7 @@
                 <w:noProof/>
                 <w:webHidden/>
               </w:rPr>
-              <w:instrText xml:space="preserve"> PAGEREF _Toc228293287 \h </w:instrText>
+              <w:instrText xml:space="preserve"> PAGEREF _Toc229514670 \h </w:instrText>
             </w:r>
             <w:r>
               <w:rPr>
@@ -1780,7 +1760,7 @@
       <w:pPr>
         <w:pStyle w:val="1"/>
       </w:pPr>
-      <w:bookmarkStart w:id="0" w:name="_Toc228293274"/>
+      <w:bookmarkStart w:id="0" w:name="_Toc229514656"/>
       <w:r>
         <w:lastRenderedPageBreak/>
         <w:t>Введение</w:t>
@@ -1801,21 +1781,7 @@
         <w:rPr>
           <w:szCs w:val="28"/>
         </w:rPr>
-        <w:t xml:space="preserve">Разработка программного обеспечения представляет собой сложный </w:t>
-      </w:r>
-      <w:proofErr w:type="spellStart"/>
-      <w:r>
-        <w:rPr>
-          <w:szCs w:val="28"/>
-        </w:rPr>
-        <w:t>многоитерационный</w:t>
-      </w:r>
-      <w:proofErr w:type="spellEnd"/>
-      <w:r>
-        <w:rPr>
-          <w:szCs w:val="28"/>
-        </w:rPr>
-        <w:t xml:space="preserve"> процесс, который не может обойтись без этапа документирования. Согласно учебному пособию</w:t>
+        <w:t>Разработка программного обеспечения представляет собой сложный многоитерационный процесс, который не может обойтись без этапа документирования. Согласно учебному пособию</w:t>
       </w:r>
       <w:r>
         <w:rPr>
@@ -2045,7 +2011,6 @@
           <w:iCs/>
         </w:rPr>
       </w:pPr>
-      <w:proofErr w:type="spellStart"/>
       <w:r>
         <w:rPr>
           <w:i w:val="0"/>
@@ -2061,69 +2026,27 @@
         </w:rPr>
         <w:t>дение</w:t>
       </w:r>
-      <w:proofErr w:type="spellEnd"/>
       <w:r>
         <w:rPr>
           <w:i w:val="0"/>
           <w:iCs/>
         </w:rPr>
-        <w:t xml:space="preserve"> </w:t>
-      </w:r>
-      <w:proofErr w:type="spellStart"/>
+        <w:t xml:space="preserve"> дерев</w:t>
+      </w:r>
       <w:r>
         <w:rPr>
           <w:i w:val="0"/>
           <w:iCs/>
-        </w:rPr>
-        <w:t>дерев</w:t>
-      </w:r>
-      <w:proofErr w:type="spellEnd"/>
+          <w:lang w:val="ru-RU"/>
+        </w:rPr>
+        <w:t>а</w:t>
+      </w:r>
       <w:r>
         <w:rPr>
           <w:i w:val="0"/>
           <w:iCs/>
-          <w:lang w:val="ru-RU"/>
-        </w:rPr>
-        <w:t>а</w:t>
-      </w:r>
-      <w:r>
-        <w:rPr>
-          <w:i w:val="0"/>
-          <w:iCs/>
-        </w:rPr>
-        <w:t xml:space="preserve"> </w:t>
-      </w:r>
-      <w:proofErr w:type="spellStart"/>
-      <w:r>
-        <w:rPr>
-          <w:i w:val="0"/>
-          <w:iCs/>
-        </w:rPr>
-        <w:t>ветвлений</w:t>
-      </w:r>
-      <w:proofErr w:type="spellEnd"/>
-      <w:r>
-        <w:rPr>
-          <w:i w:val="0"/>
-          <w:iCs/>
-        </w:rPr>
-        <w:t xml:space="preserve"> </w:t>
-      </w:r>
-      <w:proofErr w:type="spellStart"/>
-      <w:r>
-        <w:rPr>
-          <w:i w:val="0"/>
-          <w:iCs/>
-        </w:rPr>
-        <w:t>Git</w:t>
-      </w:r>
-      <w:proofErr w:type="spellEnd"/>
-      <w:r>
-        <w:rPr>
-          <w:i w:val="0"/>
-          <w:iCs/>
-        </w:rPr>
-        <w:t>;</w:t>
+        </w:rPr>
+        <w:t xml:space="preserve"> ветвлений Git;</w:t>
       </w:r>
     </w:p>
     <w:p>
@@ -2140,7 +2063,6 @@
           <w:iCs/>
         </w:rPr>
       </w:pPr>
-      <w:proofErr w:type="spellStart"/>
       <w:r>
         <w:rPr>
           <w:i w:val="0"/>
@@ -2156,53 +2078,27 @@
         </w:rPr>
         <w:t>дение</w:t>
       </w:r>
-      <w:proofErr w:type="spellEnd"/>
       <w:r>
         <w:rPr>
           <w:i w:val="0"/>
           <w:iCs/>
         </w:rPr>
-        <w:t xml:space="preserve"> </w:t>
-      </w:r>
-      <w:proofErr w:type="spellStart"/>
+        <w:t xml:space="preserve"> тестировани</w:t>
+      </w:r>
       <w:r>
         <w:rPr>
           <w:i w:val="0"/>
           <w:iCs/>
-        </w:rPr>
-        <w:t>тестировани</w:t>
-      </w:r>
-      <w:proofErr w:type="spellEnd"/>
+          <w:lang w:val="ru-RU"/>
+        </w:rPr>
+        <w:t>я</w:t>
+      </w:r>
       <w:r>
         <w:rPr>
           <w:i w:val="0"/>
           <w:iCs/>
-          <w:lang w:val="ru-RU"/>
-        </w:rPr>
-        <w:t>я</w:t>
-      </w:r>
-      <w:r>
-        <w:rPr>
-          <w:i w:val="0"/>
-          <w:iCs/>
-        </w:rPr>
-        <w:t xml:space="preserve"> </w:t>
-      </w:r>
-      <w:proofErr w:type="spellStart"/>
-      <w:r>
-        <w:rPr>
-          <w:i w:val="0"/>
-          <w:iCs/>
-        </w:rPr>
-        <w:t>программы</w:t>
-      </w:r>
-      <w:proofErr w:type="spellEnd"/>
-      <w:r>
-        <w:rPr>
-          <w:i w:val="0"/>
-          <w:iCs/>
-        </w:rPr>
-        <w:t>.</w:t>
+        </w:rPr>
+        <w:t xml:space="preserve"> программы.</w:t>
       </w:r>
     </w:p>
     <w:p>
@@ -2268,7 +2164,7 @@
           <w:numId w:val="2"/>
         </w:numPr>
       </w:pPr>
-      <w:bookmarkStart w:id="1" w:name="_Toc228293275"/>
+      <w:bookmarkStart w:id="1" w:name="_Toc229514657"/>
       <w:r>
         <w:lastRenderedPageBreak/>
         <w:t>Основная часть</w:t>
@@ -2283,7 +2179,7 @@
           <w:numId w:val="2"/>
         </w:numPr>
       </w:pPr>
-      <w:bookmarkStart w:id="2" w:name="_Toc228293276"/>
+      <w:bookmarkStart w:id="2" w:name="_Toc229514658"/>
       <w:r>
         <w:rPr>
           <w:lang w:val="en-GB"/>
@@ -2305,23 +2201,7 @@
         </w:rPr>
       </w:pPr>
       <w:r>
-        <w:t>Вариант использования (</w:t>
-      </w:r>
-      <w:proofErr w:type="spellStart"/>
-      <w:r>
-        <w:t>use</w:t>
-      </w:r>
-      <w:proofErr w:type="spellEnd"/>
-      <w:r>
-        <w:t xml:space="preserve"> </w:t>
-      </w:r>
-      <w:proofErr w:type="spellStart"/>
-      <w:r>
-        <w:t>case</w:t>
-      </w:r>
-      <w:proofErr w:type="spellEnd"/>
-      <w:r>
-        <w:t>) – это описание множества последовательных действий (включая вариации), которые выполняются некоторым субъектом с целью получения результата, значимого для некоторого действующего лица. Вариант использования предполагает взаимодействие действующих лиц и системы или другого объекта. Действующее лицо представляет собой логически связанное множество ролей, которые играют пользователи системы во время взаимодействия с ней [1].</w:t>
+        <w:t>Вариант использования (use case) – это описание множества последовательных действий (включая вариации), которые выполняются некоторым субъектом с целью получения результата, значимого для некоторого действующего лица. Вариант использования предполагает взаимодействие действующих лиц и системы или другого объекта. Действующее лицо представляет собой логически связанное множество ролей, которые играют пользователи системы во время взаимодействия с ней [1].</w:t>
       </w:r>
     </w:p>
     <w:p>
@@ -2411,7 +2291,7 @@
       <w:pPr>
         <w:pStyle w:val="1"/>
       </w:pPr>
-      <w:bookmarkStart w:id="3" w:name="_Toc228293277"/>
+      <w:bookmarkStart w:id="3" w:name="_Toc229514659"/>
       <w:r>
         <w:lastRenderedPageBreak/>
         <w:t>1.2</w:t>
@@ -2551,7 +2431,7 @@
       <w:pPr>
         <w:pStyle w:val="1"/>
       </w:pPr>
-      <w:bookmarkStart w:id="4" w:name="_Toc228293278"/>
+      <w:bookmarkStart w:id="4" w:name="_Toc229514660"/>
       <w:r>
         <w:lastRenderedPageBreak/>
         <w:t>1.3</w:t>
@@ -2662,314 +2542,246 @@
           <w:szCs w:val="28"/>
           <w:lang w:val="en-US"/>
         </w:rPr>
+        <w:t xml:space="preserve"> MotionBase, OscillatoryMotion, </w:t>
+      </w:r>
+      <w:r>
+        <w:rPr>
+          <w:iCs/>
+          <w:szCs w:val="28"/>
+          <w:lang w:val="en-US"/>
+        </w:rPr>
+        <w:t>UniformlyAcceleratedMotion, UniformMotion</w:t>
+      </w:r>
+      <w:r>
+        <w:rPr>
+          <w:iCs/>
+          <w:szCs w:val="28"/>
+          <w:lang w:val="en-US"/>
+        </w:rPr>
+        <w:t xml:space="preserve">. </w:t>
+      </w:r>
+    </w:p>
+    <w:p>
+      <w:pPr>
+        <w:rPr>
+          <w:iCs/>
+          <w:szCs w:val="28"/>
+        </w:rPr>
+      </w:pPr>
+      <w:r>
+        <w:rPr>
+          <w:iCs/>
+          <w:szCs w:val="28"/>
+        </w:rPr>
+        <w:t xml:space="preserve">Класс </w:t>
+      </w:r>
+      <w:r>
+        <w:rPr>
+          <w:iCs/>
+          <w:szCs w:val="28"/>
+        </w:rPr>
+        <w:t>MotionBase</w:t>
+      </w:r>
+      <w:r>
+        <w:rPr>
+          <w:iCs/>
+          <w:szCs w:val="28"/>
+        </w:rPr>
         <w:t xml:space="preserve"> </w:t>
       </w:r>
-      <w:proofErr w:type="spellStart"/>
-      <w:r>
-        <w:rPr>
+      <w:r>
+        <w:rPr>
+          <w:iCs/>
+          <w:szCs w:val="28"/>
+        </w:rPr>
+        <w:t>является абстрактным базовым классом и определяет общ</w:t>
+      </w:r>
+      <w:r>
+        <w:rPr>
+          <w:iCs/>
+          <w:szCs w:val="28"/>
+        </w:rPr>
+        <w:t>ие свойства и методы движений.</w:t>
+      </w:r>
+      <w:r>
+        <w:rPr>
+          <w:iCs/>
+          <w:szCs w:val="28"/>
+        </w:rPr>
+        <w:t xml:space="preserve"> </w:t>
+      </w:r>
+      <w:r>
+        <w:rPr>
+          <w:iCs/>
+          <w:szCs w:val="28"/>
+        </w:rPr>
+        <w:t xml:space="preserve">Классы </w:t>
+      </w:r>
+      <w:r>
+        <w:rPr>
+          <w:iCs/>
+          <w:szCs w:val="28"/>
+        </w:rPr>
+        <w:t>OscillatoryMotion</w:t>
+      </w:r>
+      <w:r>
+        <w:rPr>
+          <w:iCs/>
+          <w:szCs w:val="28"/>
+        </w:rPr>
+        <w:t xml:space="preserve">, </w:t>
+      </w:r>
+      <w:r>
+        <w:rPr>
+          <w:iCs/>
+          <w:szCs w:val="28"/>
+        </w:rPr>
+        <w:t>UniformlyAcceleratedMotion</w:t>
+      </w:r>
+      <w:r>
+        <w:rPr>
+          <w:iCs/>
+          <w:szCs w:val="28"/>
+        </w:rPr>
+        <w:t xml:space="preserve">, </w:t>
+      </w:r>
+      <w:r>
+        <w:rPr>
+          <w:iCs/>
+          <w:szCs w:val="28"/>
+        </w:rPr>
+        <w:t>UniformMotion</w:t>
+      </w:r>
+      <w:r>
+        <w:rPr>
+          <w:iCs/>
+          <w:szCs w:val="28"/>
+        </w:rPr>
+        <w:t xml:space="preserve"> </w:t>
+      </w:r>
+      <w:r>
+        <w:rPr>
+          <w:iCs/>
+          <w:szCs w:val="28"/>
+        </w:rPr>
+        <w:t xml:space="preserve">являются производными и наследуются от класса </w:t>
+      </w:r>
+      <w:r>
+        <w:rPr>
+          <w:iCs/>
+          <w:szCs w:val="28"/>
+        </w:rPr>
+        <w:t>MotionBase</w:t>
+      </w:r>
+      <w:r>
+        <w:rPr>
+          <w:iCs/>
+          <w:szCs w:val="28"/>
+        </w:rPr>
+        <w:t>,</w:t>
+      </w:r>
+      <w:r>
+        <w:rPr>
+          <w:szCs w:val="28"/>
+        </w:rPr>
+        <w:t xml:space="preserve"> </w:t>
+      </w:r>
+      <w:r>
+        <w:rPr>
+          <w:iCs/>
+          <w:szCs w:val="28"/>
+        </w:rPr>
+        <w:t>ре</w:t>
+      </w:r>
+      <w:r>
+        <w:rPr>
+          <w:iCs/>
+          <w:szCs w:val="28"/>
+        </w:rPr>
+        <w:t xml:space="preserve">ализуя расчет координаты </w:t>
+      </w:r>
+      <w:r>
+        <w:rPr>
+          <w:iCs/>
+          <w:szCs w:val="28"/>
+        </w:rPr>
+        <w:t>для со</w:t>
+      </w:r>
+      <w:r>
+        <w:rPr>
+          <w:iCs/>
+          <w:szCs w:val="28"/>
+        </w:rPr>
+        <w:t>от</w:t>
+      </w:r>
+      <w:r>
+        <w:rPr>
+          <w:iCs/>
+          <w:szCs w:val="28"/>
+        </w:rPr>
+        <w:t>вет</w:t>
+      </w:r>
+      <w:r>
+        <w:rPr>
+          <w:iCs/>
+          <w:szCs w:val="28"/>
+        </w:rPr>
+        <w:t>ств</w:t>
+      </w:r>
+      <w:r>
+        <w:rPr>
+          <w:iCs/>
+          <w:szCs w:val="28"/>
+        </w:rPr>
+        <w:t>ующего вида движения</w:t>
+      </w:r>
+      <w:r>
+        <w:rPr>
+          <w:iCs/>
+          <w:szCs w:val="28"/>
+        </w:rPr>
+        <w:t>.</w:t>
+      </w:r>
+    </w:p>
+    <w:p>
+      <w:pPr>
+        <w:ind w:firstLine="0"/>
+        <w:rPr>
+          <w:i/>
           <w:iCs/>
           <w:szCs w:val="28"/>
           <w:lang w:val="en-US"/>
         </w:rPr>
+      </w:pPr>
+      <w:r>
+        <w:rPr>
+          <w:iCs/>
+          <w:szCs w:val="28"/>
+        </w:rPr>
+        <w:t xml:space="preserve">Таблица </w:t>
+      </w:r>
+      <w:r>
+        <w:rPr>
+          <w:iCs/>
+          <w:szCs w:val="28"/>
+        </w:rPr>
+        <w:t>1</w:t>
+      </w:r>
+      <w:r>
+        <w:rPr>
+          <w:iCs/>
+          <w:szCs w:val="28"/>
+        </w:rPr>
+        <w:t xml:space="preserve"> – Описание класса </w:t>
+      </w:r>
+      <w:r>
+        <w:rPr>
+          <w:iCs/>
+          <w:szCs w:val="28"/>
+          <w:lang w:val="en-US"/>
+        </w:rPr>
         <w:t>MotionBase</w:t>
       </w:r>
-      <w:proofErr w:type="spellEnd"/>
-      <w:r>
-        <w:rPr>
-          <w:iCs/>
-          <w:szCs w:val="28"/>
-          <w:lang w:val="en-US"/>
-        </w:rPr>
-        <w:t xml:space="preserve">, </w:t>
-      </w:r>
-      <w:proofErr w:type="spellStart"/>
-      <w:r>
-        <w:rPr>
-          <w:iCs/>
-          <w:szCs w:val="28"/>
-          <w:lang w:val="en-US"/>
-        </w:rPr>
-        <w:t>OscillatoryMotion</w:t>
-      </w:r>
-      <w:proofErr w:type="spellEnd"/>
-      <w:r>
-        <w:rPr>
-          <w:iCs/>
-          <w:szCs w:val="28"/>
-          <w:lang w:val="en-US"/>
-        </w:rPr>
-        <w:t xml:space="preserve">, </w:t>
-      </w:r>
-      <w:proofErr w:type="spellStart"/>
-      <w:r>
-        <w:rPr>
-          <w:iCs/>
-          <w:szCs w:val="28"/>
-          <w:lang w:val="en-US"/>
-        </w:rPr>
-        <w:t>UniformlyAcceleratedMotion</w:t>
-      </w:r>
-      <w:proofErr w:type="spellEnd"/>
-      <w:r>
-        <w:rPr>
-          <w:iCs/>
-          <w:szCs w:val="28"/>
-          <w:lang w:val="en-US"/>
-        </w:rPr>
-        <w:t xml:space="preserve">, </w:t>
-      </w:r>
-      <w:proofErr w:type="spellStart"/>
-      <w:r>
-        <w:rPr>
-          <w:iCs/>
-          <w:szCs w:val="28"/>
-          <w:lang w:val="en-US"/>
-        </w:rPr>
-        <w:t>UniformMotion</w:t>
-      </w:r>
-      <w:proofErr w:type="spellEnd"/>
-      <w:r>
-        <w:rPr>
-          <w:iCs/>
-          <w:szCs w:val="28"/>
-          <w:lang w:val="en-US"/>
-        </w:rPr>
-        <w:t xml:space="preserve">. </w:t>
-      </w:r>
-    </w:p>
-    <w:p>
-      <w:pPr>
-        <w:rPr>
-          <w:iCs/>
-          <w:szCs w:val="28"/>
-        </w:rPr>
-      </w:pPr>
-      <w:r>
-        <w:rPr>
-          <w:iCs/>
-          <w:szCs w:val="28"/>
-        </w:rPr>
-        <w:t xml:space="preserve">Класс </w:t>
-      </w:r>
-      <w:proofErr w:type="spellStart"/>
-      <w:r>
-        <w:rPr>
-          <w:iCs/>
-          <w:szCs w:val="28"/>
-        </w:rPr>
-        <w:t>MotionBase</w:t>
-      </w:r>
-      <w:proofErr w:type="spellEnd"/>
-      <w:r>
-        <w:rPr>
-          <w:iCs/>
-          <w:szCs w:val="28"/>
-        </w:rPr>
-        <w:t xml:space="preserve"> </w:t>
-      </w:r>
-      <w:r>
-        <w:rPr>
-          <w:iCs/>
-          <w:szCs w:val="28"/>
-        </w:rPr>
-        <w:t>является абстрактным базовым классом и определяет общ</w:t>
-      </w:r>
-      <w:r>
-        <w:rPr>
-          <w:iCs/>
-          <w:szCs w:val="28"/>
-        </w:rPr>
-        <w:t>ие свойства и методы движений.</w:t>
-      </w:r>
-      <w:r>
-        <w:rPr>
-          <w:iCs/>
-          <w:szCs w:val="28"/>
-        </w:rPr>
-        <w:t xml:space="preserve"> </w:t>
-      </w:r>
-      <w:r>
-        <w:rPr>
-          <w:iCs/>
-          <w:szCs w:val="28"/>
-        </w:rPr>
-        <w:t xml:space="preserve">Классы </w:t>
-      </w:r>
-      <w:proofErr w:type="spellStart"/>
-      <w:r>
-        <w:rPr>
-          <w:iCs/>
-          <w:szCs w:val="28"/>
-        </w:rPr>
-        <w:t>OscillatoryMotion</w:t>
-      </w:r>
-      <w:proofErr w:type="spellEnd"/>
-      <w:r>
-        <w:rPr>
-          <w:iCs/>
-          <w:szCs w:val="28"/>
-        </w:rPr>
-        <w:t xml:space="preserve">, </w:t>
-      </w:r>
-      <w:proofErr w:type="spellStart"/>
-      <w:r>
-        <w:rPr>
-          <w:iCs/>
-          <w:szCs w:val="28"/>
-        </w:rPr>
-        <w:t>UniformlyAcceleratedMotion</w:t>
-      </w:r>
-      <w:proofErr w:type="spellEnd"/>
-      <w:r>
-        <w:rPr>
-          <w:iCs/>
-          <w:szCs w:val="28"/>
-        </w:rPr>
-        <w:t xml:space="preserve">, </w:t>
-      </w:r>
-      <w:proofErr w:type="spellStart"/>
-      <w:r>
-        <w:rPr>
-          <w:iCs/>
-          <w:szCs w:val="28"/>
-        </w:rPr>
-        <w:t>UniformMotion</w:t>
-      </w:r>
-      <w:proofErr w:type="spellEnd"/>
-      <w:r>
-        <w:rPr>
-          <w:iCs/>
-          <w:szCs w:val="28"/>
-        </w:rPr>
-        <w:t xml:space="preserve"> </w:t>
-      </w:r>
-      <w:r>
-        <w:rPr>
-          <w:iCs/>
-          <w:szCs w:val="28"/>
-        </w:rPr>
-        <w:t xml:space="preserve">являются производными и наследуются от класса </w:t>
-      </w:r>
-      <w:proofErr w:type="spellStart"/>
-      <w:r>
-        <w:rPr>
-          <w:iCs/>
-          <w:szCs w:val="28"/>
-        </w:rPr>
-        <w:t>MotionBase</w:t>
-      </w:r>
-      <w:proofErr w:type="spellEnd"/>
-      <w:r>
-        <w:rPr>
-          <w:iCs/>
-          <w:szCs w:val="28"/>
-        </w:rPr>
-        <w:t>,</w:t>
-      </w:r>
-      <w:r>
-        <w:rPr>
-          <w:szCs w:val="28"/>
-        </w:rPr>
-        <w:t xml:space="preserve"> </w:t>
-      </w:r>
-      <w:r>
-        <w:rPr>
-          <w:iCs/>
-          <w:szCs w:val="28"/>
-        </w:rPr>
-        <w:t>ре</w:t>
-      </w:r>
-      <w:r>
-        <w:rPr>
-          <w:iCs/>
-          <w:szCs w:val="28"/>
-        </w:rPr>
-        <w:t xml:space="preserve">ализуя расчет координаты </w:t>
-      </w:r>
-      <w:r>
-        <w:rPr>
-          <w:iCs/>
-          <w:szCs w:val="28"/>
-        </w:rPr>
-        <w:t>для со</w:t>
-      </w:r>
-      <w:r>
-        <w:rPr>
-          <w:iCs/>
-          <w:szCs w:val="28"/>
-        </w:rPr>
-        <w:t>от</w:t>
-      </w:r>
-      <w:r>
-        <w:rPr>
-          <w:iCs/>
-          <w:szCs w:val="28"/>
-        </w:rPr>
-        <w:t>вет</w:t>
-      </w:r>
-      <w:r>
-        <w:rPr>
-          <w:iCs/>
-          <w:szCs w:val="28"/>
-        </w:rPr>
-        <w:t>ств</w:t>
-      </w:r>
-      <w:r>
-        <w:rPr>
-          <w:iCs/>
-          <w:szCs w:val="28"/>
-        </w:rPr>
-        <w:t>ующего вида движения</w:t>
-      </w:r>
-      <w:r>
-        <w:rPr>
-          <w:iCs/>
-          <w:szCs w:val="28"/>
-        </w:rPr>
-        <w:t>.</w:t>
-      </w:r>
-    </w:p>
-    <w:p>
-      <w:pPr>
-        <w:ind w:firstLine="0"/>
-        <w:rPr>
-          <w:i/>
-          <w:iCs/>
-          <w:szCs w:val="28"/>
-          <w:lang w:val="en-US"/>
-        </w:rPr>
-      </w:pPr>
-      <w:r>
-        <w:rPr>
-          <w:iCs/>
-          <w:szCs w:val="28"/>
-        </w:rPr>
-        <w:t xml:space="preserve">Таблица </w:t>
-      </w:r>
-      <w:r>
-        <w:rPr>
-          <w:iCs/>
-          <w:szCs w:val="28"/>
-        </w:rPr>
-        <w:t>1</w:t>
-      </w:r>
-      <w:r>
-        <w:rPr>
-          <w:iCs/>
-          <w:szCs w:val="28"/>
-        </w:rPr>
-        <w:t xml:space="preserve"> – Описание класса </w:t>
-      </w:r>
-      <w:proofErr w:type="spellStart"/>
-      <w:r>
-        <w:rPr>
-          <w:iCs/>
-          <w:szCs w:val="28"/>
-          <w:lang w:val="en-US"/>
-        </w:rPr>
-        <w:t>MotionBase</w:t>
-      </w:r>
-      <w:proofErr w:type="spellEnd"/>
     </w:p>
     <w:tbl>
       <w:tblPr>
@@ -3129,7 +2941,6 @@
                 <w:szCs w:val="28"/>
               </w:rPr>
             </w:pPr>
-            <w:proofErr w:type="spellStart"/>
             <w:r>
               <w:rPr>
                 <w:iCs/>
@@ -3138,7 +2949,6 @@
               </w:rPr>
               <w:t>MotionBase</w:t>
             </w:r>
-            <w:proofErr w:type="spellEnd"/>
             <w:r>
               <w:rPr>
                 <w:szCs w:val="28"/>
@@ -3303,23 +3113,13 @@
               </w:rPr>
               <w:t xml:space="preserve">+ </w:t>
             </w:r>
-            <w:proofErr w:type="spellStart"/>
             <w:r>
               <w:rPr>
                 <w:iCs/>
                 <w:szCs w:val="28"/>
                 <w:lang w:val="en-GB"/>
               </w:rPr>
-              <w:t>InitinalPosition</w:t>
-            </w:r>
-            <w:proofErr w:type="spellEnd"/>
-            <w:r>
-              <w:rPr>
-                <w:iCs/>
-                <w:szCs w:val="28"/>
-                <w:lang w:val="en-GB"/>
-              </w:rPr>
-              <w:t>()</w:t>
+              <w:t>InitinalPosition()</w:t>
             </w:r>
           </w:p>
         </w:tc>
@@ -3694,7 +3494,6 @@
               </w:rPr>
               <w:t xml:space="preserve">+ </w:t>
             </w:r>
-            <w:proofErr w:type="spellStart"/>
             <w:r>
               <w:rPr>
                 <w:iCs/>
@@ -3703,7 +3502,6 @@
               </w:rPr>
               <w:t>GetInfo</w:t>
             </w:r>
-            <w:proofErr w:type="spellEnd"/>
             <w:r>
               <w:rPr>
                 <w:iCs/>
@@ -3792,7 +3590,6 @@
               </w:rPr>
               <w:t xml:space="preserve">+ </w:t>
             </w:r>
-            <w:proofErr w:type="spellStart"/>
             <w:r>
               <w:rPr>
                 <w:iCs/>
@@ -3801,7 +3598,6 @@
               </w:rPr>
               <w:t>GetPosition</w:t>
             </w:r>
-            <w:proofErr w:type="spellEnd"/>
             <w:r>
               <w:rPr>
                 <w:iCs/>
@@ -3889,25 +3685,7 @@
                 <w:szCs w:val="28"/>
                 <w:lang w:val="en-US"/>
               </w:rPr>
-              <w:t xml:space="preserve"># </w:t>
-            </w:r>
-            <w:proofErr w:type="spellStart"/>
-            <w:r>
-              <w:rPr>
-                <w:iCs/>
-                <w:szCs w:val="28"/>
-                <w:lang w:val="en-US"/>
-              </w:rPr>
-              <w:t>ValidateParametrs</w:t>
-            </w:r>
-            <w:proofErr w:type="spellEnd"/>
-            <w:r>
-              <w:rPr>
-                <w:iCs/>
-                <w:szCs w:val="28"/>
-                <w:lang w:val="en-US"/>
-              </w:rPr>
-              <w:t>()</w:t>
+              <w:t># ValidateParametrs()</w:t>
             </w:r>
           </w:p>
         </w:tc>
@@ -4003,7 +3781,6 @@
         </w:rPr>
         <w:t xml:space="preserve"> – Описание класса </w:t>
       </w:r>
-      <w:proofErr w:type="spellStart"/>
       <w:r>
         <w:rPr>
           <w:iCs/>
@@ -4012,7 +3789,6 @@
         </w:rPr>
         <w:t>UniformlyAcceleratedMotion</w:t>
       </w:r>
-      <w:proofErr w:type="spellEnd"/>
     </w:p>
     <w:tbl>
       <w:tblPr>
@@ -4171,7 +3947,6 @@
                 <w:szCs w:val="28"/>
               </w:rPr>
             </w:pPr>
-            <w:proofErr w:type="spellStart"/>
             <w:r>
               <w:rPr>
                 <w:b/>
@@ -4181,7 +3956,6 @@
               </w:rPr>
               <w:t>UniformlyAcceleratedMotion</w:t>
             </w:r>
-            <w:proofErr w:type="spellEnd"/>
             <w:r>
               <w:rPr>
                 <w:szCs w:val="28"/>
@@ -4577,7 +4351,6 @@
               </w:rPr>
               <w:t xml:space="preserve">+ </w:t>
             </w:r>
-            <w:proofErr w:type="spellStart"/>
             <w:r>
               <w:rPr>
                 <w:iCs/>
@@ -4586,7 +4359,6 @@
               </w:rPr>
               <w:t>GetInfo</w:t>
             </w:r>
-            <w:proofErr w:type="spellEnd"/>
             <w:r>
               <w:rPr>
                 <w:iCs/>
@@ -4690,7 +4462,6 @@
               </w:rPr>
               <w:t xml:space="preserve">+ </w:t>
             </w:r>
-            <w:proofErr w:type="spellStart"/>
             <w:r>
               <w:rPr>
                 <w:iCs/>
@@ -4699,7 +4470,6 @@
               </w:rPr>
               <w:t>GetPosition</w:t>
             </w:r>
-            <w:proofErr w:type="spellEnd"/>
             <w:r>
               <w:rPr>
                 <w:iCs/>
@@ -4787,7 +4557,6 @@
               </w:rPr>
               <w:t xml:space="preserve">+ </w:t>
             </w:r>
-            <w:proofErr w:type="spellStart"/>
             <w:r>
               <w:rPr>
                 <w:iCs/>
@@ -4796,7 +4565,6 @@
               </w:rPr>
               <w:t>ValidateParametrs</w:t>
             </w:r>
-            <w:proofErr w:type="spellEnd"/>
             <w:r>
               <w:rPr>
                 <w:iCs/>
@@ -4899,7 +4667,6 @@
         </w:rPr>
         <w:t xml:space="preserve"> – Описание класса </w:t>
       </w:r>
-      <w:proofErr w:type="spellStart"/>
       <w:r>
         <w:rPr>
           <w:iCs/>
@@ -4908,7 +4675,6 @@
         </w:rPr>
         <w:t>UniformMotion</w:t>
       </w:r>
-      <w:proofErr w:type="spellEnd"/>
     </w:p>
     <w:tbl>
       <w:tblPr>
@@ -5068,7 +4834,6 @@
                 <w:szCs w:val="28"/>
               </w:rPr>
             </w:pPr>
-            <w:proofErr w:type="spellStart"/>
             <w:r>
               <w:rPr>
                 <w:iCs/>
@@ -5077,7 +4842,6 @@
               </w:rPr>
               <w:t>UniformMotion</w:t>
             </w:r>
-            <w:proofErr w:type="spellEnd"/>
             <w:r>
               <w:rPr>
                 <w:szCs w:val="28"/>
@@ -5378,7 +5142,6 @@
               </w:rPr>
               <w:t xml:space="preserve">+ </w:t>
             </w:r>
-            <w:proofErr w:type="spellStart"/>
             <w:r>
               <w:rPr>
                 <w:iCs/>
@@ -5387,7 +5150,6 @@
               </w:rPr>
               <w:t>GetPosition</w:t>
             </w:r>
-            <w:proofErr w:type="spellEnd"/>
             <w:r>
               <w:rPr>
                 <w:iCs/>
@@ -5476,7 +5238,6 @@
         </w:rPr>
         <w:t xml:space="preserve">Таблица 4 – Описание класса </w:t>
       </w:r>
-      <w:proofErr w:type="spellStart"/>
       <w:r>
         <w:rPr>
           <w:iCs/>
@@ -5485,7 +5246,6 @@
         </w:rPr>
         <w:t>OscillatoryMotion</w:t>
       </w:r>
-      <w:proofErr w:type="spellEnd"/>
     </w:p>
     <w:tbl>
       <w:tblPr>
@@ -5644,7 +5404,6 @@
                 <w:szCs w:val="28"/>
               </w:rPr>
             </w:pPr>
-            <w:proofErr w:type="spellStart"/>
             <w:r>
               <w:rPr>
                 <w:iCs/>
@@ -5653,7 +5412,6 @@
               </w:rPr>
               <w:t>OscillatoryMotion</w:t>
             </w:r>
-            <w:proofErr w:type="spellEnd"/>
             <w:r>
               <w:rPr>
                 <w:szCs w:val="28"/>
@@ -6040,7 +5798,6 @@
               </w:rPr>
               <w:t xml:space="preserve">+ </w:t>
             </w:r>
-            <w:proofErr w:type="spellStart"/>
             <w:r>
               <w:rPr>
                 <w:iCs/>
@@ -6049,7 +5806,6 @@
               </w:rPr>
               <w:t>GetPosition</w:t>
             </w:r>
-            <w:proofErr w:type="spellEnd"/>
             <w:r>
               <w:rPr>
                 <w:iCs/>
@@ -6146,7 +5902,6 @@
               </w:rPr>
               <w:t xml:space="preserve">+ </w:t>
             </w:r>
-            <w:proofErr w:type="spellStart"/>
             <w:r>
               <w:rPr>
                 <w:iCs/>
@@ -6155,7 +5910,6 @@
               </w:rPr>
               <w:t>GetInfo</w:t>
             </w:r>
-            <w:proofErr w:type="spellEnd"/>
             <w:r>
               <w:rPr>
                 <w:iCs/>
@@ -6258,7 +6012,6 @@
               </w:rPr>
               <w:t xml:space="preserve">+ </w:t>
             </w:r>
-            <w:proofErr w:type="spellStart"/>
             <w:r>
               <w:rPr>
                 <w:iCs/>
@@ -6267,7 +6020,6 @@
               </w:rPr>
               <w:t>ValidateParametrs</w:t>
             </w:r>
-            <w:proofErr w:type="spellEnd"/>
             <w:r>
               <w:rPr>
                 <w:iCs/>
@@ -6396,7 +6148,6 @@
         </w:rPr>
         <w:t xml:space="preserve">описания интерфейса </w:t>
       </w:r>
-      <w:proofErr w:type="spellStart"/>
       <w:r>
         <w:rPr>
           <w:iCs/>
@@ -6405,7 +6156,6 @@
         </w:rPr>
         <w:t>IMotionInput</w:t>
       </w:r>
-      <w:proofErr w:type="spellEnd"/>
       <w:r>
         <w:rPr>
           <w:iCs/>
@@ -6427,27 +6177,9 @@
         </w:rPr>
         <w:t xml:space="preserve">классов </w:t>
       </w:r>
-      <w:proofErr w:type="spellStart"/>
-      <w:r>
-        <w:t>UniformMotionControl</w:t>
-      </w:r>
-      <w:proofErr w:type="spellEnd"/>
-      <w:r>
-        <w:t xml:space="preserve">, </w:t>
-      </w:r>
-      <w:proofErr w:type="spellStart"/>
-      <w:r>
-        <w:t>AcceleratedMotionControl</w:t>
-      </w:r>
-      <w:proofErr w:type="spellEnd"/>
-      <w:r>
-        <w:t xml:space="preserve"> и </w:t>
-      </w:r>
-      <w:proofErr w:type="spellStart"/>
-      <w:r>
-        <w:t>OscillatoryMotionControl</w:t>
-      </w:r>
-      <w:proofErr w:type="spellEnd"/>
+      <w:r>
+        <w:t>UniformMotionControl, AcceleratedMotionControl и OscillatoryMotionControl</w:t>
+      </w:r>
       <w:r>
         <w:rPr>
           <w:iCs/>
@@ -6464,7 +6196,6 @@
         </w:rPr>
         <w:t xml:space="preserve">Интерфейс </w:t>
       </w:r>
-      <w:proofErr w:type="spellStart"/>
       <w:r>
         <w:rPr>
           <w:iCs/>
@@ -6473,7 +6204,6 @@
         </w:rPr>
         <w:t>IMotionInput</w:t>
       </w:r>
-      <w:proofErr w:type="spellEnd"/>
       <w:r>
         <w:rPr>
           <w:iCs/>
@@ -6482,31 +6212,7 @@
         <w:t xml:space="preserve"> реализует методы получения объекта движения. </w:t>
       </w:r>
       <w:r>
-        <w:t xml:space="preserve">Классы </w:t>
-      </w:r>
-      <w:proofErr w:type="spellStart"/>
-      <w:r>
-        <w:t>UniformMotionControl</w:t>
-      </w:r>
-      <w:proofErr w:type="spellEnd"/>
-      <w:r>
-        <w:t xml:space="preserve">, </w:t>
-      </w:r>
-      <w:proofErr w:type="spellStart"/>
-      <w:r>
-        <w:t>AcceleratedMotionControl</w:t>
-      </w:r>
-      <w:proofErr w:type="spellEnd"/>
-      <w:r>
-        <w:t xml:space="preserve"> и </w:t>
-      </w:r>
-      <w:proofErr w:type="spellStart"/>
-      <w:r>
-        <w:t>OscillatoryMotionControl</w:t>
-      </w:r>
-      <w:proofErr w:type="spellEnd"/>
-      <w:r>
-        <w:t xml:space="preserve"> реализуют этот интерфейс, предоставляя </w:t>
+        <w:t xml:space="preserve">Классы UniformMotionControl, AcceleratedMotionControl и OscillatoryMotionControl реализуют этот интерфейс, предоставляя </w:t>
       </w:r>
       <w:r>
         <w:t xml:space="preserve">возможность </w:t>
@@ -6542,7 +6248,6 @@
         </w:rPr>
         <w:t xml:space="preserve"> – Описание интерфейса </w:t>
       </w:r>
-      <w:proofErr w:type="spellStart"/>
       <w:r>
         <w:rPr>
           <w:iCs/>
@@ -6551,7 +6256,6 @@
         </w:rPr>
         <w:t>IMotionInput</w:t>
       </w:r>
-      <w:proofErr w:type="spellEnd"/>
     </w:p>
     <w:tbl>
       <w:tblPr>
@@ -6710,7 +6414,6 @@
                 <w:szCs w:val="28"/>
               </w:rPr>
             </w:pPr>
-            <w:proofErr w:type="spellStart"/>
             <w:r>
               <w:rPr>
                 <w:b/>
@@ -6720,7 +6423,6 @@
               </w:rPr>
               <w:t>IMotionInput</w:t>
             </w:r>
-            <w:proofErr w:type="spellEnd"/>
             <w:r>
               <w:rPr>
                 <w:szCs w:val="28"/>
@@ -6810,53 +6512,41 @@
               </w:rPr>
               <w:t xml:space="preserve">+ </w:t>
             </w:r>
-            <w:proofErr w:type="spellStart"/>
             <w:r>
               <w:rPr>
                 <w:iCs/>
                 <w:szCs w:val="28"/>
                 <w:lang w:val="en-US"/>
               </w:rPr>
-              <w:t>GetMotion</w:t>
-            </w:r>
-            <w:proofErr w:type="spellEnd"/>
-            <w:r>
-              <w:rPr>
+              <w:t>GetMotion()</w:t>
+            </w:r>
+          </w:p>
+        </w:tc>
+        <w:tc>
+          <w:tcPr>
+            <w:tcW w:w="1885" w:type="dxa"/>
+            <w:vAlign w:val="center"/>
+          </w:tcPr>
+          <w:p>
+            <w:pPr>
+              <w:spacing w:line="240" w:lineRule="auto"/>
+              <w:ind w:firstLine="0"/>
+              <w:jc w:val="center"/>
+              <w:rPr>
+                <w:i/>
                 <w:iCs/>
                 <w:szCs w:val="28"/>
                 <w:lang w:val="en-US"/>
               </w:rPr>
-              <w:t>()</w:t>
-            </w:r>
-          </w:p>
-        </w:tc>
-        <w:tc>
-          <w:tcPr>
-            <w:tcW w:w="1885" w:type="dxa"/>
-            <w:vAlign w:val="center"/>
-          </w:tcPr>
-          <w:p>
-            <w:pPr>
-              <w:spacing w:line="240" w:lineRule="auto"/>
-              <w:ind w:firstLine="0"/>
-              <w:jc w:val="center"/>
-              <w:rPr>
-                <w:i/>
+            </w:pPr>
+            <w:r>
+              <w:rPr>
                 <w:iCs/>
                 <w:szCs w:val="28"/>
                 <w:lang w:val="en-US"/>
               </w:rPr>
-            </w:pPr>
-            <w:proofErr w:type="spellStart"/>
-            <w:r>
-              <w:rPr>
-                <w:iCs/>
-                <w:szCs w:val="28"/>
-                <w:lang w:val="en-US"/>
-              </w:rPr>
               <w:t>MotionBase</w:t>
             </w:r>
-            <w:proofErr w:type="spellEnd"/>
           </w:p>
         </w:tc>
         <w:tc>
@@ -6912,23 +6602,13 @@
               </w:rPr>
               <w:t xml:space="preserve">+ </w:t>
             </w:r>
-            <w:proofErr w:type="spellStart"/>
             <w:r>
               <w:rPr>
                 <w:iCs/>
                 <w:szCs w:val="28"/>
                 <w:lang w:val="en-GB"/>
               </w:rPr>
-              <w:t>ValidateInput</w:t>
-            </w:r>
-            <w:proofErr w:type="spellEnd"/>
-            <w:r>
-              <w:rPr>
-                <w:iCs/>
-                <w:szCs w:val="28"/>
-                <w:lang w:val="en-GB"/>
-              </w:rPr>
-              <w:t>()</w:t>
+              <w:t>ValidateInput()</w:t>
             </w:r>
           </w:p>
         </w:tc>
@@ -7037,11 +6717,9 @@
         </w:rPr>
         <w:t xml:space="preserve"> – Описание класса </w:t>
       </w:r>
-      <w:proofErr w:type="spellStart"/>
       <w:r>
         <w:t>UniformMotionControl</w:t>
       </w:r>
-      <w:proofErr w:type="spellEnd"/>
     </w:p>
     <w:tbl>
       <w:tblPr>
@@ -7201,11 +6879,9 @@
                 <w:szCs w:val="28"/>
               </w:rPr>
             </w:pPr>
-            <w:proofErr w:type="spellStart"/>
             <w:r>
               <w:t>UniformMotionControl</w:t>
             </w:r>
-            <w:proofErr w:type="spellEnd"/>
             <w:r>
               <w:rPr>
                 <w:szCs w:val="28"/>
@@ -7232,7 +6908,6 @@
               </w:rPr>
               <w:t xml:space="preserve">, реализующий интерфейс </w:t>
             </w:r>
-            <w:proofErr w:type="spellStart"/>
             <w:r>
               <w:rPr>
                 <w:iCs/>
@@ -7241,7 +6916,6 @@
               </w:rPr>
               <w:t>IMotionInput</w:t>
             </w:r>
-            <w:proofErr w:type="spellEnd"/>
             <w:r>
               <w:rPr>
                 <w:iCs/>
@@ -7312,47 +6986,35 @@
                 <w:szCs w:val="28"/>
                 <w:lang w:val="en-US"/>
               </w:rPr>
-              <w:t>_</w:t>
-            </w:r>
-            <w:proofErr w:type="spellStart"/>
-            <w:r>
-              <w:rPr>
+              <w:t>_validateInitial</w:t>
+            </w:r>
+          </w:p>
+        </w:tc>
+        <w:tc>
+          <w:tcPr>
+            <w:tcW w:w="3115" w:type="dxa"/>
+            <w:vAlign w:val="center"/>
+          </w:tcPr>
+          <w:p>
+            <w:pPr>
+              <w:spacing w:line="240" w:lineRule="auto"/>
+              <w:ind w:firstLine="0"/>
+              <w:jc w:val="center"/>
+              <w:rPr>
+                <w:i/>
                 <w:iCs/>
                 <w:szCs w:val="28"/>
                 <w:lang w:val="en-US"/>
               </w:rPr>
-              <w:t>validateInitial</w:t>
-            </w:r>
-            <w:proofErr w:type="spellEnd"/>
-          </w:p>
-        </w:tc>
-        <w:tc>
-          <w:tcPr>
-            <w:tcW w:w="3115" w:type="dxa"/>
-            <w:vAlign w:val="center"/>
-          </w:tcPr>
-          <w:p>
-            <w:pPr>
-              <w:spacing w:line="240" w:lineRule="auto"/>
-              <w:ind w:firstLine="0"/>
-              <w:jc w:val="center"/>
-              <w:rPr>
-                <w:i/>
+            </w:pPr>
+            <w:r>
+              <w:rPr>
                 <w:iCs/>
                 <w:szCs w:val="28"/>
                 <w:lang w:val="en-US"/>
               </w:rPr>
-            </w:pPr>
-            <w:proofErr w:type="spellStart"/>
-            <w:r>
-              <w:rPr>
-                <w:iCs/>
-                <w:szCs w:val="28"/>
-                <w:lang w:val="en-US"/>
-              </w:rPr>
               <w:t>DoubleValidator</w:t>
             </w:r>
-            <w:proofErr w:type="spellEnd"/>
           </w:p>
         </w:tc>
         <w:tc>
@@ -7406,17 +7068,8 @@
                 <w:iCs/>
                 <w:szCs w:val="28"/>
               </w:rPr>
-              <w:t>_</w:t>
-            </w:r>
-            <w:proofErr w:type="spellStart"/>
-            <w:r>
-              <w:rPr>
-                <w:iCs/>
-                <w:szCs w:val="28"/>
-              </w:rPr>
-              <w:t>validateSpeed</w:t>
-            </w:r>
-            <w:proofErr w:type="spellEnd"/>
+              <w:t>_validateSpeed</w:t>
+            </w:r>
           </w:p>
         </w:tc>
         <w:tc>
@@ -7435,7 +7088,6 @@
                 <w:lang w:val="en-GB"/>
               </w:rPr>
             </w:pPr>
-            <w:proofErr w:type="spellStart"/>
             <w:r>
               <w:rPr>
                 <w:iCs/>
@@ -7444,7 +7096,6 @@
               </w:rPr>
               <w:t>DoubleValidator</w:t>
             </w:r>
-            <w:proofErr w:type="spellEnd"/>
           </w:p>
         </w:tc>
         <w:tc>
@@ -7499,47 +7150,35 @@
                 <w:szCs w:val="28"/>
                 <w:lang w:val="en-US"/>
               </w:rPr>
-              <w:t>_</w:t>
-            </w:r>
-            <w:proofErr w:type="spellStart"/>
-            <w:r>
-              <w:rPr>
+              <w:t>_validateTime</w:t>
+            </w:r>
+          </w:p>
+        </w:tc>
+        <w:tc>
+          <w:tcPr>
+            <w:tcW w:w="3115" w:type="dxa"/>
+            <w:vAlign w:val="center"/>
+          </w:tcPr>
+          <w:p>
+            <w:pPr>
+              <w:spacing w:line="240" w:lineRule="auto"/>
+              <w:ind w:firstLine="0"/>
+              <w:jc w:val="center"/>
+              <w:rPr>
+                <w:i/>
                 <w:iCs/>
                 <w:szCs w:val="28"/>
                 <w:lang w:val="en-US"/>
               </w:rPr>
-              <w:t>validateTime</w:t>
-            </w:r>
-            <w:proofErr w:type="spellEnd"/>
-          </w:p>
-        </w:tc>
-        <w:tc>
-          <w:tcPr>
-            <w:tcW w:w="3115" w:type="dxa"/>
-            <w:vAlign w:val="center"/>
-          </w:tcPr>
-          <w:p>
-            <w:pPr>
-              <w:spacing w:line="240" w:lineRule="auto"/>
-              <w:ind w:firstLine="0"/>
-              <w:jc w:val="center"/>
-              <w:rPr>
-                <w:i/>
+            </w:pPr>
+            <w:r>
+              <w:rPr>
                 <w:iCs/>
                 <w:szCs w:val="28"/>
                 <w:lang w:val="en-US"/>
               </w:rPr>
-            </w:pPr>
-            <w:proofErr w:type="spellStart"/>
-            <w:r>
-              <w:rPr>
-                <w:iCs/>
-                <w:szCs w:val="28"/>
-                <w:lang w:val="en-US"/>
-              </w:rPr>
               <w:t>DoubleValidator</w:t>
             </w:r>
-            <w:proofErr w:type="spellEnd"/>
           </w:p>
         </w:tc>
         <w:tc>
@@ -7635,53 +7274,41 @@
               </w:rPr>
               <w:t xml:space="preserve">+ </w:t>
             </w:r>
-            <w:proofErr w:type="spellStart"/>
             <w:r>
               <w:rPr>
                 <w:iCs/>
                 <w:szCs w:val="28"/>
                 <w:lang w:val="en-US"/>
               </w:rPr>
-              <w:t>GetMotion</w:t>
-            </w:r>
-            <w:proofErr w:type="spellEnd"/>
-            <w:r>
-              <w:rPr>
+              <w:t>GetMotion()</w:t>
+            </w:r>
+          </w:p>
+        </w:tc>
+        <w:tc>
+          <w:tcPr>
+            <w:tcW w:w="3115" w:type="dxa"/>
+            <w:vAlign w:val="center"/>
+          </w:tcPr>
+          <w:p>
+            <w:pPr>
+              <w:spacing w:line="240" w:lineRule="auto"/>
+              <w:ind w:firstLine="0"/>
+              <w:jc w:val="center"/>
+              <w:rPr>
+                <w:i/>
                 <w:iCs/>
                 <w:szCs w:val="28"/>
                 <w:lang w:val="en-US"/>
               </w:rPr>
-              <w:t>()</w:t>
-            </w:r>
-          </w:p>
-        </w:tc>
-        <w:tc>
-          <w:tcPr>
-            <w:tcW w:w="3115" w:type="dxa"/>
-            <w:vAlign w:val="center"/>
-          </w:tcPr>
-          <w:p>
-            <w:pPr>
-              <w:spacing w:line="240" w:lineRule="auto"/>
-              <w:ind w:firstLine="0"/>
-              <w:jc w:val="center"/>
-              <w:rPr>
-                <w:i/>
+            </w:pPr>
+            <w:r>
+              <w:rPr>
                 <w:iCs/>
                 <w:szCs w:val="28"/>
                 <w:lang w:val="en-US"/>
               </w:rPr>
-            </w:pPr>
-            <w:proofErr w:type="spellStart"/>
-            <w:r>
-              <w:rPr>
-                <w:iCs/>
-                <w:szCs w:val="28"/>
-                <w:lang w:val="en-US"/>
-              </w:rPr>
               <w:t>MotionBase</w:t>
             </w:r>
-            <w:proofErr w:type="spellEnd"/>
           </w:p>
         </w:tc>
         <w:tc>
@@ -7738,23 +7365,13 @@
               </w:rPr>
               <w:t xml:space="preserve">+ </w:t>
             </w:r>
-            <w:proofErr w:type="spellStart"/>
             <w:r>
               <w:rPr>
                 <w:iCs/>
                 <w:szCs w:val="28"/>
                 <w:lang w:val="en-GB"/>
               </w:rPr>
-              <w:t>ParseDouble</w:t>
-            </w:r>
-            <w:proofErr w:type="spellEnd"/>
-            <w:r>
-              <w:rPr>
-                <w:iCs/>
-                <w:szCs w:val="28"/>
-                <w:lang w:val="en-GB"/>
-              </w:rPr>
-              <w:t>(string)</w:t>
+              <w:t>ParseDouble(string)</w:t>
             </w:r>
           </w:p>
         </w:tc>
@@ -7853,23 +7470,13 @@
               <w:lastRenderedPageBreak/>
               <w:t xml:space="preserve">+ </w:t>
             </w:r>
-            <w:proofErr w:type="spellStart"/>
             <w:r>
               <w:rPr>
                 <w:iCs/>
                 <w:szCs w:val="28"/>
                 <w:lang w:val="en-GB"/>
               </w:rPr>
-              <w:t>ValidateInput</w:t>
-            </w:r>
-            <w:proofErr w:type="spellEnd"/>
-            <w:r>
-              <w:rPr>
-                <w:iCs/>
-                <w:szCs w:val="28"/>
-                <w:lang w:val="en-GB"/>
-              </w:rPr>
-              <w:t>()</w:t>
+              <w:t>ValidateInput()</w:t>
             </w:r>
           </w:p>
         </w:tc>
@@ -7978,11 +7585,9 @@
         </w:rPr>
         <w:t xml:space="preserve"> – Описание класса </w:t>
       </w:r>
-      <w:proofErr w:type="spellStart"/>
       <w:r>
         <w:t>OscillatoryMotionControl</w:t>
       </w:r>
-      <w:proofErr w:type="spellEnd"/>
     </w:p>
     <w:tbl>
       <w:tblPr>
@@ -8142,11 +7747,9 @@
                 <w:szCs w:val="28"/>
               </w:rPr>
             </w:pPr>
-            <w:proofErr w:type="spellStart"/>
             <w:r>
               <w:t>OscillatoryMotionControl</w:t>
             </w:r>
-            <w:proofErr w:type="spellEnd"/>
             <w:r>
               <w:rPr>
                 <w:szCs w:val="28"/>
@@ -8160,7 +7763,6 @@
               </w:rPr>
               <w:t xml:space="preserve">класс, реализующий интерфейс </w:t>
             </w:r>
-            <w:proofErr w:type="spellStart"/>
             <w:r>
               <w:rPr>
                 <w:iCs/>
@@ -8169,7 +7771,6 @@
               </w:rPr>
               <w:t>IMotionInput</w:t>
             </w:r>
-            <w:proofErr w:type="spellEnd"/>
             <w:r>
               <w:rPr>
                 <w:iCs/>
@@ -8240,47 +7841,35 @@
                 <w:szCs w:val="28"/>
                 <w:lang w:val="en-US"/>
               </w:rPr>
-              <w:t>_</w:t>
-            </w:r>
-            <w:proofErr w:type="spellStart"/>
-            <w:r>
-              <w:rPr>
+              <w:t>_validateInitial</w:t>
+            </w:r>
+          </w:p>
+        </w:tc>
+        <w:tc>
+          <w:tcPr>
+            <w:tcW w:w="3115" w:type="dxa"/>
+            <w:vAlign w:val="center"/>
+          </w:tcPr>
+          <w:p>
+            <w:pPr>
+              <w:spacing w:line="240" w:lineRule="auto"/>
+              <w:ind w:firstLine="0"/>
+              <w:jc w:val="center"/>
+              <w:rPr>
+                <w:i/>
                 <w:iCs/>
                 <w:szCs w:val="28"/>
                 <w:lang w:val="en-US"/>
               </w:rPr>
-              <w:t>validateInitial</w:t>
-            </w:r>
-            <w:proofErr w:type="spellEnd"/>
-          </w:p>
-        </w:tc>
-        <w:tc>
-          <w:tcPr>
-            <w:tcW w:w="3115" w:type="dxa"/>
-            <w:vAlign w:val="center"/>
-          </w:tcPr>
-          <w:p>
-            <w:pPr>
-              <w:spacing w:line="240" w:lineRule="auto"/>
-              <w:ind w:firstLine="0"/>
-              <w:jc w:val="center"/>
-              <w:rPr>
-                <w:i/>
+            </w:pPr>
+            <w:r>
+              <w:rPr>
                 <w:iCs/>
                 <w:szCs w:val="28"/>
                 <w:lang w:val="en-US"/>
               </w:rPr>
-            </w:pPr>
-            <w:proofErr w:type="spellStart"/>
-            <w:r>
-              <w:rPr>
-                <w:iCs/>
-                <w:szCs w:val="28"/>
-                <w:lang w:val="en-US"/>
-              </w:rPr>
               <w:t>DoubleValidator</w:t>
             </w:r>
-            <w:proofErr w:type="spellEnd"/>
           </w:p>
         </w:tc>
         <w:tc>
@@ -8334,17 +7923,8 @@
                 <w:iCs/>
                 <w:szCs w:val="28"/>
               </w:rPr>
-              <w:t>_</w:t>
-            </w:r>
-            <w:proofErr w:type="spellStart"/>
-            <w:r>
-              <w:rPr>
-                <w:iCs/>
-                <w:szCs w:val="28"/>
-              </w:rPr>
-              <w:t>validateSpeed</w:t>
-            </w:r>
-            <w:proofErr w:type="spellEnd"/>
+              <w:t>_validateSpeed</w:t>
+            </w:r>
           </w:p>
         </w:tc>
         <w:tc>
@@ -8363,7 +7943,6 @@
                 <w:lang w:val="en-GB"/>
               </w:rPr>
             </w:pPr>
-            <w:proofErr w:type="spellStart"/>
             <w:r>
               <w:rPr>
                 <w:iCs/>
@@ -8372,7 +7951,6 @@
               </w:rPr>
               <w:t>DoubleValidator</w:t>
             </w:r>
-            <w:proofErr w:type="spellEnd"/>
           </w:p>
         </w:tc>
         <w:tc>
@@ -8427,47 +8005,35 @@
                 <w:szCs w:val="28"/>
                 <w:lang w:val="en-US"/>
               </w:rPr>
-              <w:t>_</w:t>
-            </w:r>
-            <w:proofErr w:type="spellStart"/>
-            <w:r>
-              <w:rPr>
+              <w:t>_validateTime</w:t>
+            </w:r>
+          </w:p>
+        </w:tc>
+        <w:tc>
+          <w:tcPr>
+            <w:tcW w:w="3115" w:type="dxa"/>
+            <w:vAlign w:val="center"/>
+          </w:tcPr>
+          <w:p>
+            <w:pPr>
+              <w:spacing w:line="240" w:lineRule="auto"/>
+              <w:ind w:firstLine="0"/>
+              <w:jc w:val="center"/>
+              <w:rPr>
+                <w:i/>
                 <w:iCs/>
                 <w:szCs w:val="28"/>
                 <w:lang w:val="en-US"/>
               </w:rPr>
-              <w:t>validateTime</w:t>
-            </w:r>
-            <w:proofErr w:type="spellEnd"/>
-          </w:p>
-        </w:tc>
-        <w:tc>
-          <w:tcPr>
-            <w:tcW w:w="3115" w:type="dxa"/>
-            <w:vAlign w:val="center"/>
-          </w:tcPr>
-          <w:p>
-            <w:pPr>
-              <w:spacing w:line="240" w:lineRule="auto"/>
-              <w:ind w:firstLine="0"/>
-              <w:jc w:val="center"/>
-              <w:rPr>
-                <w:i/>
+            </w:pPr>
+            <w:r>
+              <w:rPr>
                 <w:iCs/>
                 <w:szCs w:val="28"/>
                 <w:lang w:val="en-US"/>
               </w:rPr>
-            </w:pPr>
-            <w:proofErr w:type="spellStart"/>
-            <w:r>
-              <w:rPr>
-                <w:iCs/>
-                <w:szCs w:val="28"/>
-                <w:lang w:val="en-US"/>
-              </w:rPr>
               <w:t>DoubleValidator</w:t>
             </w:r>
-            <w:proofErr w:type="spellEnd"/>
           </w:p>
         </w:tc>
         <w:tc>
@@ -8522,46 +8088,34 @@
                 <w:szCs w:val="28"/>
                 <w:lang w:val="en-US"/>
               </w:rPr>
-              <w:t>_</w:t>
-            </w:r>
-            <w:proofErr w:type="spellStart"/>
-            <w:r>
+              <w:t>_validateFrequency</w:t>
+            </w:r>
+          </w:p>
+        </w:tc>
+        <w:tc>
+          <w:tcPr>
+            <w:tcW w:w="3115" w:type="dxa"/>
+            <w:vAlign w:val="center"/>
+          </w:tcPr>
+          <w:p>
+            <w:pPr>
+              <w:spacing w:line="240" w:lineRule="auto"/>
+              <w:ind w:firstLine="0"/>
+              <w:jc w:val="center"/>
               <w:rPr>
                 <w:iCs/>
                 <w:szCs w:val="28"/>
                 <w:lang w:val="en-US"/>
               </w:rPr>
-              <w:t>validateFrequency</w:t>
-            </w:r>
-            <w:proofErr w:type="spellEnd"/>
-          </w:p>
-        </w:tc>
-        <w:tc>
-          <w:tcPr>
-            <w:tcW w:w="3115" w:type="dxa"/>
-            <w:vAlign w:val="center"/>
-          </w:tcPr>
-          <w:p>
-            <w:pPr>
-              <w:spacing w:line="240" w:lineRule="auto"/>
-              <w:ind w:firstLine="0"/>
-              <w:jc w:val="center"/>
+            </w:pPr>
+            <w:r>
               <w:rPr>
                 <w:iCs/>
                 <w:szCs w:val="28"/>
                 <w:lang w:val="en-US"/>
               </w:rPr>
-            </w:pPr>
-            <w:proofErr w:type="spellStart"/>
-            <w:r>
-              <w:rPr>
-                <w:iCs/>
-                <w:szCs w:val="28"/>
-                <w:lang w:val="en-US"/>
-              </w:rPr>
               <w:t>DoubleValidator</w:t>
             </w:r>
-            <w:proofErr w:type="spellEnd"/>
           </w:p>
         </w:tc>
         <w:tc>
@@ -8656,53 +8210,41 @@
               </w:rPr>
               <w:t xml:space="preserve">+ </w:t>
             </w:r>
-            <w:proofErr w:type="spellStart"/>
             <w:r>
               <w:rPr>
                 <w:iCs/>
                 <w:szCs w:val="28"/>
                 <w:lang w:val="en-US"/>
               </w:rPr>
-              <w:t>GetMotion</w:t>
-            </w:r>
-            <w:proofErr w:type="spellEnd"/>
-            <w:r>
-              <w:rPr>
+              <w:t>GetMotion()</w:t>
+            </w:r>
+          </w:p>
+        </w:tc>
+        <w:tc>
+          <w:tcPr>
+            <w:tcW w:w="3115" w:type="dxa"/>
+            <w:vAlign w:val="center"/>
+          </w:tcPr>
+          <w:p>
+            <w:pPr>
+              <w:spacing w:line="240" w:lineRule="auto"/>
+              <w:ind w:firstLine="0"/>
+              <w:jc w:val="center"/>
+              <w:rPr>
+                <w:i/>
                 <w:iCs/>
                 <w:szCs w:val="28"/>
                 <w:lang w:val="en-US"/>
               </w:rPr>
-              <w:t>()</w:t>
-            </w:r>
-          </w:p>
-        </w:tc>
-        <w:tc>
-          <w:tcPr>
-            <w:tcW w:w="3115" w:type="dxa"/>
-            <w:vAlign w:val="center"/>
-          </w:tcPr>
-          <w:p>
-            <w:pPr>
-              <w:spacing w:line="240" w:lineRule="auto"/>
-              <w:ind w:firstLine="0"/>
-              <w:jc w:val="center"/>
-              <w:rPr>
-                <w:i/>
+            </w:pPr>
+            <w:r>
+              <w:rPr>
                 <w:iCs/>
                 <w:szCs w:val="28"/>
                 <w:lang w:val="en-US"/>
               </w:rPr>
-            </w:pPr>
-            <w:proofErr w:type="spellStart"/>
-            <w:r>
-              <w:rPr>
-                <w:iCs/>
-                <w:szCs w:val="28"/>
-                <w:lang w:val="en-US"/>
-              </w:rPr>
               <w:t>MotionBase</w:t>
             </w:r>
-            <w:proofErr w:type="spellEnd"/>
           </w:p>
         </w:tc>
         <w:tc>
@@ -8759,23 +8301,13 @@
               </w:rPr>
               <w:t xml:space="preserve">+ </w:t>
             </w:r>
-            <w:proofErr w:type="spellStart"/>
             <w:r>
               <w:rPr>
                 <w:iCs/>
                 <w:szCs w:val="28"/>
                 <w:lang w:val="en-GB"/>
               </w:rPr>
-              <w:t>ParseDouble</w:t>
-            </w:r>
-            <w:proofErr w:type="spellEnd"/>
-            <w:r>
-              <w:rPr>
-                <w:iCs/>
-                <w:szCs w:val="28"/>
-                <w:lang w:val="en-GB"/>
-              </w:rPr>
-              <w:t>(string)</w:t>
+              <w:t>ParseDouble(string)</w:t>
             </w:r>
           </w:p>
         </w:tc>
@@ -8873,23 +8405,13 @@
               </w:rPr>
               <w:t xml:space="preserve">+ </w:t>
             </w:r>
-            <w:proofErr w:type="spellStart"/>
             <w:r>
               <w:rPr>
                 <w:iCs/>
                 <w:szCs w:val="28"/>
                 <w:lang w:val="en-GB"/>
               </w:rPr>
-              <w:t>ValidateInput</w:t>
-            </w:r>
-            <w:proofErr w:type="spellEnd"/>
-            <w:r>
-              <w:rPr>
-                <w:iCs/>
-                <w:szCs w:val="28"/>
-                <w:lang w:val="en-GB"/>
-              </w:rPr>
-              <w:t>()</w:t>
+              <w:t>ValidateInput()</w:t>
             </w:r>
           </w:p>
         </w:tc>
@@ -8998,11 +8520,9 @@
         </w:rPr>
         <w:t xml:space="preserve"> – Описание класса </w:t>
       </w:r>
-      <w:proofErr w:type="spellStart"/>
       <w:r>
         <w:t>AcceleratedMotionControl</w:t>
       </w:r>
-      <w:proofErr w:type="spellEnd"/>
     </w:p>
     <w:tbl>
       <w:tblPr>
@@ -9162,11 +8682,9 @@
                 <w:szCs w:val="28"/>
               </w:rPr>
             </w:pPr>
-            <w:proofErr w:type="spellStart"/>
             <w:r>
               <w:t>AcceleratedMotionControl</w:t>
             </w:r>
-            <w:proofErr w:type="spellEnd"/>
             <w:r>
               <w:rPr>
                 <w:szCs w:val="28"/>
@@ -9186,7 +8704,6 @@
               </w:rPr>
               <w:t xml:space="preserve">класс, реализующий интерфейс </w:t>
             </w:r>
-            <w:proofErr w:type="spellStart"/>
             <w:r>
               <w:rPr>
                 <w:iCs/>
@@ -9195,7 +8712,6 @@
               </w:rPr>
               <w:t>IMotionInput</w:t>
             </w:r>
-            <w:proofErr w:type="spellEnd"/>
             <w:r>
               <w:rPr>
                 <w:iCs/>
@@ -9280,47 +8796,35 @@
                 <w:szCs w:val="28"/>
                 <w:lang w:val="en-US"/>
               </w:rPr>
-              <w:t>_</w:t>
-            </w:r>
-            <w:proofErr w:type="spellStart"/>
-            <w:r>
-              <w:rPr>
+              <w:t>_validateInitial</w:t>
+            </w:r>
+          </w:p>
+        </w:tc>
+        <w:tc>
+          <w:tcPr>
+            <w:tcW w:w="3115" w:type="dxa"/>
+            <w:vAlign w:val="center"/>
+          </w:tcPr>
+          <w:p>
+            <w:pPr>
+              <w:spacing w:line="240" w:lineRule="auto"/>
+              <w:ind w:firstLine="0"/>
+              <w:jc w:val="center"/>
+              <w:rPr>
+                <w:i/>
                 <w:iCs/>
                 <w:szCs w:val="28"/>
                 <w:lang w:val="en-US"/>
               </w:rPr>
-              <w:t>validateInitial</w:t>
-            </w:r>
-            <w:proofErr w:type="spellEnd"/>
-          </w:p>
-        </w:tc>
-        <w:tc>
-          <w:tcPr>
-            <w:tcW w:w="3115" w:type="dxa"/>
-            <w:vAlign w:val="center"/>
-          </w:tcPr>
-          <w:p>
-            <w:pPr>
-              <w:spacing w:line="240" w:lineRule="auto"/>
-              <w:ind w:firstLine="0"/>
-              <w:jc w:val="center"/>
-              <w:rPr>
-                <w:i/>
+            </w:pPr>
+            <w:r>
+              <w:rPr>
                 <w:iCs/>
                 <w:szCs w:val="28"/>
                 <w:lang w:val="en-US"/>
               </w:rPr>
-            </w:pPr>
-            <w:proofErr w:type="spellStart"/>
-            <w:r>
-              <w:rPr>
-                <w:iCs/>
-                <w:szCs w:val="28"/>
-                <w:lang w:val="en-US"/>
-              </w:rPr>
               <w:t>DoubleValidator</w:t>
             </w:r>
-            <w:proofErr w:type="spellEnd"/>
           </w:p>
         </w:tc>
         <w:tc>
@@ -9374,17 +8878,8 @@
                 <w:iCs/>
                 <w:szCs w:val="28"/>
               </w:rPr>
-              <w:t>_</w:t>
-            </w:r>
-            <w:proofErr w:type="spellStart"/>
-            <w:r>
-              <w:rPr>
-                <w:iCs/>
-                <w:szCs w:val="28"/>
-              </w:rPr>
-              <w:t>validateSpeed</w:t>
-            </w:r>
-            <w:proofErr w:type="spellEnd"/>
+              <w:t>_validateSpeed</w:t>
+            </w:r>
           </w:p>
         </w:tc>
         <w:tc>
@@ -9403,7 +8898,6 @@
                 <w:lang w:val="en-GB"/>
               </w:rPr>
             </w:pPr>
-            <w:proofErr w:type="spellStart"/>
             <w:r>
               <w:rPr>
                 <w:iCs/>
@@ -9412,7 +8906,6 @@
               </w:rPr>
               <w:t>DoubleValidator</w:t>
             </w:r>
-            <w:proofErr w:type="spellEnd"/>
           </w:p>
         </w:tc>
         <w:tc>
@@ -9467,47 +8960,35 @@
                 <w:szCs w:val="28"/>
                 <w:lang w:val="en-US"/>
               </w:rPr>
-              <w:t>_</w:t>
-            </w:r>
-            <w:proofErr w:type="spellStart"/>
-            <w:r>
-              <w:rPr>
+              <w:t>_validateTime</w:t>
+            </w:r>
+          </w:p>
+        </w:tc>
+        <w:tc>
+          <w:tcPr>
+            <w:tcW w:w="3115" w:type="dxa"/>
+            <w:vAlign w:val="center"/>
+          </w:tcPr>
+          <w:p>
+            <w:pPr>
+              <w:spacing w:line="240" w:lineRule="auto"/>
+              <w:ind w:firstLine="0"/>
+              <w:jc w:val="center"/>
+              <w:rPr>
+                <w:i/>
                 <w:iCs/>
                 <w:szCs w:val="28"/>
                 <w:lang w:val="en-US"/>
               </w:rPr>
-              <w:t>validateTime</w:t>
-            </w:r>
-            <w:proofErr w:type="spellEnd"/>
-          </w:p>
-        </w:tc>
-        <w:tc>
-          <w:tcPr>
-            <w:tcW w:w="3115" w:type="dxa"/>
-            <w:vAlign w:val="center"/>
-          </w:tcPr>
-          <w:p>
-            <w:pPr>
-              <w:spacing w:line="240" w:lineRule="auto"/>
-              <w:ind w:firstLine="0"/>
-              <w:jc w:val="center"/>
-              <w:rPr>
-                <w:i/>
+            </w:pPr>
+            <w:r>
+              <w:rPr>
                 <w:iCs/>
                 <w:szCs w:val="28"/>
                 <w:lang w:val="en-US"/>
               </w:rPr>
-            </w:pPr>
-            <w:proofErr w:type="spellStart"/>
-            <w:r>
-              <w:rPr>
-                <w:iCs/>
-                <w:szCs w:val="28"/>
-                <w:lang w:val="en-US"/>
-              </w:rPr>
               <w:t>DoubleValidator</w:t>
             </w:r>
-            <w:proofErr w:type="spellEnd"/>
           </w:p>
         </w:tc>
         <w:tc>
@@ -9562,46 +9043,34 @@
                 <w:szCs w:val="28"/>
                 <w:lang w:val="en-US"/>
               </w:rPr>
-              <w:t>_</w:t>
-            </w:r>
-            <w:proofErr w:type="spellStart"/>
-            <w:r>
+              <w:t>_validateAccel</w:t>
+            </w:r>
+          </w:p>
+        </w:tc>
+        <w:tc>
+          <w:tcPr>
+            <w:tcW w:w="3115" w:type="dxa"/>
+            <w:vAlign w:val="center"/>
+          </w:tcPr>
+          <w:p>
+            <w:pPr>
+              <w:spacing w:line="240" w:lineRule="auto"/>
+              <w:ind w:firstLine="0"/>
+              <w:jc w:val="center"/>
               <w:rPr>
                 <w:iCs/>
                 <w:szCs w:val="28"/>
                 <w:lang w:val="en-US"/>
               </w:rPr>
-              <w:t>validateAccel</w:t>
-            </w:r>
-            <w:proofErr w:type="spellEnd"/>
-          </w:p>
-        </w:tc>
-        <w:tc>
-          <w:tcPr>
-            <w:tcW w:w="3115" w:type="dxa"/>
-            <w:vAlign w:val="center"/>
-          </w:tcPr>
-          <w:p>
-            <w:pPr>
-              <w:spacing w:line="240" w:lineRule="auto"/>
-              <w:ind w:firstLine="0"/>
-              <w:jc w:val="center"/>
+            </w:pPr>
+            <w:r>
               <w:rPr>
                 <w:iCs/>
                 <w:szCs w:val="28"/>
                 <w:lang w:val="en-US"/>
               </w:rPr>
-            </w:pPr>
-            <w:proofErr w:type="spellStart"/>
-            <w:r>
-              <w:rPr>
-                <w:iCs/>
-                <w:szCs w:val="28"/>
-                <w:lang w:val="en-US"/>
-              </w:rPr>
               <w:t>DoubleValidator</w:t>
             </w:r>
-            <w:proofErr w:type="spellEnd"/>
           </w:p>
         </w:tc>
         <w:tc>
@@ -9696,53 +9165,41 @@
               </w:rPr>
               <w:t xml:space="preserve">+ </w:t>
             </w:r>
-            <w:proofErr w:type="spellStart"/>
             <w:r>
               <w:rPr>
                 <w:iCs/>
                 <w:szCs w:val="28"/>
                 <w:lang w:val="en-US"/>
               </w:rPr>
-              <w:t>GetMotion</w:t>
-            </w:r>
-            <w:proofErr w:type="spellEnd"/>
-            <w:r>
-              <w:rPr>
+              <w:t>GetMotion()</w:t>
+            </w:r>
+          </w:p>
+        </w:tc>
+        <w:tc>
+          <w:tcPr>
+            <w:tcW w:w="3115" w:type="dxa"/>
+            <w:vAlign w:val="center"/>
+          </w:tcPr>
+          <w:p>
+            <w:pPr>
+              <w:spacing w:line="240" w:lineRule="auto"/>
+              <w:ind w:firstLine="0"/>
+              <w:jc w:val="center"/>
+              <w:rPr>
+                <w:i/>
                 <w:iCs/>
                 <w:szCs w:val="28"/>
                 <w:lang w:val="en-US"/>
               </w:rPr>
-              <w:t>()</w:t>
-            </w:r>
-          </w:p>
-        </w:tc>
-        <w:tc>
-          <w:tcPr>
-            <w:tcW w:w="3115" w:type="dxa"/>
-            <w:vAlign w:val="center"/>
-          </w:tcPr>
-          <w:p>
-            <w:pPr>
-              <w:spacing w:line="240" w:lineRule="auto"/>
-              <w:ind w:firstLine="0"/>
-              <w:jc w:val="center"/>
-              <w:rPr>
-                <w:i/>
+            </w:pPr>
+            <w:r>
+              <w:rPr>
                 <w:iCs/>
                 <w:szCs w:val="28"/>
                 <w:lang w:val="en-US"/>
               </w:rPr>
-            </w:pPr>
-            <w:proofErr w:type="spellStart"/>
-            <w:r>
-              <w:rPr>
-                <w:iCs/>
-                <w:szCs w:val="28"/>
-                <w:lang w:val="en-US"/>
-              </w:rPr>
               <w:t>MotionBase</w:t>
             </w:r>
-            <w:proofErr w:type="spellEnd"/>
           </w:p>
         </w:tc>
         <w:tc>
@@ -9808,23 +9265,13 @@
               <w:lastRenderedPageBreak/>
               <w:t xml:space="preserve">+ </w:t>
             </w:r>
-            <w:proofErr w:type="spellStart"/>
             <w:r>
               <w:rPr>
                 <w:iCs/>
                 <w:szCs w:val="28"/>
                 <w:lang w:val="en-GB"/>
               </w:rPr>
-              <w:t>ParseDouble</w:t>
-            </w:r>
-            <w:proofErr w:type="spellEnd"/>
-            <w:r>
-              <w:rPr>
-                <w:iCs/>
-                <w:szCs w:val="28"/>
-                <w:lang w:val="en-GB"/>
-              </w:rPr>
-              <w:t>(string)</w:t>
+              <w:t>ParseDouble(string)</w:t>
             </w:r>
           </w:p>
         </w:tc>
@@ -9922,23 +9369,13 @@
               </w:rPr>
               <w:t xml:space="preserve">+ </w:t>
             </w:r>
-            <w:proofErr w:type="spellStart"/>
             <w:r>
               <w:rPr>
                 <w:iCs/>
                 <w:szCs w:val="28"/>
                 <w:lang w:val="en-GB"/>
               </w:rPr>
-              <w:t>ValidateInput</w:t>
-            </w:r>
-            <w:proofErr w:type="spellEnd"/>
-            <w:r>
-              <w:rPr>
-                <w:iCs/>
-                <w:szCs w:val="28"/>
-                <w:lang w:val="en-GB"/>
-              </w:rPr>
-              <w:t>()</w:t>
+              <w:t>ValidateInput()</w:t>
             </w:r>
           </w:p>
         </w:tc>
@@ -10020,7 +9457,7 @@
       <w:pPr>
         <w:pStyle w:val="1"/>
       </w:pPr>
-      <w:bookmarkStart w:id="5" w:name="_Toc228293279"/>
+      <w:bookmarkStart w:id="5" w:name="_Toc229514661"/>
       <w:r>
         <w:t>1.4</w:t>
       </w:r>
@@ -10142,7 +9579,7 @@
       <w:pPr>
         <w:pStyle w:val="1"/>
       </w:pPr>
-      <w:bookmarkStart w:id="6" w:name="_Toc228293280"/>
+      <w:bookmarkStart w:id="6" w:name="_Toc229514662"/>
       <w:r>
         <w:t>1.5. Функциональное тестирование программы</w:t>
       </w:r>
@@ -10249,7 +9686,7 @@
       <w:pPr>
         <w:pStyle w:val="1"/>
       </w:pPr>
-      <w:bookmarkStart w:id="7" w:name="_Toc228293281"/>
+      <w:bookmarkStart w:id="7" w:name="_Toc229514663"/>
       <w:r>
         <w:t>1.5.1. Тестовый случай расчета координаты тела</w:t>
       </w:r>
@@ -10344,23 +9781,7 @@
           <w:iCs/>
           <w:szCs w:val="28"/>
         </w:rPr>
-        <w:t>Кнопка «</w:t>
-      </w:r>
-      <w:proofErr w:type="spellStart"/>
-      <w:r>
-        <w:rPr>
-          <w:iCs/>
-          <w:szCs w:val="28"/>
-        </w:rPr>
-        <w:t>Рандомные</w:t>
-      </w:r>
-      <w:proofErr w:type="spellEnd"/>
-      <w:r>
-        <w:rPr>
-          <w:iCs/>
-          <w:szCs w:val="28"/>
-        </w:rPr>
-        <w:t xml:space="preserve"> параметры» автоматически заполняет поля, данная кнопка и методы, вызванные по ее нажатии доступны только в </w:t>
+        <w:t xml:space="preserve">Кнопка «Рандомные параметры» автоматически заполняет поля, данная кнопка и методы, вызванные по ее нажатии доступны только в </w:t>
       </w:r>
       <w:r>
         <w:rPr>
@@ -10863,7 +10284,7 @@
       <w:pPr>
         <w:pStyle w:val="1"/>
       </w:pPr>
-      <w:bookmarkStart w:id="8" w:name="_Toc228293282"/>
+      <w:bookmarkStart w:id="8" w:name="_Toc229514664"/>
       <w:r>
         <w:t>1.5.2. Тестовый случай «Удалить запись»</w:t>
       </w:r>
@@ -11028,7 +10449,7 @@
       <w:pPr>
         <w:pStyle w:val="1"/>
       </w:pPr>
-      <w:bookmarkStart w:id="9" w:name="_Toc228293283"/>
+      <w:bookmarkStart w:id="9" w:name="_Toc229514665"/>
       <w:r>
         <w:t xml:space="preserve">1.5.3. Тестовый случай </w:t>
       </w:r>
@@ -11220,7 +10641,7 @@
       <w:pPr>
         <w:pStyle w:val="1"/>
       </w:pPr>
-      <w:bookmarkStart w:id="10" w:name="_Toc228293284"/>
+      <w:bookmarkStart w:id="10" w:name="_Toc229514666"/>
       <w:r>
         <w:t>1.5.4. Тестовый случай «Сохранить как…»</w:t>
       </w:r>
@@ -11266,7 +10687,6 @@
         </w:rPr>
         <w:t xml:space="preserve">в </w:t>
       </w:r>
-      <w:proofErr w:type="gramStart"/>
       <w:r>
         <w:rPr>
           <w:iCs/>
@@ -11281,7 +10701,6 @@
         </w:rPr>
         <w:t>.</w:t>
       </w:r>
-      <w:proofErr w:type="spellStart"/>
       <w:r>
         <w:rPr>
           <w:iCs/>
@@ -11289,8 +10708,6 @@
         </w:rPr>
         <w:t>elmt</w:t>
       </w:r>
-      <w:proofErr w:type="spellEnd"/>
-      <w:proofErr w:type="gramEnd"/>
       <w:r>
         <w:rPr>
           <w:iCs/>
@@ -11425,7 +10842,7 @@
       <w:pPr>
         <w:pStyle w:val="1"/>
       </w:pPr>
-      <w:bookmarkStart w:id="11" w:name="_Toc228293285"/>
+      <w:bookmarkStart w:id="11" w:name="_Toc229514667"/>
       <w:r>
         <w:t>1.5.5. Тестовый случай «Открыть»</w:t>
       </w:r>
@@ -11443,15 +10860,7 @@
           <w:iCs/>
           <w:szCs w:val="28"/>
         </w:rPr>
-        <w:t xml:space="preserve">Для загрузки данных в таблицу необходимо нажать на кнопку «Открыть» во вкладке «Файл». После чего откроется системный диалог загрузки файла в </w:t>
-      </w:r>
-      <w:proofErr w:type="gramStart"/>
-      <w:r>
-        <w:rPr>
-          <w:iCs/>
-          <w:szCs w:val="28"/>
-        </w:rPr>
-        <w:t xml:space="preserve">формате </w:t>
+        <w:t xml:space="preserve">Для загрузки данных в таблицу необходимо нажать на кнопку «Открыть» во вкладке «Файл». После чего откроется системный диалог загрузки файла в формате </w:t>
       </w:r>
       <w:r>
         <w:rPr>
@@ -11460,7 +10869,6 @@
         </w:rPr>
         <w:t>.</w:t>
       </w:r>
-      <w:proofErr w:type="spellStart"/>
       <w:r>
         <w:rPr>
           <w:iCs/>
@@ -11468,8 +10876,6 @@
         </w:rPr>
         <w:t>elmt</w:t>
       </w:r>
-      <w:proofErr w:type="spellEnd"/>
-      <w:proofErr w:type="gramEnd"/>
       <w:r>
         <w:rPr>
           <w:iCs/>
@@ -11723,6 +11129,87 @@
         <w:ind w:firstLine="0"/>
         <w:jc w:val="center"/>
         <w:rPr>
+          <w:iCs/>
+          <w:szCs w:val="28"/>
+        </w:rPr>
+      </w:pPr>
+      <w:r>
+        <w:rPr>
+          <w:iCs/>
+          <w:szCs w:val="28"/>
+        </w:rPr>
+        <w:t>Рисунок 1</w:t>
+      </w:r>
+      <w:r>
+        <w:rPr>
+          <w:iCs/>
+          <w:szCs w:val="28"/>
+        </w:rPr>
+        <w:t>8</w:t>
+      </w:r>
+      <w:r>
+        <w:rPr>
+          <w:iCs/>
+          <w:szCs w:val="28"/>
+        </w:rPr>
+        <w:t xml:space="preserve"> – Результат загрузки файла</w:t>
+      </w:r>
+    </w:p>
+    <w:p>
+      <w:pPr>
+        <w:pStyle w:val="1"/>
+      </w:pPr>
+      <w:bookmarkStart w:id="12" w:name="_Toc229514668"/>
+      <w:r>
+        <w:t>1.6. Модульное тестирование</w:t>
+      </w:r>
+      <w:bookmarkEnd w:id="12"/>
+      <w:r>
+        <w:t xml:space="preserve"> </w:t>
+      </w:r>
+    </w:p>
+    <w:p>
+      <w:pPr>
+        <w:rPr>
+          <w:iCs/>
+          <w:szCs w:val="28"/>
+        </w:rPr>
+      </w:pPr>
+      <w:r>
+        <w:rPr>
+          <w:iCs/>
+          <w:szCs w:val="28"/>
+        </w:rPr>
+        <w:t>Структуру тест</w:t>
+      </w:r>
+      <w:r>
+        <w:rPr>
+          <w:iCs/>
+          <w:szCs w:val="28"/>
+        </w:rPr>
+        <w:t>овых случаев привед</w:t>
+      </w:r>
+      <w:bookmarkStart w:id="13" w:name="_GoBack"/>
+      <w:bookmarkEnd w:id="13"/>
+      <w:r>
+        <w:rPr>
+          <w:iCs/>
+          <w:szCs w:val="28"/>
+        </w:rPr>
+        <w:t>ем на рис. 19</w:t>
+      </w:r>
+      <w:r>
+        <w:rPr>
+          <w:iCs/>
+          <w:szCs w:val="28"/>
+        </w:rPr>
+        <w:t>.</w:t>
+      </w:r>
+    </w:p>
+    <w:p>
+      <w:pPr>
+        <w:ind w:firstLine="0"/>
+        <w:rPr>
           <w:i/>
           <w:iCs/>
           <w:szCs w:val="28"/>
@@ -11730,53 +11217,192 @@
       </w:pPr>
       <w:r>
         <w:rPr>
-          <w:iCs/>
-          <w:szCs w:val="28"/>
-        </w:rPr>
-        <w:t>Рисунок 1</w:t>
-      </w:r>
-      <w:r>
-        <w:rPr>
-          <w:iCs/>
-          <w:szCs w:val="28"/>
-        </w:rPr>
-        <w:t>8</w:t>
-      </w:r>
-      <w:r>
-        <w:rPr>
-          <w:iCs/>
-          <w:szCs w:val="28"/>
-        </w:rPr>
-        <w:t xml:space="preserve"> – Результат загрузки файла</w:t>
-      </w:r>
-    </w:p>
-    <w:p/>
-    <w:p/>
-    <w:p/>
-    <w:p/>
-    <w:p/>
-    <w:p/>
-    <w:p/>
-    <w:p/>
-    <w:p/>
-    <w:p/>
-    <w:p/>
-    <w:p/>
-    <w:p/>
-    <w:p/>
-    <w:p/>
-    <w:p/>
-    <w:p/>
+          <w:i/>
+          <w:iCs/>
+          <w:szCs w:val="28"/>
+        </w:rPr>
+        <w:drawing>
+          <wp:inline distT="0" distB="0" distL="0" distR="0" wp14:anchorId="5A4B19FB" wp14:editId="4AFD8F92">
+            <wp:extent cx="5940425" cy="1615440"/>
+            <wp:effectExtent l="0" t="0" r="3175" b="3810"/>
+            <wp:docPr id="4" name="Рисунок 4"/>
+            <wp:cNvGraphicFramePr>
+              <a:graphicFrameLocks xmlns:a="http://schemas.openxmlformats.org/drawingml/2006/main" noChangeAspect="1"/>
+            </wp:cNvGraphicFramePr>
+            <a:graphic xmlns:a="http://schemas.openxmlformats.org/drawingml/2006/main">
+              <a:graphicData uri="http://schemas.openxmlformats.org/drawingml/2006/picture">
+                <pic:pic xmlns:pic="http://schemas.openxmlformats.org/drawingml/2006/picture">
+                  <pic:nvPicPr>
+                    <pic:cNvPr id="1" name=""/>
+                    <pic:cNvPicPr/>
+                  </pic:nvPicPr>
+                  <pic:blipFill>
+                    <a:blip r:embed="rId29"/>
+                    <a:stretch>
+                      <a:fillRect/>
+                    </a:stretch>
+                  </pic:blipFill>
+                  <pic:spPr>
+                    <a:xfrm>
+                      <a:off x="0" y="0"/>
+                      <a:ext cx="5940425" cy="1615440"/>
+                    </a:xfrm>
+                    <a:prstGeom prst="rect">
+                      <a:avLst/>
+                    </a:prstGeom>
+                  </pic:spPr>
+                </pic:pic>
+              </a:graphicData>
+            </a:graphic>
+          </wp:inline>
+        </w:drawing>
+      </w:r>
+    </w:p>
+    <w:p>
+      <w:pPr>
+        <w:ind w:firstLine="0"/>
+        <w:jc w:val="center"/>
+        <w:rPr>
+          <w:i/>
+          <w:iCs/>
+          <w:szCs w:val="28"/>
+        </w:rPr>
+      </w:pPr>
+      <w:r>
+        <w:rPr>
+          <w:iCs/>
+          <w:szCs w:val="28"/>
+        </w:rPr>
+        <w:t>Рисунок 19</w:t>
+      </w:r>
+      <w:r>
+        <w:rPr>
+          <w:iCs/>
+          <w:szCs w:val="28"/>
+        </w:rPr>
+        <w:t xml:space="preserve"> – Обозреватель тестов</w:t>
+      </w:r>
+    </w:p>
+    <w:p>
+      <w:pPr>
+        <w:rPr>
+          <w:i/>
+          <w:iCs/>
+          <w:szCs w:val="28"/>
+        </w:rPr>
+      </w:pPr>
+      <w:r>
+        <w:rPr>
+          <w:iCs/>
+          <w:szCs w:val="28"/>
+        </w:rPr>
+        <w:t xml:space="preserve">Выполним покрытие кода тестами для проекта </w:t>
+      </w:r>
+      <w:r>
+        <w:rPr>
+          <w:iCs/>
+          <w:szCs w:val="28"/>
+          <w:lang w:val="en-US"/>
+        </w:rPr>
+        <w:t>Model</w:t>
+      </w:r>
+      <w:r>
+        <w:rPr>
+          <w:iCs/>
+          <w:szCs w:val="28"/>
+        </w:rPr>
+        <w:t>. Результат приведен на рис. 20</w:t>
+      </w:r>
+      <w:r>
+        <w:rPr>
+          <w:iCs/>
+          <w:szCs w:val="28"/>
+        </w:rPr>
+        <w:t>.</w:t>
+      </w:r>
+    </w:p>
+    <w:p>
+      <w:pPr>
+        <w:ind w:firstLine="0"/>
+      </w:pPr>
+      <w:r>
+        <w:drawing>
+          <wp:inline distT="0" distB="0" distL="0" distR="0" wp14:anchorId="6D67487A" wp14:editId="3E3E6953">
+            <wp:extent cx="5940425" cy="1205865"/>
+            <wp:effectExtent l="0" t="0" r="3175" b="0"/>
+            <wp:docPr id="3" name="Рисунок 3"/>
+            <wp:cNvGraphicFramePr>
+              <a:graphicFrameLocks xmlns:a="http://schemas.openxmlformats.org/drawingml/2006/main" noChangeAspect="1"/>
+            </wp:cNvGraphicFramePr>
+            <a:graphic xmlns:a="http://schemas.openxmlformats.org/drawingml/2006/main">
+              <a:graphicData uri="http://schemas.openxmlformats.org/drawingml/2006/picture">
+                <pic:pic xmlns:pic="http://schemas.openxmlformats.org/drawingml/2006/picture">
+                  <pic:nvPicPr>
+                    <pic:cNvPr id="1" name=""/>
+                    <pic:cNvPicPr/>
+                  </pic:nvPicPr>
+                  <pic:blipFill>
+                    <a:blip r:embed="rId30"/>
+                    <a:stretch>
+                      <a:fillRect/>
+                    </a:stretch>
+                  </pic:blipFill>
+                  <pic:spPr>
+                    <a:xfrm>
+                      <a:off x="0" y="0"/>
+                      <a:ext cx="5940425" cy="1205865"/>
+                    </a:xfrm>
+                    <a:prstGeom prst="rect">
+                      <a:avLst/>
+                    </a:prstGeom>
+                  </pic:spPr>
+                </pic:pic>
+              </a:graphicData>
+            </a:graphic>
+          </wp:inline>
+        </w:drawing>
+      </w:r>
+    </w:p>
+    <w:p>
+      <w:pPr>
+        <w:ind w:firstLine="0"/>
+        <w:jc w:val="center"/>
+        <w:rPr>
+          <w:i/>
+          <w:iCs/>
+          <w:szCs w:val="28"/>
+        </w:rPr>
+      </w:pPr>
+      <w:r>
+        <w:rPr>
+          <w:iCs/>
+          <w:szCs w:val="28"/>
+        </w:rPr>
+        <w:t>Рисунок 20</w:t>
+      </w:r>
+      <w:r>
+        <w:rPr>
+          <w:iCs/>
+          <w:szCs w:val="28"/>
+        </w:rPr>
+        <w:t xml:space="preserve"> – Покрытие кода тестами</w:t>
+      </w:r>
+    </w:p>
+    <w:p>
+      <w:pPr>
+        <w:ind w:firstLine="0"/>
+      </w:pPr>
+    </w:p>
     <w:p>
       <w:pPr>
         <w:pStyle w:val="1"/>
       </w:pPr>
-      <w:bookmarkStart w:id="12" w:name="_Toc228293286"/>
+      <w:bookmarkStart w:id="14" w:name="_Toc229514669"/>
       <w:r>
         <w:lastRenderedPageBreak/>
         <w:t>Список использованных источников</w:t>
       </w:r>
-      <w:bookmarkEnd w:id="12"/>
+      <w:bookmarkEnd w:id="14"/>
       <w:r>
         <w:t xml:space="preserve"> </w:t>
       </w:r>
@@ -11796,113 +11422,13 @@
           <w:lang w:val="ru-RU"/>
         </w:rPr>
       </w:pPr>
-      <w:proofErr w:type="spellStart"/>
       <w:r>
         <w:rPr>
           <w:i w:val="0"/>
           <w:iCs/>
           <w:lang w:val="ru-RU"/>
         </w:rPr>
-        <w:t>Калентьев</w:t>
-      </w:r>
-      <w:proofErr w:type="spellEnd"/>
-      <w:r>
-        <w:rPr>
-          <w:i w:val="0"/>
-          <w:iCs/>
-          <w:lang w:val="ru-RU"/>
-        </w:rPr>
-        <w:t xml:space="preserve">, А. А. Новые технологии в </w:t>
-      </w:r>
-      <w:proofErr w:type="gramStart"/>
-      <w:r>
-        <w:rPr>
-          <w:i w:val="0"/>
-          <w:iCs/>
-          <w:lang w:val="ru-RU"/>
-        </w:rPr>
-        <w:t>программировании :</w:t>
-      </w:r>
-      <w:proofErr w:type="gramEnd"/>
-      <w:r>
-        <w:rPr>
-          <w:i w:val="0"/>
-          <w:iCs/>
-          <w:lang w:val="ru-RU"/>
-        </w:rPr>
-        <w:t xml:space="preserve"> учебное пособие / А. А. </w:t>
-      </w:r>
-      <w:proofErr w:type="spellStart"/>
-      <w:r>
-        <w:rPr>
-          <w:i w:val="0"/>
-          <w:iCs/>
-          <w:lang w:val="ru-RU"/>
-        </w:rPr>
-        <w:t>Калентьев</w:t>
-      </w:r>
-      <w:proofErr w:type="spellEnd"/>
-      <w:r>
-        <w:rPr>
-          <w:i w:val="0"/>
-          <w:iCs/>
-          <w:lang w:val="ru-RU"/>
-        </w:rPr>
-        <w:t xml:space="preserve">, Д. В. </w:t>
-      </w:r>
-      <w:proofErr w:type="spellStart"/>
-      <w:r>
-        <w:rPr>
-          <w:i w:val="0"/>
-          <w:iCs/>
-          <w:lang w:val="ru-RU"/>
-        </w:rPr>
-        <w:t>Гарайс</w:t>
-      </w:r>
-      <w:proofErr w:type="spellEnd"/>
-      <w:r>
-        <w:rPr>
-          <w:i w:val="0"/>
-          <w:iCs/>
-          <w:lang w:val="ru-RU"/>
-        </w:rPr>
-        <w:t xml:space="preserve">, А. Е. </w:t>
-      </w:r>
-      <w:proofErr w:type="spellStart"/>
-      <w:r>
-        <w:rPr>
-          <w:i w:val="0"/>
-          <w:iCs/>
-          <w:lang w:val="ru-RU"/>
-        </w:rPr>
-        <w:t>Гориянов</w:t>
-      </w:r>
-      <w:proofErr w:type="spellEnd"/>
-      <w:r>
-        <w:rPr>
-          <w:i w:val="0"/>
-          <w:iCs/>
-          <w:lang w:val="ru-RU"/>
-        </w:rPr>
-        <w:t xml:space="preserve">. – </w:t>
-      </w:r>
-      <w:proofErr w:type="gramStart"/>
-      <w:r>
-        <w:rPr>
-          <w:i w:val="0"/>
-          <w:iCs/>
-          <w:lang w:val="ru-RU"/>
-        </w:rPr>
-        <w:t>Томск :</w:t>
-      </w:r>
-      <w:proofErr w:type="gramEnd"/>
-      <w:r>
-        <w:rPr>
-          <w:i w:val="0"/>
-          <w:iCs/>
-          <w:lang w:val="ru-RU"/>
-        </w:rPr>
-        <w:t xml:space="preserve"> Эль Контент, 2014. – 176 с. – </w:t>
+        <w:t xml:space="preserve">Калентьев, А. А. Новые технологии в программировании : учебное пособие / А. А. Калентьев, Д. В. Гарайс, А. Е. Гориянов. – Томск : Эль Контент, 2014. – 176 с. – </w:t>
       </w:r>
       <w:r>
         <w:rPr>
@@ -11960,8 +11486,8 @@
           <w:szCs w:val="24"/>
         </w:rPr>
       </w:pPr>
-      <w:bookmarkStart w:id="13" w:name="_Toc225423988"/>
-      <w:bookmarkStart w:id="14" w:name="_Toc228293287"/>
+      <w:bookmarkStart w:id="15" w:name="_Toc225423988"/>
+      <w:bookmarkStart w:id="16" w:name="_Toc229514670"/>
       <w:r>
         <w:rPr>
           <w:rFonts w:cs="Times New Roman"/>
@@ -11974,8 +11500,8 @@
         <w:lastRenderedPageBreak/>
         <w:t>Приложение А</w:t>
       </w:r>
-      <w:bookmarkEnd w:id="13"/>
-      <w:bookmarkEnd w:id="14"/>
+      <w:bookmarkEnd w:id="15"/>
+      <w:bookmarkEnd w:id="16"/>
     </w:p>
     <w:p>
       <w:pPr>
@@ -12063,23 +11589,7 @@
           <w:iCs/>
           <w:szCs w:val="28"/>
         </w:rPr>
-        <w:t xml:space="preserve">Заказчик: к.т.н., доцент </w:t>
-      </w:r>
-      <w:proofErr w:type="spellStart"/>
-      <w:r>
-        <w:rPr>
-          <w:iCs/>
-          <w:szCs w:val="28"/>
-        </w:rPr>
-        <w:t>Калентьев</w:t>
-      </w:r>
-      <w:proofErr w:type="spellEnd"/>
-      <w:r>
-        <w:rPr>
-          <w:iCs/>
-          <w:szCs w:val="28"/>
-        </w:rPr>
-        <w:t xml:space="preserve"> А.А.</w:t>
+        <w:t>Заказчик: к.т.н., доцент Калентьев А.А.</w:t>
       </w:r>
     </w:p>
     <w:p>
@@ -12413,23 +11923,7 @@
           <w:iCs/>
           <w:szCs w:val="28"/>
         </w:rPr>
-        <w:t xml:space="preserve">Заказчик: к.т.н., доцент </w:t>
-      </w:r>
-      <w:proofErr w:type="spellStart"/>
-      <w:r>
-        <w:rPr>
-          <w:iCs/>
-          <w:szCs w:val="28"/>
-        </w:rPr>
-        <w:t>Калентьев</w:t>
-      </w:r>
-      <w:proofErr w:type="spellEnd"/>
-      <w:r>
-        <w:rPr>
-          <w:iCs/>
-          <w:szCs w:val="28"/>
-        </w:rPr>
-        <w:t xml:space="preserve"> А.А.</w:t>
+        <w:t>Заказчик: к.т.н., доцент Калентьев А.А.</w:t>
       </w:r>
     </w:p>
     <w:p>
@@ -14275,17 +13769,8 @@
           <w:iCs/>
           <w:szCs w:val="28"/>
         </w:rPr>
-        <w:t xml:space="preserve">должны храниться в формате </w:t>
-      </w:r>
-      <w:proofErr w:type="gramStart"/>
-      <w:r>
-        <w:rPr>
-          <w:iCs/>
-          <w:szCs w:val="28"/>
-        </w:rPr>
-        <w:t>*.</w:t>
-      </w:r>
-      <w:proofErr w:type="spellStart"/>
+        <w:t>должны храниться в формате *.</w:t>
+      </w:r>
       <w:r>
         <w:rPr>
           <w:iCs/>
@@ -14294,8 +13779,6 @@
         </w:rPr>
         <w:t>elmt</w:t>
       </w:r>
-      <w:proofErr w:type="spellEnd"/>
-      <w:proofErr w:type="gramEnd"/>
       <w:r>
         <w:rPr>
           <w:iCs/>
@@ -14377,61 +13860,59 @@
           <w:szCs w:val="28"/>
           <w:lang w:val="en-US"/>
         </w:rPr>
-        <w:t>&lt;</w:t>
-      </w:r>
-      <w:proofErr w:type="spellStart"/>
-      <w:r>
+        <w:t>&lt;ArrayOfMotionBase xmlns:xsi="http://www.w3.org/2001/XMLSchema-instance" xmlns:xsd="http://www.w3.org/2001/XMLSchema"&gt;</w:t>
+      </w:r>
+    </w:p>
+    <w:p>
+      <w:pPr>
         <w:rPr>
           <w:iCs/>
           <w:szCs w:val="28"/>
           <w:lang w:val="en-US"/>
         </w:rPr>
-        <w:t>ArrayOfMotionBase</w:t>
-      </w:r>
-      <w:proofErr w:type="spellEnd"/>
+      </w:pPr>
       <w:r>
         <w:rPr>
           <w:iCs/>
           <w:szCs w:val="28"/>
           <w:lang w:val="en-US"/>
         </w:rPr>
-        <w:t xml:space="preserve"> </w:t>
-      </w:r>
-      <w:proofErr w:type="spellStart"/>
-      <w:r>
+        <w:lastRenderedPageBreak/>
+        <w:t xml:space="preserve">  &lt;MotionBase xsi:type="UniformMotion"&gt;</w:t>
+      </w:r>
+    </w:p>
+    <w:p>
+      <w:pPr>
         <w:rPr>
           <w:iCs/>
           <w:szCs w:val="28"/>
           <w:lang w:val="en-US"/>
         </w:rPr>
-        <w:t>xmlns:xsi</w:t>
-      </w:r>
-      <w:proofErr w:type="spellEnd"/>
+      </w:pPr>
       <w:r>
         <w:rPr>
           <w:iCs/>
           <w:szCs w:val="28"/>
           <w:lang w:val="en-US"/>
         </w:rPr>
-        <w:t xml:space="preserve">="http://www.w3.org/2001/XMLSchema-instance" </w:t>
-      </w:r>
-      <w:proofErr w:type="spellStart"/>
-      <w:r>
+        <w:t xml:space="preserve">    &lt;InitialPosition&gt;692.012950883589&lt;/InitialPosition&gt;</w:t>
+      </w:r>
+    </w:p>
+    <w:p>
+      <w:pPr>
         <w:rPr>
           <w:iCs/>
           <w:szCs w:val="28"/>
           <w:lang w:val="en-US"/>
         </w:rPr>
-        <w:t>xmlns:xsd</w:t>
-      </w:r>
-      <w:proofErr w:type="spellEnd"/>
+      </w:pPr>
       <w:r>
         <w:rPr>
           <w:iCs/>
           <w:szCs w:val="28"/>
           <w:lang w:val="en-US"/>
         </w:rPr>
-        <w:t>="http://www.w3.org/2001/XMLSchema"&gt;</w:t>
+        <w:t xml:space="preserve">    &lt;Time&gt;116.75694514373716&lt;/Time&gt;</w:t>
       </w:r>
     </w:p>
     <w:p>
@@ -14448,64 +13929,58 @@
           <w:szCs w:val="28"/>
           <w:lang w:val="en-US"/>
         </w:rPr>
-        <w:lastRenderedPageBreak/>
-        <w:t xml:space="preserve">  &lt;</w:t>
-      </w:r>
-      <w:proofErr w:type="spellStart"/>
-      <w:r>
+        <w:t xml:space="preserve">    &lt;Speed&gt;917.805854268745&lt;/Speed&gt;</w:t>
+      </w:r>
+    </w:p>
+    <w:p>
+      <w:pPr>
         <w:rPr>
           <w:iCs/>
           <w:szCs w:val="28"/>
           <w:lang w:val="en-US"/>
         </w:rPr>
-        <w:t>MotionBase</w:t>
-      </w:r>
-      <w:proofErr w:type="spellEnd"/>
+      </w:pPr>
       <w:r>
         <w:rPr>
           <w:iCs/>
           <w:szCs w:val="28"/>
           <w:lang w:val="en-US"/>
         </w:rPr>
-        <w:t xml:space="preserve"> </w:t>
-      </w:r>
-      <w:proofErr w:type="spellStart"/>
-      <w:proofErr w:type="gramStart"/>
-      <w:r>
+        <w:t xml:space="preserve">  &lt;/MotionBase&gt;</w:t>
+      </w:r>
+    </w:p>
+    <w:p>
+      <w:pPr>
         <w:rPr>
           <w:iCs/>
           <w:szCs w:val="28"/>
           <w:lang w:val="en-US"/>
         </w:rPr>
-        <w:t>xsi:type</w:t>
-      </w:r>
-      <w:proofErr w:type="spellEnd"/>
-      <w:proofErr w:type="gramEnd"/>
+      </w:pPr>
       <w:r>
         <w:rPr>
           <w:iCs/>
           <w:szCs w:val="28"/>
           <w:lang w:val="en-US"/>
         </w:rPr>
-        <w:t>="</w:t>
-      </w:r>
-      <w:proofErr w:type="spellStart"/>
-      <w:r>
+        <w:t xml:space="preserve">  &lt;MotionBase xsi:type="OscillatoryMotion"&gt;</w:t>
+      </w:r>
+    </w:p>
+    <w:p>
+      <w:pPr>
         <w:rPr>
           <w:iCs/>
           <w:szCs w:val="28"/>
           <w:lang w:val="en-US"/>
         </w:rPr>
-        <w:t>UniformMotion</w:t>
-      </w:r>
-      <w:proofErr w:type="spellEnd"/>
+      </w:pPr>
       <w:r>
         <w:rPr>
           <w:iCs/>
           <w:szCs w:val="28"/>
           <w:lang w:val="en-US"/>
         </w:rPr>
-        <w:t>"&gt;</w:t>
+        <w:t xml:space="preserve">    &lt;InitialPosition&gt;371.4411688367728&lt;/InitialPosition&gt;</w:t>
       </w:r>
     </w:p>
     <w:p>
@@ -14522,43 +13997,41 @@
           <w:szCs w:val="28"/>
           <w:lang w:val="en-US"/>
         </w:rPr>
-        <w:t xml:space="preserve">    &lt;</w:t>
-      </w:r>
-      <w:proofErr w:type="spellStart"/>
-      <w:r>
+        <w:t xml:space="preserve">    &lt;Time&gt;387.80972096506935&lt;/Time&gt;</w:t>
+      </w:r>
+    </w:p>
+    <w:p>
+      <w:pPr>
         <w:rPr>
           <w:iCs/>
           <w:szCs w:val="28"/>
           <w:lang w:val="en-US"/>
         </w:rPr>
-        <w:t>InitialPosition</w:t>
-      </w:r>
-      <w:proofErr w:type="spellEnd"/>
+      </w:pPr>
       <w:r>
         <w:rPr>
           <w:iCs/>
           <w:szCs w:val="28"/>
           <w:lang w:val="en-US"/>
         </w:rPr>
-        <w:t>&gt;692.012950883589&lt;/</w:t>
-      </w:r>
-      <w:proofErr w:type="spellStart"/>
-      <w:r>
+        <w:t xml:space="preserve">    &lt;Speed&gt;881.5164801141726&lt;/Speed&gt;</w:t>
+      </w:r>
+    </w:p>
+    <w:p>
+      <w:pPr>
         <w:rPr>
           <w:iCs/>
           <w:szCs w:val="28"/>
           <w:lang w:val="en-US"/>
         </w:rPr>
-        <w:t>InitialPosition</w:t>
-      </w:r>
-      <w:proofErr w:type="spellEnd"/>
+      </w:pPr>
       <w:r>
         <w:rPr>
           <w:iCs/>
           <w:szCs w:val="28"/>
           <w:lang w:val="en-US"/>
         </w:rPr>
-        <w:t>&gt;</w:t>
+        <w:t xml:space="preserve">    &lt;Frequency&gt;929.8608408567228&lt;/Frequency&gt;</w:t>
       </w:r>
     </w:p>
     <w:p>
@@ -14575,7 +14048,7 @@
           <w:szCs w:val="28"/>
           <w:lang w:val="en-US"/>
         </w:rPr>
-        <w:t xml:space="preserve">    &lt;Time&gt;116.75694514373716&lt;/Time&gt;</w:t>
+        <w:t xml:space="preserve">  &lt;/MotionBase&gt;</w:t>
       </w:r>
     </w:p>
     <w:p>
@@ -14592,7 +14065,7 @@
           <w:szCs w:val="28"/>
           <w:lang w:val="en-US"/>
         </w:rPr>
-        <w:t xml:space="preserve">    &lt;Speed&gt;917.805854268745&lt;/Speed&gt;</w:t>
+        <w:t xml:space="preserve">  &lt;MotionBase xsi:type="UniformlyAcceleratedMotion"&gt;</w:t>
       </w:r>
     </w:p>
     <w:p>
@@ -14609,363 +14082,7 @@
           <w:szCs w:val="28"/>
           <w:lang w:val="en-US"/>
         </w:rPr>
-        <w:t xml:space="preserve">  &lt;/</w:t>
-      </w:r>
-      <w:proofErr w:type="spellStart"/>
-      <w:r>
-        <w:rPr>
-          <w:iCs/>
-          <w:szCs w:val="28"/>
-          <w:lang w:val="en-US"/>
-        </w:rPr>
-        <w:t>MotionBase</w:t>
-      </w:r>
-      <w:proofErr w:type="spellEnd"/>
-      <w:r>
-        <w:rPr>
-          <w:iCs/>
-          <w:szCs w:val="28"/>
-          <w:lang w:val="en-US"/>
-        </w:rPr>
-        <w:t>&gt;</w:t>
-      </w:r>
-    </w:p>
-    <w:p>
-      <w:pPr>
-        <w:rPr>
-          <w:iCs/>
-          <w:szCs w:val="28"/>
-          <w:lang w:val="en-US"/>
-        </w:rPr>
-      </w:pPr>
-      <w:r>
-        <w:rPr>
-          <w:iCs/>
-          <w:szCs w:val="28"/>
-          <w:lang w:val="en-US"/>
-        </w:rPr>
-        <w:t xml:space="preserve">  &lt;</w:t>
-      </w:r>
-      <w:proofErr w:type="spellStart"/>
-      <w:r>
-        <w:rPr>
-          <w:iCs/>
-          <w:szCs w:val="28"/>
-          <w:lang w:val="en-US"/>
-        </w:rPr>
-        <w:t>MotionBase</w:t>
-      </w:r>
-      <w:proofErr w:type="spellEnd"/>
-      <w:r>
-        <w:rPr>
-          <w:iCs/>
-          <w:szCs w:val="28"/>
-          <w:lang w:val="en-US"/>
-        </w:rPr>
-        <w:t xml:space="preserve"> </w:t>
-      </w:r>
-      <w:proofErr w:type="spellStart"/>
-      <w:proofErr w:type="gramStart"/>
-      <w:r>
-        <w:rPr>
-          <w:iCs/>
-          <w:szCs w:val="28"/>
-          <w:lang w:val="en-US"/>
-        </w:rPr>
-        <w:t>xsi:type</w:t>
-      </w:r>
-      <w:proofErr w:type="spellEnd"/>
-      <w:proofErr w:type="gramEnd"/>
-      <w:r>
-        <w:rPr>
-          <w:iCs/>
-          <w:szCs w:val="28"/>
-          <w:lang w:val="en-US"/>
-        </w:rPr>
-        <w:t>="</w:t>
-      </w:r>
-      <w:proofErr w:type="spellStart"/>
-      <w:r>
-        <w:rPr>
-          <w:iCs/>
-          <w:szCs w:val="28"/>
-          <w:lang w:val="en-US"/>
-        </w:rPr>
-        <w:t>OscillatoryMotion</w:t>
-      </w:r>
-      <w:proofErr w:type="spellEnd"/>
-      <w:r>
-        <w:rPr>
-          <w:iCs/>
-          <w:szCs w:val="28"/>
-          <w:lang w:val="en-US"/>
-        </w:rPr>
-        <w:t>"&gt;</w:t>
-      </w:r>
-    </w:p>
-    <w:p>
-      <w:pPr>
-        <w:rPr>
-          <w:iCs/>
-          <w:szCs w:val="28"/>
-          <w:lang w:val="en-US"/>
-        </w:rPr>
-      </w:pPr>
-      <w:r>
-        <w:rPr>
-          <w:iCs/>
-          <w:szCs w:val="28"/>
-          <w:lang w:val="en-US"/>
-        </w:rPr>
-        <w:t xml:space="preserve">    &lt;</w:t>
-      </w:r>
-      <w:proofErr w:type="spellStart"/>
-      <w:r>
-        <w:rPr>
-          <w:iCs/>
-          <w:szCs w:val="28"/>
-          <w:lang w:val="en-US"/>
-        </w:rPr>
-        <w:t>InitialPosition</w:t>
-      </w:r>
-      <w:proofErr w:type="spellEnd"/>
-      <w:r>
-        <w:rPr>
-          <w:iCs/>
-          <w:szCs w:val="28"/>
-          <w:lang w:val="en-US"/>
-        </w:rPr>
-        <w:t>&gt;371.4411688367728&lt;/</w:t>
-      </w:r>
-      <w:proofErr w:type="spellStart"/>
-      <w:r>
-        <w:rPr>
-          <w:iCs/>
-          <w:szCs w:val="28"/>
-          <w:lang w:val="en-US"/>
-        </w:rPr>
-        <w:t>InitialPosition</w:t>
-      </w:r>
-      <w:proofErr w:type="spellEnd"/>
-      <w:r>
-        <w:rPr>
-          <w:iCs/>
-          <w:szCs w:val="28"/>
-          <w:lang w:val="en-US"/>
-        </w:rPr>
-        <w:t>&gt;</w:t>
-      </w:r>
-    </w:p>
-    <w:p>
-      <w:pPr>
-        <w:rPr>
-          <w:iCs/>
-          <w:szCs w:val="28"/>
-          <w:lang w:val="en-US"/>
-        </w:rPr>
-      </w:pPr>
-      <w:r>
-        <w:rPr>
-          <w:iCs/>
-          <w:szCs w:val="28"/>
-          <w:lang w:val="en-US"/>
-        </w:rPr>
-        <w:t xml:space="preserve">    &lt;Time&gt;387.80972096506935&lt;/Time&gt;</w:t>
-      </w:r>
-    </w:p>
-    <w:p>
-      <w:pPr>
-        <w:rPr>
-          <w:iCs/>
-          <w:szCs w:val="28"/>
-          <w:lang w:val="en-US"/>
-        </w:rPr>
-      </w:pPr>
-      <w:r>
-        <w:rPr>
-          <w:iCs/>
-          <w:szCs w:val="28"/>
-          <w:lang w:val="en-US"/>
-        </w:rPr>
-        <w:t xml:space="preserve">    &lt;Speed&gt;881.5164801141726&lt;/Speed&gt;</w:t>
-      </w:r>
-    </w:p>
-    <w:p>
-      <w:pPr>
-        <w:rPr>
-          <w:iCs/>
-          <w:szCs w:val="28"/>
-          <w:lang w:val="en-US"/>
-        </w:rPr>
-      </w:pPr>
-      <w:r>
-        <w:rPr>
-          <w:iCs/>
-          <w:szCs w:val="28"/>
-          <w:lang w:val="en-US"/>
-        </w:rPr>
-        <w:t xml:space="preserve">    &lt;Frequency&gt;929.8608408567228&lt;/Frequency&gt;</w:t>
-      </w:r>
-    </w:p>
-    <w:p>
-      <w:pPr>
-        <w:rPr>
-          <w:iCs/>
-          <w:szCs w:val="28"/>
-          <w:lang w:val="en-US"/>
-        </w:rPr>
-      </w:pPr>
-      <w:r>
-        <w:rPr>
-          <w:iCs/>
-          <w:szCs w:val="28"/>
-          <w:lang w:val="en-US"/>
-        </w:rPr>
-        <w:t xml:space="preserve">  &lt;/</w:t>
-      </w:r>
-      <w:proofErr w:type="spellStart"/>
-      <w:r>
-        <w:rPr>
-          <w:iCs/>
-          <w:szCs w:val="28"/>
-          <w:lang w:val="en-US"/>
-        </w:rPr>
-        <w:t>MotionBase</w:t>
-      </w:r>
-      <w:proofErr w:type="spellEnd"/>
-      <w:r>
-        <w:rPr>
-          <w:iCs/>
-          <w:szCs w:val="28"/>
-          <w:lang w:val="en-US"/>
-        </w:rPr>
-        <w:t>&gt;</w:t>
-      </w:r>
-    </w:p>
-    <w:p>
-      <w:pPr>
-        <w:rPr>
-          <w:iCs/>
-          <w:szCs w:val="28"/>
-          <w:lang w:val="en-US"/>
-        </w:rPr>
-      </w:pPr>
-      <w:r>
-        <w:rPr>
-          <w:iCs/>
-          <w:szCs w:val="28"/>
-          <w:lang w:val="en-US"/>
-        </w:rPr>
-        <w:t xml:space="preserve">  &lt;</w:t>
-      </w:r>
-      <w:proofErr w:type="spellStart"/>
-      <w:r>
-        <w:rPr>
-          <w:iCs/>
-          <w:szCs w:val="28"/>
-          <w:lang w:val="en-US"/>
-        </w:rPr>
-        <w:t>MotionBase</w:t>
-      </w:r>
-      <w:proofErr w:type="spellEnd"/>
-      <w:r>
-        <w:rPr>
-          <w:iCs/>
-          <w:szCs w:val="28"/>
-          <w:lang w:val="en-US"/>
-        </w:rPr>
-        <w:t xml:space="preserve"> </w:t>
-      </w:r>
-      <w:proofErr w:type="spellStart"/>
-      <w:proofErr w:type="gramStart"/>
-      <w:r>
-        <w:rPr>
-          <w:iCs/>
-          <w:szCs w:val="28"/>
-          <w:lang w:val="en-US"/>
-        </w:rPr>
-        <w:t>xsi:type</w:t>
-      </w:r>
-      <w:proofErr w:type="spellEnd"/>
-      <w:proofErr w:type="gramEnd"/>
-      <w:r>
-        <w:rPr>
-          <w:iCs/>
-          <w:szCs w:val="28"/>
-          <w:lang w:val="en-US"/>
-        </w:rPr>
-        <w:t>="</w:t>
-      </w:r>
-      <w:proofErr w:type="spellStart"/>
-      <w:r>
-        <w:rPr>
-          <w:iCs/>
-          <w:szCs w:val="28"/>
-          <w:lang w:val="en-US"/>
-        </w:rPr>
-        <w:t>UniformlyAcceleratedMotion</w:t>
-      </w:r>
-      <w:proofErr w:type="spellEnd"/>
-      <w:r>
-        <w:rPr>
-          <w:iCs/>
-          <w:szCs w:val="28"/>
-          <w:lang w:val="en-US"/>
-        </w:rPr>
-        <w:t>"&gt;</w:t>
-      </w:r>
-    </w:p>
-    <w:p>
-      <w:pPr>
-        <w:rPr>
-          <w:iCs/>
-          <w:szCs w:val="28"/>
-          <w:lang w:val="en-US"/>
-        </w:rPr>
-      </w:pPr>
-      <w:r>
-        <w:rPr>
-          <w:iCs/>
-          <w:szCs w:val="28"/>
-          <w:lang w:val="en-US"/>
-        </w:rPr>
-        <w:t xml:space="preserve">    &lt;</w:t>
-      </w:r>
-      <w:proofErr w:type="spellStart"/>
-      <w:r>
-        <w:rPr>
-          <w:iCs/>
-          <w:szCs w:val="28"/>
-          <w:lang w:val="en-US"/>
-        </w:rPr>
-        <w:t>InitialPosition</w:t>
-      </w:r>
-      <w:proofErr w:type="spellEnd"/>
-      <w:r>
-        <w:rPr>
-          <w:iCs/>
-          <w:szCs w:val="28"/>
-          <w:lang w:val="en-US"/>
-        </w:rPr>
-        <w:t>&gt;446.92973323003827&lt;/</w:t>
-      </w:r>
-      <w:proofErr w:type="spellStart"/>
-      <w:r>
-        <w:rPr>
-          <w:iCs/>
-          <w:szCs w:val="28"/>
-          <w:lang w:val="en-US"/>
-        </w:rPr>
-        <w:t>InitialPosition</w:t>
-      </w:r>
-      <w:proofErr w:type="spellEnd"/>
-      <w:r>
-        <w:rPr>
-          <w:iCs/>
-          <w:szCs w:val="28"/>
-          <w:lang w:val="en-US"/>
-        </w:rPr>
-        <w:t>&gt;</w:t>
+        <w:t xml:space="preserve">    &lt;InitialPosition&gt;446.92973323003827&lt;/InitialPosition&gt;</w:t>
       </w:r>
     </w:p>
     <w:p>
@@ -15052,7 +14169,6 @@
         </w:rPr>
         <w:t>&lt;/</w:t>
       </w:r>
-      <w:proofErr w:type="spellStart"/>
       <w:r>
         <w:rPr>
           <w:iCs/>
@@ -15061,7 +14177,6 @@
         </w:rPr>
         <w:t>MotionBase</w:t>
       </w:r>
-      <w:proofErr w:type="spellEnd"/>
       <w:r>
         <w:rPr>
           <w:iCs/>
@@ -15084,7 +14199,6 @@
         </w:rPr>
         <w:t>&lt;/</w:t>
       </w:r>
-      <w:proofErr w:type="spellStart"/>
       <w:r>
         <w:rPr>
           <w:iCs/>
@@ -15093,7 +14207,6 @@
         </w:rPr>
         <w:t>ArrayOfMotionBase</w:t>
       </w:r>
-      <w:proofErr w:type="spellEnd"/>
       <w:r>
         <w:rPr>
           <w:iCs/>
@@ -15197,8 +14310,8 @@
         </w:rPr>
         <w:t xml:space="preserve">одержать </w:t>
       </w:r>
-      <w:commentRangeStart w:id="15"/>
-      <w:commentRangeStart w:id="16"/>
+      <w:commentRangeStart w:id="17"/>
+      <w:commentRangeStart w:id="18"/>
       <w:r>
         <w:rPr>
           <w:szCs w:val="28"/>
@@ -15241,7 +14354,6 @@
         </w:rPr>
         <w:t xml:space="preserve">: </w:t>
       </w:r>
-      <w:proofErr w:type="spellStart"/>
       <w:r>
         <w:rPr>
           <w:iCs/>
@@ -15250,7 +14362,6 @@
         </w:rPr>
         <w:t>InitinalPosition</w:t>
       </w:r>
-      <w:proofErr w:type="spellEnd"/>
       <w:r>
         <w:rPr>
           <w:iCs/>
@@ -15316,7 +14427,6 @@
         </w:rPr>
         <w:t xml:space="preserve">: </w:t>
       </w:r>
-      <w:proofErr w:type="spellStart"/>
       <w:r>
         <w:rPr>
           <w:iCs/>
@@ -15325,7 +14435,6 @@
         </w:rPr>
         <w:t>InitinalPosition</w:t>
       </w:r>
-      <w:proofErr w:type="spellEnd"/>
       <w:r>
         <w:rPr>
           <w:iCs/>
@@ -15399,7 +14508,6 @@
         </w:rPr>
         <w:t xml:space="preserve">колебательного: </w:t>
       </w:r>
-      <w:proofErr w:type="spellStart"/>
       <w:r>
         <w:rPr>
           <w:iCs/>
@@ -15408,7 +14516,6 @@
         </w:rPr>
         <w:t>InitinalPosition</w:t>
       </w:r>
-      <w:proofErr w:type="spellEnd"/>
       <w:r>
         <w:rPr>
           <w:iCs/>
@@ -15460,19 +14567,19 @@
         </w:rPr>
         <w:t>.</w:t>
       </w:r>
-      <w:commentRangeEnd w:id="15"/>
+      <w:commentRangeEnd w:id="17"/>
       <w:r>
         <w:rPr>
           <w:rStyle w:val="af"/>
         </w:rPr>
-        <w:commentReference w:id="15"/>
-      </w:r>
-      <w:commentRangeEnd w:id="16"/>
+        <w:commentReference w:id="17"/>
+      </w:r>
+      <w:commentRangeEnd w:id="18"/>
       <w:r>
         <w:rPr>
           <w:rStyle w:val="af"/>
         </w:rPr>
-        <w:commentReference w:id="16"/>
+        <w:commentReference w:id="18"/>
       </w:r>
     </w:p>
     <w:p>
@@ -15965,33 +15072,11 @@
           <w:i w:val="0"/>
         </w:rPr>
       </w:pPr>
-      <w:proofErr w:type="spellStart"/>
       <w:r>
         <w:rPr>
           <w:i w:val="0"/>
         </w:rPr>
-        <w:t>равномерное</w:t>
-      </w:r>
-      <w:proofErr w:type="spellEnd"/>
-      <w:r>
-        <w:rPr>
-          <w:i w:val="0"/>
-        </w:rPr>
-        <w:t xml:space="preserve"> </w:t>
-      </w:r>
-      <w:proofErr w:type="spellStart"/>
-      <w:r>
-        <w:rPr>
-          <w:i w:val="0"/>
-        </w:rPr>
-        <w:t>движение</w:t>
-      </w:r>
-      <w:proofErr w:type="spellEnd"/>
-      <w:r>
-        <w:rPr>
-          <w:i w:val="0"/>
-        </w:rPr>
-        <w:t>;</w:t>
+        <w:t>равномерное движение;</w:t>
       </w:r>
     </w:p>
     <w:p>
@@ -16005,33 +15090,11 @@
           <w:i w:val="0"/>
         </w:rPr>
       </w:pPr>
-      <w:proofErr w:type="spellStart"/>
       <w:r>
         <w:rPr>
           <w:i w:val="0"/>
         </w:rPr>
-        <w:t>равноускоренное</w:t>
-      </w:r>
-      <w:proofErr w:type="spellEnd"/>
-      <w:r>
-        <w:rPr>
-          <w:i w:val="0"/>
-        </w:rPr>
-        <w:t xml:space="preserve"> </w:t>
-      </w:r>
-      <w:proofErr w:type="spellStart"/>
-      <w:r>
-        <w:rPr>
-          <w:i w:val="0"/>
-        </w:rPr>
-        <w:t>движение</w:t>
-      </w:r>
-      <w:proofErr w:type="spellEnd"/>
-      <w:r>
-        <w:rPr>
-          <w:i w:val="0"/>
-        </w:rPr>
-        <w:t>;</w:t>
+        <w:t>равноускоренное движение;</w:t>
       </w:r>
     </w:p>
     <w:p>
@@ -16045,33 +15108,11 @@
           <w:i w:val="0"/>
         </w:rPr>
       </w:pPr>
-      <w:proofErr w:type="spellStart"/>
       <w:r>
         <w:rPr>
           <w:i w:val="0"/>
         </w:rPr>
-        <w:t>колебательное</w:t>
-      </w:r>
-      <w:proofErr w:type="spellEnd"/>
-      <w:r>
-        <w:rPr>
-          <w:i w:val="0"/>
-        </w:rPr>
-        <w:t xml:space="preserve"> </w:t>
-      </w:r>
-      <w:proofErr w:type="spellStart"/>
-      <w:r>
-        <w:rPr>
-          <w:i w:val="0"/>
-        </w:rPr>
-        <w:t>движение</w:t>
-      </w:r>
-      <w:proofErr w:type="spellEnd"/>
-      <w:r>
-        <w:rPr>
-          <w:i w:val="0"/>
-        </w:rPr>
-        <w:t>.</w:t>
+        <w:t>колебательное движение.</w:t>
       </w:r>
     </w:p>
     <w:p>
@@ -17153,17 +16194,8 @@
           <w:iCs/>
           <w:szCs w:val="28"/>
         </w:rPr>
-        <w:t xml:space="preserve">в файл формата </w:t>
-      </w:r>
-      <w:proofErr w:type="gramStart"/>
-      <w:r>
-        <w:rPr>
-          <w:iCs/>
-          <w:szCs w:val="28"/>
-        </w:rPr>
-        <w:t>*.</w:t>
-      </w:r>
-      <w:proofErr w:type="spellStart"/>
+        <w:t>в файл формата *.</w:t>
+      </w:r>
       <w:r>
         <w:rPr>
           <w:iCs/>
@@ -17172,8 +16204,6 @@
         </w:rPr>
         <w:t>elmt</w:t>
       </w:r>
-      <w:proofErr w:type="spellEnd"/>
-      <w:proofErr w:type="gramEnd"/>
       <w:r>
         <w:rPr>
           <w:iCs/>
@@ -17228,17 +16258,8 @@
           <w:iCs/>
           <w:szCs w:val="28"/>
         </w:rPr>
-        <w:t xml:space="preserve">из файла формата </w:t>
-      </w:r>
-      <w:proofErr w:type="gramStart"/>
-      <w:r>
-        <w:rPr>
-          <w:iCs/>
-          <w:szCs w:val="28"/>
-        </w:rPr>
-        <w:t>*.</w:t>
-      </w:r>
-      <w:proofErr w:type="spellStart"/>
+        <w:t>из файла формата *.</w:t>
+      </w:r>
       <w:r>
         <w:rPr>
           <w:iCs/>
@@ -17247,8 +16268,6 @@
         </w:rPr>
         <w:t>elmt</w:t>
       </w:r>
-      <w:proofErr w:type="spellEnd"/>
-      <w:proofErr w:type="gramEnd"/>
       <w:r>
         <w:rPr>
           <w:iCs/>
@@ -17478,8 +16497,6 @@
           <w:szCs w:val="28"/>
         </w:rPr>
       </w:pPr>
-      <w:bookmarkStart w:id="17" w:name="_GoBack"/>
-      <w:bookmarkEnd w:id="17"/>
     </w:p>
     <w:sectPr>
       <w:pgSz w:w="11906" w:h="16838"/>
@@ -17494,7 +16511,7 @@
 
 <file path=word/comments.xml><?xml version="1.0" encoding="utf-8"?>
 <w:comments xmlns:wpc="http://schemas.microsoft.com/office/word/2010/wordprocessingCanvas" xmlns:cx="http://schemas.microsoft.com/office/drawing/2014/chartex" xmlns:cx1="http://schemas.microsoft.com/office/drawing/2015/9/8/chartex" xmlns:mc="http://schemas.openxmlformats.org/markup-compatibility/2006" xmlns:o="urn:schemas-microsoft-com:office:office" xmlns:r="http://schemas.openxmlformats.org/officeDocument/2006/relationships" xmlns:m="http://schemas.openxmlformats.org/officeDocument/2006/math" xmlns:v="urn:schemas-microsoft-com:vml" xmlns:wp14="http://schemas.microsoft.com/office/word/2010/wordprocessingDrawing" xmlns:wp="http://schemas.openxmlformats.org/drawingml/2006/wordprocessingDrawing" xmlns:w10="urn:schemas-microsoft-com:office:word" xmlns:w="http://schemas.openxmlformats.org/wordprocessingml/2006/main" xmlns:w14="http://schemas.microsoft.com/office/word/2010/wordml" xmlns:w15="http://schemas.microsoft.com/office/word/2012/wordml" xmlns:w16se="http://schemas.microsoft.com/office/word/2015/wordml/symex" xmlns:wpg="http://schemas.microsoft.com/office/word/2010/wordprocessingGroup" xmlns:wpi="http://schemas.microsoft.com/office/word/2010/wordprocessingInk" xmlns:wne="http://schemas.microsoft.com/office/word/2006/wordml" xmlns:wps="http://schemas.microsoft.com/office/word/2010/wordprocessingShape" mc:Ignorable="w14 w15 w16se wp14">
-  <w:comment w:id="15" w:author="Aleksey A. Kalentev" w:date="2026-04-30T11:21:00Z" w:initials="AAK">
+  <w:comment w:id="17" w:author="Aleksey A. Kalentev" w:date="2026-04-30T11:21:00Z" w:initials="AAK">
     <w:p>
       <w:pPr>
         <w:pStyle w:val="af0"/>
@@ -17507,7 +16524,7 @@
       </w:r>
     </w:p>
   </w:comment>
-  <w:comment w:id="16" w:author="podop" w:date="2026-04-30T11:29:00Z" w:initials="p">
+  <w:comment w:id="18" w:author="podop" w:date="2026-04-30T11:29:00Z" w:initials="p">
     <w:p>
       <w:pPr>
         <w:pStyle w:val="af0"/>
@@ -17600,7 +16617,7 @@
           <w:rPr>
             <w:noProof/>
           </w:rPr>
-          <w:t>6</w:t>
+          <w:t>16</w:t>
         </w:r>
         <w:r>
           <w:fldChar w:fldCharType="end"/>
@@ -19276,9 +18293,13 @@
     <w:autoRedefine/>
     <w:uiPriority w:val="39"/>
     <w:unhideWhenUsed/>
-    <w:rsid w:val="00CF47CD"/>
+    <w:rsid w:val="003A1A4D"/>
     <w:pPr>
+      <w:tabs>
+        <w:tab w:val="right" w:leader="dot" w:pos="9345"/>
+      </w:tabs>
       <w:spacing w:after="100"/>
+      <w:ind w:firstLine="142"/>
     </w:pPr>
   </w:style>
   <w:style w:type="character" w:styleId="ae">
@@ -19695,7 +18716,7 @@
 </file>
 
 <file path=customXml/itemProps1.xml><?xml version="1.0" encoding="utf-8"?>
-<ds:datastoreItem xmlns:ds="http://schemas.openxmlformats.org/officeDocument/2006/customXml" ds:itemID="{39FA16B3-C481-4413-918D-ABF340923D24}">
+<ds:datastoreItem xmlns:ds="http://schemas.openxmlformats.org/officeDocument/2006/customXml" ds:itemID="{968ABB75-1894-4BC2-9875-DE567E7C6F6A}">
   <ds:schemaRefs>
     <ds:schemaRef ds:uri="http://schemas.openxmlformats.org/officeDocument/2006/bibliography"/>
   </ds:schemaRefs>

</xml_diff>